<commit_message>
Change to portrait mode.
</commit_message>
<xml_diff>
--- a/src/Apps/W1/EDocument/App/.resources/Template/StandardSalesCreditMemowithQRBody.docx
+++ b/src/Apps/W1/EDocument/App/.resources/Template/StandardSalesCreditMemowithQRBody.docx
@@ -1,35 +1,23 @@
 
 <file path=word/document.xml><?xml version="1.0" encoding="utf-8"?>
-<w:document xmlns:a="http://schemas.openxmlformats.org/drawingml/2006/main" xmlns:pic="http://schemas.openxmlformats.org/drawingml/2006/picture" xmlns:a14="http://schemas.microsoft.com/office/drawing/2010/main" xmlns:wpc="http://schemas.microsoft.com/office/word/2010/wordprocessingCanvas" xmlns:cx="http://schemas.microsoft.com/office/drawing/2014/chartex" xmlns:cx1="http://schemas.microsoft.com/office/drawing/2015/9/8/chartex" xmlns:cx2="http://schemas.microsoft.com/office/drawing/2015/10/21/chartex" xmlns:cx3="http://schemas.microsoft.com/office/drawing/2016/5/9/chartex" xmlns:cx4="http://schemas.microsoft.com/office/drawing/2016/5/10/chartex" xmlns:cx5="http://schemas.microsoft.com/office/drawing/2016/5/11/chartex" xmlns:cx6="http://schemas.microsoft.com/office/drawing/2016/5/12/chartex" xmlns:cx7="http://schemas.microsoft.com/office/drawing/2016/5/13/chartex" xmlns:cx8="http://schemas.microsoft.com/office/drawing/2016/5/14/chartex" xmlns:mc="http://schemas.openxmlformats.org/markup-compatibility/2006" xmlns:aink="http://schemas.microsoft.com/office/drawing/2016/ink" xmlns:am3d="http://schemas.microsoft.com/office/drawing/2017/model3d" xmlns:o="urn:schemas-microsoft-com:office:office" xmlns:oel="http://schemas.microsoft.com/office/2019/extlst" xmlns:r="http://schemas.openxmlformats.org/officeDocument/2006/relationships" xmlns:m="http://schemas.openxmlformats.org/officeDocument/2006/math" xmlns:v="urn:schemas-microsoft-com:vml" xmlns:wp14="http://schemas.microsoft.com/office/word/2010/wordprocessingDrawing" xmlns:wp="http://schemas.openxmlformats.org/drawingml/2006/wordprocessingDrawing" xmlns:w10="urn:schemas-microsoft-com:office:word" xmlns:w="http://schemas.openxmlformats.org/wordprocessingml/2006/main" xmlns:w14="http://schemas.microsoft.com/office/word/2010/wordml" xmlns:w15="http://schemas.microsoft.com/office/word/2012/wordml" xmlns:w16cex="http://schemas.microsoft.com/office/word/2018/wordml/cex" xmlns:w16cid="http://schemas.microsoft.com/office/word/2016/wordml/cid" xmlns:w16="http://schemas.microsoft.com/office/word/2018/wordml" xmlns:w16du="http://schemas.microsoft.com/office/word/2023/wordml/word16du" xmlns:w16sdtdh="http://schemas.microsoft.com/office/word/2020/wordml/sdtdatahash" xmlns:w16sdtfl="http://schemas.microsoft.com/office/word/2024/wordml/sdtformatlock" xmlns:w16se="http://schemas.microsoft.com/office/word/2015/wordml/symex" xmlns:wpg="http://schemas.microsoft.com/office/word/2010/wordprocessingGroup" xmlns:wpi="http://schemas.microsoft.com/office/word/2010/wordprocessingInk" xmlns:wne="http://schemas.microsoft.com/office/word/2006/wordml" xmlns:wps="http://schemas.microsoft.com/office/word/2010/wordprocessingShape" mc:Ignorable="w14 w15 w16se w16cid w16 w16cex w16sdtdh w16sdtfl w16du wp14">
+<w:document xmlns:wpc="http://schemas.microsoft.com/office/word/2010/wordprocessingCanvas" xmlns:cx="http://schemas.microsoft.com/office/drawing/2014/chartex" xmlns:cx1="http://schemas.microsoft.com/office/drawing/2015/9/8/chartex" xmlns:cx2="http://schemas.microsoft.com/office/drawing/2015/10/21/chartex" xmlns:cx3="http://schemas.microsoft.com/office/drawing/2016/5/9/chartex" xmlns:cx4="http://schemas.microsoft.com/office/drawing/2016/5/10/chartex" xmlns:cx5="http://schemas.microsoft.com/office/drawing/2016/5/11/chartex" xmlns:cx6="http://schemas.microsoft.com/office/drawing/2016/5/12/chartex" xmlns:cx7="http://schemas.microsoft.com/office/drawing/2016/5/13/chartex" xmlns:cx8="http://schemas.microsoft.com/office/drawing/2016/5/14/chartex" xmlns:mc="http://schemas.openxmlformats.org/markup-compatibility/2006" xmlns:aink="http://schemas.microsoft.com/office/drawing/2016/ink" xmlns:am3d="http://schemas.microsoft.com/office/drawing/2017/model3d" xmlns:o="urn:schemas-microsoft-com:office:office" xmlns:oel="http://schemas.microsoft.com/office/2019/extlst" xmlns:r="http://schemas.openxmlformats.org/officeDocument/2006/relationships" xmlns:m="http://schemas.openxmlformats.org/officeDocument/2006/math" xmlns:v="urn:schemas-microsoft-com:vml" xmlns:wp14="http://schemas.microsoft.com/office/word/2010/wordprocessingDrawing" xmlns:wp="http://schemas.openxmlformats.org/drawingml/2006/wordprocessingDrawing" xmlns:w10="urn:schemas-microsoft-com:office:word" xmlns:w="http://schemas.openxmlformats.org/wordprocessingml/2006/main" xmlns:w14="http://schemas.microsoft.com/office/word/2010/wordml" xmlns:w15="http://schemas.microsoft.com/office/word/2012/wordml" xmlns:w16cei="http://schemas.microsoft.com/office/word/2026/wordml/cei" xmlns:w16cex="http://schemas.microsoft.com/office/word/2018/wordml/cex" xmlns:w16cid="http://schemas.microsoft.com/office/word/2016/wordml/cid" xmlns:w16="http://schemas.microsoft.com/office/word/2018/wordml" xmlns:w16du="http://schemas.microsoft.com/office/word/2023/wordml/word16du" xmlns:w16sdtdh="http://schemas.microsoft.com/office/word/2020/wordml/sdtdatahash" xmlns:w16sdtfl="http://schemas.microsoft.com/office/word/2024/wordml/sdtformatlock" xmlns:w16se="http://schemas.microsoft.com/office/word/2015/wordml/symex" xmlns:wpg="http://schemas.microsoft.com/office/word/2010/wordprocessingGroup" xmlns:wpi="http://schemas.microsoft.com/office/word/2010/wordprocessingInk" xmlns:wne="http://schemas.microsoft.com/office/word/2006/wordml" xmlns:wps="http://schemas.microsoft.com/office/word/2010/wordprocessingShape" mc:Ignorable="w14 w15 w16se w16cid w16 w16cex w16sdtdh w16sdtfl w16du wp14">
   <w:body>
     <w:tbl>
       <w:tblPr>
-        <w:tblStyle w:val="TableGrid"/>
-        <w:tblW w:w="15422" w:type="dxa"/>
-        <w:tblBorders>
-          <w:top w:val="none" w:color="auto" w:sz="0" w:space="0"/>
-          <w:left w:val="none" w:color="auto" w:sz="0" w:space="0"/>
-          <w:bottom w:val="none" w:color="auto" w:sz="0" w:space="0"/>
-          <w:right w:val="none" w:color="auto" w:sz="0" w:space="0"/>
-          <w:insideH w:val="none" w:color="auto" w:sz="0" w:space="0"/>
-          <w:insideV w:val="none" w:color="auto" w:sz="0" w:space="0"/>
-        </w:tblBorders>
-        <w:tblCellMar>
-          <w:left w:w="0" w:type="dxa"/>
-          <w:right w:w="0" w:type="dxa"/>
-        </w:tblCellMar>
+        <w:tblStyle w:val="BCBlockTable"/>
+        <w:tblW w:w="10498" w:type="dxa"/>
         <w:tblLook w:val="04A0" w:firstRow="1" w:lastRow="0" w:firstColumn="1" w:lastColumn="0" w:noHBand="0" w:noVBand="1"/>
         <w:tblCaption w:val="Address Block"/>
       </w:tblPr>
       <w:tblGrid>
-        <w:gridCol w:w="3855"/>
-        <w:gridCol w:w="7711"/>
-        <w:gridCol w:w="3856"/>
+        <w:gridCol w:w="2624"/>
+        <w:gridCol w:w="5249"/>
+        <w:gridCol w:w="2625"/>
       </w:tblGrid>
       <w:tr>
         <w:trPr>
           <w:cnfStyle w:val="100000000000" w:firstRow="1" w:lastRow="0" w:firstColumn="0" w:lastColumn="0" w:oddVBand="0" w:evenVBand="0" w:oddHBand="0" w:evenHBand="0" w:firstRowFirstColumn="0" w:firstRowLastColumn="0" w:lastRowFirstColumn="0" w:lastRowLastColumn="0"/>
-          <w:trHeight w:val="254"/>
+          <w:trHeight w:val="281"/>
         </w:trPr>
         <w:sdt>
           <w:sdtPr>
@@ -38,8 +26,8 @@
               <w:rFonts w:ascii="Segoe UI Semibold" w:hAnsi="Segoe UI Semibold" w:cs="Segoe UI Semibold"/>
               <w:b w:val="0"/>
               <w:bCs w:val="0"/>
-              <w:sz w:val="22"/>
-              <w:szCs w:val="22"/>
+              <w:sz w:val="18"/>
+              <w:szCs w:val="18"/>
             </w:rPr>
             <w:alias w:val="CustomerAddress1"/>
             <w:tag w:val="#BC:InsertDataItem,DataItems/Header/CustomerAddress1"/>
@@ -47,15 +35,10 @@
             <w:placeholder>
               <w:docPart w:val="27C6F6FBC51444E48F63C5E57109998C"/>
             </w:placeholder>
+            <w:dataBinding w:prefixMappings="xmlns:ns0='urn:microsoft-dynamics-nav/reports/Standard_Sales_Credit_Memo/1307/'" w:xpath="/ns0:NavWordReportXmlPart[1]/ns0:Header[1]/ns0:CustomerAddress1[1]" w:storeItemID="{2C0E3694-AC57-46EE-8053-99B806001417}"/>
             <w15:color w:val="808080"/>
             <w:text/>
-            <w:dataBinding w:prefixMappings="xmlns:ns0='urn:microsoft-dynamics-nav/reports/Standard_Sales_Credit_Memo/1307/'" w:xpath="/ns0:NavWordReportXmlPart[1]/ns0:Header[1]/ns0:CustomerAddress1[1]"/>
           </w:sdtPr>
-          <w:sdtEndPr>
-            <w:rPr>
-              <w:rStyle w:val="Strong"/>
-            </w:rPr>
-          </w:sdtEndPr>
           <w:sdtContent>
             <w:tc>
               <w:tcPr>
@@ -70,8 +53,8 @@
                     <w:rFonts w:ascii="Segoe UI Semibold" w:hAnsi="Segoe UI Semibold" w:cs="Segoe UI Semibold"/>
                     <w:b w:val="0"/>
                     <w:bCs w:val="0"/>
-                    <w:sz w:val="22"/>
-                    <w:szCs w:val="22"/>
+                    <w:sz w:val="18"/>
+                    <w:szCs w:val="18"/>
                   </w:rPr>
                 </w:pPr>
                 <w:r>
@@ -80,8 +63,8 @@
                     <w:rFonts w:ascii="Segoe UI Semibold" w:hAnsi="Segoe UI Semibold" w:cs="Segoe UI Semibold"/>
                     <w:b w:val="0"/>
                     <w:bCs w:val="0"/>
-                    <w:sz w:val="22"/>
-                    <w:szCs w:val="22"/>
+                    <w:sz w:val="18"/>
+                    <w:szCs w:val="18"/>
                   </w:rPr>
                   <w:t>CustomerAddress1</w:t>
                 </w:r>
@@ -102,8 +85,8 @@
                 <w:rFonts w:ascii="Segoe UI Semibold" w:hAnsi="Segoe UI Semibold" w:cs="Segoe UI Semibold"/>
                 <w:b w:val="0"/>
                 <w:bCs w:val="0"/>
-                <w:sz w:val="22"/>
-                <w:szCs w:val="22"/>
+                <w:sz w:val="18"/>
+                <w:szCs w:val="18"/>
               </w:rPr>
             </w:pPr>
           </w:p>
@@ -115,8 +98,8 @@
               <w:rFonts w:ascii="Segoe UI Semibold" w:hAnsi="Segoe UI Semibold" w:cs="Segoe UI Semibold"/>
               <w:b w:val="0"/>
               <w:bCs w:val="0"/>
-              <w:sz w:val="22"/>
-              <w:szCs w:val="22"/>
+              <w:sz w:val="18"/>
+              <w:szCs w:val="18"/>
             </w:rPr>
             <w:alias w:val="CompanyAddress1"/>
             <w:tag w:val="#BC:InsertDataItem,DataItems/Header/CompanyAddress1"/>
@@ -124,15 +107,10 @@
             <w:placeholder>
               <w:docPart w:val="B02E5B0705F943979E268E41736DB313"/>
             </w:placeholder>
+            <w:dataBinding w:prefixMappings="xmlns:ns0='urn:microsoft-dynamics-nav/reports/Standard_Sales_Credit_Memo/1307/'" w:xpath="/ns0:NavWordReportXmlPart[1]/ns0:Header[1]/ns0:CompanyAddress1[1]" w:storeItemID="{2C0E3694-AC57-46EE-8053-99B806001417}"/>
             <w15:color w:val="808080"/>
             <w:text/>
-            <w:dataBinding w:prefixMappings="xmlns:ns0='urn:microsoft-dynamics-nav/reports/Standard_Sales_Credit_Memo/1307/'" w:xpath="/ns0:NavWordReportXmlPart[1]/ns0:Header[1]/ns0:CompanyAddress1[1]"/>
           </w:sdtPr>
-          <w:sdtEndPr>
-            <w:rPr>
-              <w:rStyle w:val="Strong"/>
-            </w:rPr>
-          </w:sdtEndPr>
           <w:sdtContent>
             <w:tc>
               <w:tcPr>
@@ -147,8 +125,8 @@
                     <w:rStyle w:val="Strong"/>
                     <w:b w:val="0"/>
                     <w:bCs w:val="0"/>
-                    <w:sz w:val="22"/>
-                    <w:szCs w:val="22"/>
+                    <w:sz w:val="18"/>
+                    <w:szCs w:val="18"/>
                     <w:lang w:val="da-DK"/>
                   </w:rPr>
                 </w:pPr>
@@ -158,8 +136,8 @@
                     <w:rFonts w:ascii="Segoe UI Semibold" w:hAnsi="Segoe UI Semibold" w:cs="Segoe UI Semibold"/>
                     <w:b w:val="0"/>
                     <w:bCs w:val="0"/>
-                    <w:sz w:val="22"/>
-                    <w:szCs w:val="22"/>
+                    <w:sz w:val="18"/>
+                    <w:szCs w:val="18"/>
                   </w:rPr>
                   <w:t>CompanyAddress1</w:t>
                 </w:r>
@@ -170,7 +148,7 @@
       </w:tr>
       <w:tr>
         <w:trPr>
-          <w:trHeight w:val="242"/>
+          <w:trHeight w:val="268"/>
         </w:trPr>
         <w:sdt>
           <w:sdtPr>
@@ -178,8 +156,8 @@
               <w:rFonts w:cs="Segoe UI Semibold"/>
               <w:b/>
               <w:bCs/>
-              <w:sz w:val="22"/>
-              <w:szCs w:val="22"/>
+              <w:sz w:val="18"/>
+              <w:szCs w:val="18"/>
             </w:rPr>
             <w:alias w:val="CustomerAddress2"/>
             <w:tag w:val="#BC:InsertDataItem,DataItems/Header/CustomerAddress2"/>
@@ -187,11 +165,10 @@
             <w:placeholder>
               <w:docPart w:val="27C6F6FBC51444E48F63C5E57109998C"/>
             </w:placeholder>
+            <w:dataBinding w:prefixMappings="xmlns:ns0='urn:microsoft-dynamics-nav/reports/Standard_Sales_Credit_Memo/1307/'" w:xpath="/ns0:NavWordReportXmlPart[1]/ns0:Header[1]/ns0:CustomerAddress2[1]" w:storeItemID="{2C0E3694-AC57-46EE-8053-99B806001417}"/>
             <w15:color w:val="808080"/>
             <w:text/>
-            <w:dataBinding w:prefixMappings="xmlns:ns0='urn:microsoft-dynamics-nav/reports/Standard_Sales_Credit_Memo/1307/'" w:xpath="/ns0:NavWordReportXmlPart[1]/ns0:Header[1]/ns0:CustomerAddress2[1]"/>
           </w:sdtPr>
-          <w:sdtEndPr/>
           <w:sdtContent>
             <w:tc>
               <w:tcPr>
@@ -200,16 +177,16 @@
               <w:p>
                 <w:pPr>
                   <w:rPr>
-                    <w:rFonts w:cs="Segoe UI Semibold" w:asciiTheme="minorHAnsi" w:hAnsiTheme="minorHAnsi"/>
-                    <w:sz w:val="22"/>
-                    <w:szCs w:val="22"/>
+                    <w:rFonts w:cs="Segoe UI Semibold"/>
+                    <w:sz w:val="18"/>
+                    <w:szCs w:val="18"/>
                   </w:rPr>
                 </w:pPr>
                 <w:r>
                   <w:rPr>
-                    <w:rFonts w:cs="Segoe UI Semibold" w:asciiTheme="minorHAnsi" w:hAnsiTheme="minorHAnsi"/>
-                    <w:sz w:val="22"/>
-                    <w:szCs w:val="22"/>
+                    <w:rFonts w:cs="Segoe UI Semibold"/>
+                    <w:sz w:val="18"/>
+                    <w:szCs w:val="18"/>
                   </w:rPr>
                   <w:t>CustomerAddress2</w:t>
                 </w:r>
@@ -224,9 +201,9 @@
           <w:p>
             <w:pPr>
               <w:rPr>
-                <w:rFonts w:cs="Segoe UI Semibold" w:asciiTheme="minorHAnsi" w:hAnsiTheme="minorHAnsi"/>
-                <w:sz w:val="22"/>
-                <w:szCs w:val="22"/>
+                <w:rFonts w:cs="Segoe UI Semibold"/>
+                <w:sz w:val="18"/>
+                <w:szCs w:val="18"/>
               </w:rPr>
             </w:pPr>
           </w:p>
@@ -235,8 +212,8 @@
           <w:sdtPr>
             <w:rPr>
               <w:rFonts w:cs="Segoe UI Semibold"/>
-              <w:sz w:val="22"/>
-              <w:szCs w:val="22"/>
+              <w:sz w:val="18"/>
+              <w:szCs w:val="18"/>
             </w:rPr>
             <w:alias w:val="CompanyAddress2"/>
             <w:tag w:val="#BC:InsertDataItem,DataItems/Header/CompanyAddress2"/>
@@ -244,11 +221,10 @@
             <w:placeholder>
               <w:docPart w:val="34AF83D853364E9E91CF94BDBD0F0D24"/>
             </w:placeholder>
+            <w:dataBinding w:prefixMappings="xmlns:ns0='urn:microsoft-dynamics-nav/reports/Standard_Sales_Credit_Memo/1307/'" w:xpath="/ns0:NavWordReportXmlPart[1]/ns0:Header[1]/ns0:CompanyAddress2[1]" w:storeItemID="{2C0E3694-AC57-46EE-8053-99B806001417}"/>
             <w15:color w:val="808080"/>
             <w:text/>
-            <w:dataBinding w:prefixMappings="xmlns:ns0='urn:microsoft-dynamics-nav/reports/Standard_Sales_Credit_Memo/1307/'" w:xpath="/ns0:NavWordReportXmlPart[1]/ns0:Header[1]/ns0:CompanyAddress2[1]"/>
           </w:sdtPr>
-          <w:sdtEndPr/>
           <w:sdtContent>
             <w:tc>
               <w:tcPr>
@@ -258,16 +234,15 @@
                 <w:pPr>
                   <w:jc w:val="right"/>
                   <w:rPr>
-                    <w:rFonts w:asciiTheme="minorHAnsi" w:hAnsiTheme="minorHAnsi"/>
-                    <w:sz w:val="22"/>
-                    <w:szCs w:val="22"/>
+                    <w:sz w:val="18"/>
+                    <w:szCs w:val="18"/>
                   </w:rPr>
                 </w:pPr>
                 <w:r>
                   <w:rPr>
-                    <w:rFonts w:cs="Segoe UI Semibold" w:asciiTheme="minorHAnsi" w:hAnsiTheme="minorHAnsi"/>
-                    <w:sz w:val="22"/>
-                    <w:szCs w:val="22"/>
+                    <w:rFonts w:cs="Segoe UI Semibold"/>
+                    <w:sz w:val="18"/>
+                    <w:szCs w:val="18"/>
                   </w:rPr>
                   <w:t>CompanyAddress2</w:t>
                 </w:r>
@@ -278,14 +253,14 @@
       </w:tr>
       <w:tr>
         <w:trPr>
-          <w:trHeight w:val="242"/>
+          <w:trHeight w:val="268"/>
         </w:trPr>
         <w:sdt>
           <w:sdtPr>
             <w:rPr>
               <w:rFonts w:cs="Segoe UI Semibold"/>
-              <w:sz w:val="22"/>
-              <w:szCs w:val="22"/>
+              <w:sz w:val="18"/>
+              <w:szCs w:val="18"/>
             </w:rPr>
             <w:alias w:val="CustomerAddress3"/>
             <w:tag w:val="#BC:InsertDataItem,DataItems/Header/CustomerAddress3"/>
@@ -293,11 +268,10 @@
             <w:placeholder>
               <w:docPart w:val="27C6F6FBC51444E48F63C5E57109998C"/>
             </w:placeholder>
+            <w:dataBinding w:prefixMappings="xmlns:ns0='urn:microsoft-dynamics-nav/reports/Standard_Sales_Credit_Memo/1307/'" w:xpath="/ns0:NavWordReportXmlPart[1]/ns0:Header[1]/ns0:CustomerAddress3[1]" w:storeItemID="{2C0E3694-AC57-46EE-8053-99B806001417}"/>
             <w15:color w:val="808080"/>
             <w:text/>
-            <w:dataBinding w:prefixMappings="xmlns:ns0='urn:microsoft-dynamics-nav/reports/Standard_Sales_Credit_Memo/1307/'" w:xpath="/ns0:NavWordReportXmlPart[1]/ns0:Header[1]/ns0:CustomerAddress3[1]"/>
           </w:sdtPr>
-          <w:sdtEndPr/>
           <w:sdtContent>
             <w:tc>
               <w:tcPr>
@@ -306,16 +280,16 @@
               <w:p>
                 <w:pPr>
                   <w:rPr>
-                    <w:rFonts w:cs="Segoe UI Semibold" w:asciiTheme="minorHAnsi" w:hAnsiTheme="minorHAnsi"/>
-                    <w:sz w:val="22"/>
-                    <w:szCs w:val="22"/>
+                    <w:rFonts w:cs="Segoe UI Semibold"/>
+                    <w:sz w:val="18"/>
+                    <w:szCs w:val="18"/>
                   </w:rPr>
                 </w:pPr>
                 <w:r>
                   <w:rPr>
-                    <w:rFonts w:cs="Segoe UI Semibold" w:asciiTheme="minorHAnsi" w:hAnsiTheme="minorHAnsi"/>
-                    <w:sz w:val="22"/>
-                    <w:szCs w:val="22"/>
+                    <w:rFonts w:cs="Segoe UI Semibold"/>
+                    <w:sz w:val="18"/>
+                    <w:szCs w:val="18"/>
                   </w:rPr>
                   <w:t>CustomerAddress3</w:t>
                 </w:r>
@@ -330,9 +304,9 @@
           <w:p>
             <w:pPr>
               <w:rPr>
-                <w:rFonts w:cs="Segoe UI Semibold" w:asciiTheme="minorHAnsi" w:hAnsiTheme="minorHAnsi"/>
-                <w:sz w:val="22"/>
-                <w:szCs w:val="22"/>
+                <w:rFonts w:cs="Segoe UI Semibold"/>
+                <w:sz w:val="18"/>
+                <w:szCs w:val="18"/>
               </w:rPr>
             </w:pPr>
           </w:p>
@@ -341,8 +315,8 @@
           <w:sdtPr>
             <w:rPr>
               <w:rFonts w:cs="Segoe UI Semibold"/>
-              <w:sz w:val="22"/>
-              <w:szCs w:val="22"/>
+              <w:sz w:val="18"/>
+              <w:szCs w:val="18"/>
             </w:rPr>
             <w:alias w:val="CompanyAddress3"/>
             <w:tag w:val="#BC:InsertDataItem,DataItems/Header/CompanyAddress3"/>
@@ -350,11 +324,10 @@
             <w:placeholder>
               <w:docPart w:val="5298955B1DAD476D95BE494D056AC864"/>
             </w:placeholder>
+            <w:dataBinding w:prefixMappings="xmlns:ns0='urn:microsoft-dynamics-nav/reports/Standard_Sales_Credit_Memo/1307/'" w:xpath="/ns0:NavWordReportXmlPart[1]/ns0:Header[1]/ns0:CompanyAddress3[1]" w:storeItemID="{2C0E3694-AC57-46EE-8053-99B806001417}"/>
             <w15:color w:val="808080"/>
             <w:text/>
-            <w:dataBinding w:prefixMappings="xmlns:ns0='urn:microsoft-dynamics-nav/reports/Standard_Sales_Credit_Memo/1307/'" w:xpath="/ns0:NavWordReportXmlPart[1]/ns0:Header[1]/ns0:CompanyAddress3[1]"/>
           </w:sdtPr>
-          <w:sdtEndPr/>
           <w:sdtContent>
             <w:tc>
               <w:tcPr>
@@ -364,15 +337,15 @@
                 <w:pPr>
                   <w:jc w:val="right"/>
                   <w:rPr>
-                    <w:sz w:val="22"/>
-                    <w:szCs w:val="22"/>
+                    <w:sz w:val="18"/>
+                    <w:szCs w:val="18"/>
                   </w:rPr>
                 </w:pPr>
                 <w:r>
                   <w:rPr>
-                    <w:rFonts w:cs="Segoe UI Semibold" w:asciiTheme="minorHAnsi" w:hAnsiTheme="minorHAnsi"/>
-                    <w:sz w:val="22"/>
-                    <w:szCs w:val="22"/>
+                    <w:rFonts w:cs="Segoe UI Semibold"/>
+                    <w:sz w:val="18"/>
+                    <w:szCs w:val="18"/>
                   </w:rPr>
                   <w:t>CompanyAddress3</w:t>
                 </w:r>
@@ -383,14 +356,14 @@
       </w:tr>
       <w:tr>
         <w:trPr>
-          <w:trHeight w:val="242"/>
+          <w:trHeight w:val="268"/>
         </w:trPr>
         <w:sdt>
           <w:sdtPr>
             <w:rPr>
               <w:rFonts w:cs="Segoe UI Semibold"/>
-              <w:sz w:val="22"/>
-              <w:szCs w:val="22"/>
+              <w:sz w:val="18"/>
+              <w:szCs w:val="18"/>
             </w:rPr>
             <w:alias w:val="CustomerAddress4"/>
             <w:tag w:val="#BC:InsertDataItem,DataItems/Header/CustomerAddress4"/>
@@ -398,11 +371,10 @@
             <w:placeholder>
               <w:docPart w:val="27C6F6FBC51444E48F63C5E57109998C"/>
             </w:placeholder>
+            <w:dataBinding w:prefixMappings="xmlns:ns0='urn:microsoft-dynamics-nav/reports/Standard_Sales_Credit_Memo/1307/'" w:xpath="/ns0:NavWordReportXmlPart[1]/ns0:Header[1]/ns0:CustomerAddress4[1]" w:storeItemID="{2C0E3694-AC57-46EE-8053-99B806001417}"/>
             <w15:color w:val="808080"/>
             <w:text/>
-            <w:dataBinding w:prefixMappings="xmlns:ns0='urn:microsoft-dynamics-nav/reports/Standard_Sales_Credit_Memo/1307/'" w:xpath="/ns0:NavWordReportXmlPart[1]/ns0:Header[1]/ns0:CustomerAddress4[1]"/>
           </w:sdtPr>
-          <w:sdtEndPr/>
           <w:sdtContent>
             <w:tc>
               <w:tcPr>
@@ -411,16 +383,16 @@
               <w:p>
                 <w:pPr>
                   <w:rPr>
-                    <w:rFonts w:cs="Segoe UI Semibold" w:asciiTheme="minorHAnsi" w:hAnsiTheme="minorHAnsi"/>
-                    <w:sz w:val="22"/>
-                    <w:szCs w:val="22"/>
+                    <w:rFonts w:cs="Segoe UI Semibold"/>
+                    <w:sz w:val="18"/>
+                    <w:szCs w:val="18"/>
                   </w:rPr>
                 </w:pPr>
                 <w:r>
                   <w:rPr>
-                    <w:rFonts w:cs="Segoe UI Semibold" w:asciiTheme="minorHAnsi" w:hAnsiTheme="minorHAnsi"/>
-                    <w:sz w:val="22"/>
-                    <w:szCs w:val="22"/>
+                    <w:rFonts w:cs="Segoe UI Semibold"/>
+                    <w:sz w:val="18"/>
+                    <w:szCs w:val="18"/>
                   </w:rPr>
                   <w:t>CustomerAddress4</w:t>
                 </w:r>
@@ -435,9 +407,9 @@
           <w:p>
             <w:pPr>
               <w:rPr>
-                <w:rFonts w:cs="Segoe UI Semibold" w:asciiTheme="minorHAnsi" w:hAnsiTheme="minorHAnsi"/>
-                <w:sz w:val="22"/>
-                <w:szCs w:val="22"/>
+                <w:rFonts w:cs="Segoe UI Semibold"/>
+                <w:sz w:val="18"/>
+                <w:szCs w:val="18"/>
               </w:rPr>
             </w:pPr>
           </w:p>
@@ -446,8 +418,8 @@
           <w:sdtPr>
             <w:rPr>
               <w:rFonts w:cs="Segoe UI Semibold"/>
-              <w:sz w:val="22"/>
-              <w:szCs w:val="22"/>
+              <w:sz w:val="18"/>
+              <w:szCs w:val="18"/>
             </w:rPr>
             <w:alias w:val="CompanyAddress4"/>
             <w:tag w:val="#BC:InsertDataItem,DataItems/Header/CompanyAddress4"/>
@@ -455,11 +427,10 @@
             <w:placeholder>
               <w:docPart w:val="A42C30D71C804007AE9D362411216EF8"/>
             </w:placeholder>
+            <w:dataBinding w:prefixMappings="xmlns:ns0='urn:microsoft-dynamics-nav/reports/Standard_Sales_Credit_Memo/1307/'" w:xpath="/ns0:NavWordReportXmlPart[1]/ns0:Header[1]/ns0:CompanyAddress4[1]" w:storeItemID="{2C0E3694-AC57-46EE-8053-99B806001417}"/>
             <w15:color w:val="808080"/>
             <w:text/>
-            <w:dataBinding w:prefixMappings="xmlns:ns0='urn:microsoft-dynamics-nav/reports/Standard_Sales_Credit_Memo/1307/'" w:xpath="/ns0:NavWordReportXmlPart[1]/ns0:Header[1]/ns0:CompanyAddress4[1]"/>
           </w:sdtPr>
-          <w:sdtEndPr/>
           <w:sdtContent>
             <w:tc>
               <w:tcPr>
@@ -469,15 +440,15 @@
                 <w:pPr>
                   <w:jc w:val="right"/>
                   <w:rPr>
-                    <w:sz w:val="22"/>
-                    <w:szCs w:val="22"/>
+                    <w:sz w:val="18"/>
+                    <w:szCs w:val="18"/>
                   </w:rPr>
                 </w:pPr>
                 <w:r>
                   <w:rPr>
-                    <w:rFonts w:cs="Segoe UI Semibold" w:asciiTheme="minorHAnsi" w:hAnsiTheme="minorHAnsi"/>
-                    <w:sz w:val="22"/>
-                    <w:szCs w:val="22"/>
+                    <w:rFonts w:cs="Segoe UI Semibold"/>
+                    <w:sz w:val="18"/>
+                    <w:szCs w:val="18"/>
                   </w:rPr>
                   <w:t>CompanyAddress4</w:t>
                 </w:r>
@@ -488,14 +459,14 @@
       </w:tr>
       <w:tr>
         <w:trPr>
-          <w:trHeight w:val="242"/>
+          <w:trHeight w:val="268"/>
         </w:trPr>
         <w:sdt>
           <w:sdtPr>
             <w:rPr>
               <w:rFonts w:cs="Segoe UI Semibold"/>
-              <w:sz w:val="22"/>
-              <w:szCs w:val="22"/>
+              <w:sz w:val="18"/>
+              <w:szCs w:val="18"/>
             </w:rPr>
             <w:alias w:val="CustomerAddress5"/>
             <w:tag w:val="#BC:InsertDataItem,DataItems/Header/CustomerAddress5"/>
@@ -503,11 +474,10 @@
             <w:placeholder>
               <w:docPart w:val="27C6F6FBC51444E48F63C5E57109998C"/>
             </w:placeholder>
+            <w:dataBinding w:prefixMappings="xmlns:ns0='urn:microsoft-dynamics-nav/reports/Standard_Sales_Credit_Memo/1307/'" w:xpath="/ns0:NavWordReportXmlPart[1]/ns0:Header[1]/ns0:CustomerAddress5[1]" w:storeItemID="{2C0E3694-AC57-46EE-8053-99B806001417}"/>
             <w15:color w:val="808080"/>
             <w:text/>
-            <w:dataBinding w:prefixMappings="xmlns:ns0='urn:microsoft-dynamics-nav/reports/Standard_Sales_Credit_Memo/1307/'" w:xpath="/ns0:NavWordReportXmlPart[1]/ns0:Header[1]/ns0:CustomerAddress5[1]"/>
           </w:sdtPr>
-          <w:sdtEndPr/>
           <w:sdtContent>
             <w:tc>
               <w:tcPr>
@@ -516,16 +486,16 @@
               <w:p>
                 <w:pPr>
                   <w:rPr>
-                    <w:rFonts w:cs="Segoe UI Semibold" w:asciiTheme="minorHAnsi" w:hAnsiTheme="minorHAnsi"/>
-                    <w:sz w:val="22"/>
-                    <w:szCs w:val="22"/>
+                    <w:rFonts w:cs="Segoe UI Semibold"/>
+                    <w:sz w:val="18"/>
+                    <w:szCs w:val="18"/>
                   </w:rPr>
                 </w:pPr>
                 <w:r>
                   <w:rPr>
-                    <w:rFonts w:cs="Segoe UI Semibold" w:asciiTheme="minorHAnsi" w:hAnsiTheme="minorHAnsi"/>
-                    <w:sz w:val="22"/>
-                    <w:szCs w:val="22"/>
+                    <w:rFonts w:cs="Segoe UI Semibold"/>
+                    <w:sz w:val="18"/>
+                    <w:szCs w:val="18"/>
                   </w:rPr>
                   <w:t>CustomerAddress5</w:t>
                 </w:r>
@@ -540,9 +510,9 @@
           <w:p>
             <w:pPr>
               <w:rPr>
-                <w:rFonts w:cs="Segoe UI Semibold" w:asciiTheme="minorHAnsi" w:hAnsiTheme="minorHAnsi"/>
-                <w:sz w:val="22"/>
-                <w:szCs w:val="22"/>
+                <w:rFonts w:cs="Segoe UI Semibold"/>
+                <w:sz w:val="18"/>
+                <w:szCs w:val="18"/>
               </w:rPr>
             </w:pPr>
           </w:p>
@@ -551,8 +521,8 @@
           <w:sdtPr>
             <w:rPr>
               <w:rFonts w:cs="Segoe UI Semibold"/>
-              <w:sz w:val="22"/>
-              <w:szCs w:val="22"/>
+              <w:sz w:val="18"/>
+              <w:szCs w:val="18"/>
             </w:rPr>
             <w:alias w:val="CompanyAddress5"/>
             <w:tag w:val="#BC:InsertDataItem,DataItems/Header/CompanyAddress5"/>
@@ -560,11 +530,10 @@
             <w:placeholder>
               <w:docPart w:val="F16264AA69114B25B82C6336328EECBF"/>
             </w:placeholder>
+            <w:dataBinding w:prefixMappings="xmlns:ns0='urn:microsoft-dynamics-nav/reports/Standard_Sales_Credit_Memo/1307/'" w:xpath="/ns0:NavWordReportXmlPart[1]/ns0:Header[1]/ns0:CompanyAddress5[1]" w:storeItemID="{2C0E3694-AC57-46EE-8053-99B806001417}"/>
             <w15:color w:val="808080"/>
             <w:text/>
-            <w:dataBinding w:prefixMappings="xmlns:ns0='urn:microsoft-dynamics-nav/reports/Standard_Sales_Credit_Memo/1307/'" w:xpath="/ns0:NavWordReportXmlPart[1]/ns0:Header[1]/ns0:CompanyAddress5[1]"/>
           </w:sdtPr>
-          <w:sdtEndPr/>
           <w:sdtContent>
             <w:tc>
               <w:tcPr>
@@ -574,15 +543,15 @@
                 <w:pPr>
                   <w:jc w:val="right"/>
                   <w:rPr>
-                    <w:sz w:val="22"/>
-                    <w:szCs w:val="22"/>
+                    <w:sz w:val="18"/>
+                    <w:szCs w:val="18"/>
                   </w:rPr>
                 </w:pPr>
                 <w:r>
                   <w:rPr>
-                    <w:rFonts w:cs="Segoe UI Semibold" w:asciiTheme="minorHAnsi" w:hAnsiTheme="minorHAnsi"/>
-                    <w:sz w:val="22"/>
-                    <w:szCs w:val="22"/>
+                    <w:rFonts w:cs="Segoe UI Semibold"/>
+                    <w:sz w:val="18"/>
+                    <w:szCs w:val="18"/>
                   </w:rPr>
                   <w:t>CompanyAddress5</w:t>
                 </w:r>
@@ -593,14 +562,14 @@
       </w:tr>
       <w:tr>
         <w:trPr>
-          <w:trHeight w:val="242"/>
+          <w:trHeight w:val="268"/>
         </w:trPr>
         <w:sdt>
           <w:sdtPr>
             <w:rPr>
               <w:rFonts w:cs="Segoe UI Semibold"/>
-              <w:sz w:val="22"/>
-              <w:szCs w:val="22"/>
+              <w:sz w:val="18"/>
+              <w:szCs w:val="18"/>
             </w:rPr>
             <w:alias w:val="CustomerAddress6"/>
             <w:tag w:val="#BC:InsertDataItem,DataItems/Header/CustomerAddress6"/>
@@ -608,11 +577,10 @@
             <w:placeholder>
               <w:docPart w:val="27C6F6FBC51444E48F63C5E57109998C"/>
             </w:placeholder>
+            <w:dataBinding w:prefixMappings="xmlns:ns0='urn:microsoft-dynamics-nav/reports/Standard_Sales_Credit_Memo/1307/'" w:xpath="/ns0:NavWordReportXmlPart[1]/ns0:Header[1]/ns0:CustomerAddress6[1]" w:storeItemID="{2C0E3694-AC57-46EE-8053-99B806001417}"/>
             <w15:color w:val="808080"/>
             <w:text/>
-            <w:dataBinding w:prefixMappings="xmlns:ns0='urn:microsoft-dynamics-nav/reports/Standard_Sales_Credit_Memo/1307/'" w:xpath="/ns0:NavWordReportXmlPart[1]/ns0:Header[1]/ns0:CustomerAddress6[1]"/>
           </w:sdtPr>
-          <w:sdtEndPr/>
           <w:sdtContent>
             <w:tc>
               <w:tcPr>
@@ -621,16 +589,16 @@
               <w:p>
                 <w:pPr>
                   <w:rPr>
-                    <w:rFonts w:cs="Segoe UI Semibold" w:asciiTheme="minorHAnsi" w:hAnsiTheme="minorHAnsi"/>
-                    <w:sz w:val="22"/>
-                    <w:szCs w:val="22"/>
+                    <w:rFonts w:cs="Segoe UI Semibold"/>
+                    <w:sz w:val="18"/>
+                    <w:szCs w:val="18"/>
                   </w:rPr>
                 </w:pPr>
                 <w:r>
                   <w:rPr>
-                    <w:rFonts w:cs="Segoe UI Semibold" w:asciiTheme="minorHAnsi" w:hAnsiTheme="minorHAnsi"/>
-                    <w:sz w:val="22"/>
-                    <w:szCs w:val="22"/>
+                    <w:rFonts w:cs="Segoe UI Semibold"/>
+                    <w:sz w:val="18"/>
+                    <w:szCs w:val="18"/>
                   </w:rPr>
                   <w:t>CustomerAddress6</w:t>
                 </w:r>
@@ -645,9 +613,9 @@
           <w:p>
             <w:pPr>
               <w:rPr>
-                <w:rFonts w:cs="Segoe UI Semibold" w:asciiTheme="minorHAnsi" w:hAnsiTheme="minorHAnsi"/>
-                <w:sz w:val="22"/>
-                <w:szCs w:val="22"/>
+                <w:rFonts w:cs="Segoe UI Semibold"/>
+                <w:sz w:val="18"/>
+                <w:szCs w:val="18"/>
               </w:rPr>
             </w:pPr>
           </w:p>
@@ -656,8 +624,8 @@
           <w:sdtPr>
             <w:rPr>
               <w:rFonts w:cs="Segoe UI Semibold"/>
-              <w:sz w:val="22"/>
-              <w:szCs w:val="22"/>
+              <w:sz w:val="18"/>
+              <w:szCs w:val="18"/>
             </w:rPr>
             <w:alias w:val="CompanyAddress6"/>
             <w:tag w:val="#BC:InsertDataItem,DataItems/Header/CompanyAddress6"/>
@@ -665,11 +633,10 @@
             <w:placeholder>
               <w:docPart w:val="F48DD40B1FBC422E93DAE25960F03561"/>
             </w:placeholder>
+            <w:dataBinding w:prefixMappings="xmlns:ns0='urn:microsoft-dynamics-nav/reports/Standard_Sales_Credit_Memo/1307/'" w:xpath="/ns0:NavWordReportXmlPart[1]/ns0:Header[1]/ns0:CompanyAddress6[1]" w:storeItemID="{2C0E3694-AC57-46EE-8053-99B806001417}"/>
             <w15:color w:val="808080"/>
             <w:text/>
-            <w:dataBinding w:prefixMappings="xmlns:ns0='urn:microsoft-dynamics-nav/reports/Standard_Sales_Credit_Memo/1307/'" w:xpath="/ns0:NavWordReportXmlPart[1]/ns0:Header[1]/ns0:CompanyAddress6[1]"/>
           </w:sdtPr>
-          <w:sdtEndPr/>
           <w:sdtContent>
             <w:tc>
               <w:tcPr>
@@ -679,15 +646,15 @@
                 <w:pPr>
                   <w:jc w:val="right"/>
                   <w:rPr>
-                    <w:sz w:val="22"/>
-                    <w:szCs w:val="22"/>
+                    <w:sz w:val="18"/>
+                    <w:szCs w:val="18"/>
                   </w:rPr>
                 </w:pPr>
                 <w:r>
                   <w:rPr>
-                    <w:rFonts w:cs="Segoe UI Semibold" w:asciiTheme="minorHAnsi" w:hAnsiTheme="minorHAnsi"/>
-                    <w:sz w:val="22"/>
-                    <w:szCs w:val="22"/>
+                    <w:rFonts w:cs="Segoe UI Semibold"/>
+                    <w:sz w:val="18"/>
+                    <w:szCs w:val="18"/>
                   </w:rPr>
                   <w:t>CompanyAddress6</w:t>
                 </w:r>
@@ -698,14 +665,14 @@
       </w:tr>
       <w:tr>
         <w:trPr>
-          <w:trHeight w:val="242"/>
+          <w:trHeight w:val="268"/>
         </w:trPr>
         <w:sdt>
           <w:sdtPr>
             <w:rPr>
               <w:rFonts w:cs="Segoe UI Semibold"/>
-              <w:sz w:val="22"/>
-              <w:szCs w:val="22"/>
+              <w:sz w:val="18"/>
+              <w:szCs w:val="18"/>
             </w:rPr>
             <w:alias w:val="CustomerAddress7"/>
             <w:tag w:val="#BC:InsertDataItem,DataItems/Header/CustomerAddress7"/>
@@ -713,11 +680,10 @@
             <w:placeholder>
               <w:docPart w:val="27C6F6FBC51444E48F63C5E57109998C"/>
             </w:placeholder>
+            <w:dataBinding w:prefixMappings="xmlns:ns0='urn:microsoft-dynamics-nav/reports/Standard_Sales_Credit_Memo/1307/'" w:xpath="/ns0:NavWordReportXmlPart[1]/ns0:Header[1]/ns0:CustomerAddress7[1]" w:storeItemID="{2C0E3694-AC57-46EE-8053-99B806001417}"/>
             <w15:color w:val="808080"/>
             <w:text/>
-            <w:dataBinding w:prefixMappings="xmlns:ns0='urn:microsoft-dynamics-nav/reports/Standard_Sales_Credit_Memo/1307/'" w:xpath="/ns0:NavWordReportXmlPart[1]/ns0:Header[1]/ns0:CustomerAddress7[1]"/>
           </w:sdtPr>
-          <w:sdtEndPr/>
           <w:sdtContent>
             <w:tc>
               <w:tcPr>
@@ -726,16 +692,16 @@
               <w:p>
                 <w:pPr>
                   <w:rPr>
-                    <w:rFonts w:cs="Segoe UI Semibold" w:asciiTheme="minorHAnsi" w:hAnsiTheme="minorHAnsi"/>
-                    <w:sz w:val="22"/>
-                    <w:szCs w:val="22"/>
+                    <w:rFonts w:cs="Segoe UI Semibold"/>
+                    <w:sz w:val="18"/>
+                    <w:szCs w:val="18"/>
                   </w:rPr>
                 </w:pPr>
                 <w:r>
                   <w:rPr>
-                    <w:rFonts w:cs="Segoe UI Semibold" w:asciiTheme="minorHAnsi" w:hAnsiTheme="minorHAnsi"/>
-                    <w:sz w:val="22"/>
-                    <w:szCs w:val="22"/>
+                    <w:rFonts w:cs="Segoe UI Semibold"/>
+                    <w:sz w:val="18"/>
+                    <w:szCs w:val="18"/>
                   </w:rPr>
                   <w:t>CustomerAddress7</w:t>
                 </w:r>
@@ -750,9 +716,9 @@
           <w:p>
             <w:pPr>
               <w:rPr>
-                <w:rFonts w:cs="Segoe UI Semibold" w:asciiTheme="minorHAnsi" w:hAnsiTheme="minorHAnsi"/>
-                <w:sz w:val="22"/>
-                <w:szCs w:val="22"/>
+                <w:rFonts w:cs="Segoe UI Semibold"/>
+                <w:sz w:val="18"/>
+                <w:szCs w:val="18"/>
               </w:rPr>
             </w:pPr>
           </w:p>
@@ -761,8 +727,8 @@
           <w:sdtPr>
             <w:rPr>
               <w:rFonts w:cs="Segoe UI Semibold"/>
-              <w:sz w:val="22"/>
-              <w:szCs w:val="22"/>
+              <w:sz w:val="18"/>
+              <w:szCs w:val="18"/>
             </w:rPr>
             <w:alias w:val="CompanyLegalOffice_Lbl"/>
             <w:tag w:val="#BC:InsertDataItem,DataItems/Header/CompanyLegalOffice_Lbl"/>
@@ -770,11 +736,10 @@
             <w:placeholder>
               <w:docPart w:val="916F8383C88D40AE8FA1A1CF0CB42C59"/>
             </w:placeholder>
+            <w:dataBinding w:prefixMappings="xmlns:ns0='urn:microsoft-dynamics-nav/reports/Standard_Sales_Credit_Memo/1307/'" w:xpath="/ns0:NavWordReportXmlPart[1]/ns0:Header[1]/ns0:CompanyLegalOffice_Lbl[1]" w:storeItemID="{2C0E3694-AC57-46EE-8053-99B806001417}"/>
             <w15:color w:val="808080"/>
             <w:text/>
-            <w:dataBinding w:prefixMappings="xmlns:ns0='urn:microsoft-dynamics-nav/reports/Standard_Sales_Credit_Memo/1307/'" w:xpath="/ns0:NavWordReportXmlPart[1]/ns0:Header[1]/ns0:CompanyLegalOffice_Lbl[1]"/>
           </w:sdtPr>
-          <w:sdtEndPr/>
           <w:sdtContent>
             <w:tc>
               <w:tcPr>
@@ -784,18 +749,334 @@
                 <w:pPr>
                   <w:jc w:val="right"/>
                   <w:rPr>
-                    <w:sz w:val="22"/>
-                    <w:szCs w:val="22"/>
+                    <w:sz w:val="18"/>
+                    <w:szCs w:val="18"/>
                   </w:rPr>
                 </w:pPr>
                 <w:proofErr w:type="spellStart"/>
                 <w:r>
                   <w:rPr>
-                    <w:rFonts w:cs="Segoe UI Semibold" w:asciiTheme="minorHAnsi" w:hAnsiTheme="minorHAnsi"/>
-                    <w:sz w:val="22"/>
-                    <w:szCs w:val="22"/>
+                    <w:rFonts w:cs="Segoe UI Semibold"/>
+                    <w:sz w:val="18"/>
+                    <w:szCs w:val="18"/>
                   </w:rPr>
                   <w:t>CompanyLegalOffice_Lbl</w:t>
+                </w:r>
+                <w:proofErr w:type="spellEnd"/>
+              </w:p>
+            </w:tc>
+          </w:sdtContent>
+        </w:sdt>
+      </w:tr>
+      <w:tr>
+        <w:trPr>
+          <w:trHeight w:val="268"/>
+        </w:trPr>
+        <w:sdt>
+          <w:sdtPr>
+            <w:rPr>
+              <w:rFonts w:cs="Segoe UI Semibold"/>
+              <w:sz w:val="18"/>
+              <w:szCs w:val="18"/>
+            </w:rPr>
+            <w:alias w:val="CustomerAddress8"/>
+            <w:tag w:val="#BC:InsertDataItem,DataItems/Header/CustomerAddress8"/>
+            <w:id w:val="-1986933782"/>
+            <w:placeholder>
+              <w:docPart w:val="12BE470CD3E0468886911E4D534EDF5C"/>
+            </w:placeholder>
+            <w:dataBinding w:prefixMappings="xmlns:ns0='urn:microsoft-dynamics-nav/reports/Standard_Sales_Credit_Memo/1307/'" w:xpath="/ns0:NavWordReportXmlPart[1]/ns0:Header[1]/ns0:CustomerAddress8[1]" w:storeItemID="{2C0E3694-AC57-46EE-8053-99B806001417}"/>
+            <w15:color w:val="808080"/>
+            <w:text/>
+          </w:sdtPr>
+          <w:sdtContent>
+            <w:tc>
+              <w:tcPr>
+                <w:tcW w:w="1250" w:type="pct"/>
+              </w:tcPr>
+              <w:p>
+                <w:pPr>
+                  <w:rPr>
+                    <w:rFonts w:cs="Segoe UI Semibold"/>
+                    <w:sz w:val="18"/>
+                    <w:szCs w:val="18"/>
+                  </w:rPr>
+                </w:pPr>
+                <w:r>
+                  <w:rPr>
+                    <w:rFonts w:cs="Segoe UI Semibold"/>
+                    <w:sz w:val="18"/>
+                    <w:szCs w:val="18"/>
+                  </w:rPr>
+                  <w:t>CustomerAddress8</w:t>
+                </w:r>
+              </w:p>
+            </w:tc>
+          </w:sdtContent>
+        </w:sdt>
+        <w:tc>
+          <w:tcPr>
+            <w:tcW w:w="2500" w:type="pct"/>
+          </w:tcPr>
+          <w:p>
+            <w:pPr>
+              <w:rPr>
+                <w:rFonts w:cs="Segoe UI Semibold"/>
+                <w:sz w:val="18"/>
+                <w:szCs w:val="18"/>
+              </w:rPr>
+            </w:pPr>
+          </w:p>
+        </w:tc>
+        <w:sdt>
+          <w:sdtPr>
+            <w:rPr>
+              <w:rFonts w:cs="Segoe UI Semibold"/>
+              <w:sz w:val="18"/>
+              <w:szCs w:val="18"/>
+            </w:rPr>
+            <w:alias w:val="CompanyLegalOffice"/>
+            <w:tag w:val="#BC:InsertDataItem,DataItems/Header/CompanyLegalOffice"/>
+            <w:id w:val="-1993854372"/>
+            <w:placeholder>
+              <w:docPart w:val="57E9537AA3C64B0287D7A4CCB72CC21E"/>
+            </w:placeholder>
+            <w:dataBinding w:prefixMappings="xmlns:ns0='urn:microsoft-dynamics-nav/reports/Standard_Sales_Credit_Memo/1307/'" w:xpath="/ns0:NavWordReportXmlPart[1]/ns0:Header[1]/ns0:CompanyLegalOffice[1]" w:storeItemID="{2C0E3694-AC57-46EE-8053-99B806001417}"/>
+            <w15:color w:val="808080"/>
+            <w:text/>
+          </w:sdtPr>
+          <w:sdtContent>
+            <w:tc>
+              <w:tcPr>
+                <w:tcW w:w="1250" w:type="pct"/>
+              </w:tcPr>
+              <w:p>
+                <w:pPr>
+                  <w:jc w:val="right"/>
+                  <w:rPr>
+                    <w:sz w:val="18"/>
+                    <w:szCs w:val="18"/>
+                  </w:rPr>
+                </w:pPr>
+                <w:proofErr w:type="spellStart"/>
+                <w:r>
+                  <w:rPr>
+                    <w:rFonts w:cs="Segoe UI Semibold"/>
+                    <w:sz w:val="18"/>
+                    <w:szCs w:val="18"/>
+                  </w:rPr>
+                  <w:t>CompanyLegalOffice</w:t>
+                </w:r>
+                <w:proofErr w:type="spellEnd"/>
+              </w:p>
+            </w:tc>
+          </w:sdtContent>
+        </w:sdt>
+      </w:tr>
+    </w:tbl>
+    <w:p>
+      <w:pPr>
+        <w:rPr>
+          <w:sz w:val="18"/>
+          <w:szCs w:val="18"/>
+        </w:rPr>
+      </w:pPr>
+    </w:p>
+    <w:tbl>
+      <w:tblPr>
+        <w:tblStyle w:val="BCBlockTable"/>
+        <w:tblW w:w="10498" w:type="dxa"/>
+        <w:tblLook w:val="04A0" w:firstRow="1" w:lastRow="0" w:firstColumn="1" w:lastColumn="0" w:noHBand="0" w:noVBand="1"/>
+      </w:tblPr>
+      <w:tblGrid>
+        <w:gridCol w:w="2624"/>
+        <w:gridCol w:w="2625"/>
+        <w:gridCol w:w="2624"/>
+        <w:gridCol w:w="2625"/>
+      </w:tblGrid>
+      <w:tr>
+        <w:trPr>
+          <w:cnfStyle w:val="100000000000" w:firstRow="1" w:lastRow="0" w:firstColumn="0" w:lastColumn="0" w:oddVBand="0" w:evenVBand="0" w:oddHBand="0" w:evenHBand="0" w:firstRowFirstColumn="0" w:firstRowLastColumn="0" w:lastRowFirstColumn="0" w:lastRowLastColumn="0"/>
+          <w:trHeight w:val="254"/>
+        </w:trPr>
+        <w:sdt>
+          <w:sdtPr>
+            <w:rPr>
+              <w:rFonts w:ascii="Segoe UI Semibold" w:hAnsi="Segoe UI Semibold" w:cs="Segoe UI Semibold"/>
+              <w:sz w:val="18"/>
+              <w:szCs w:val="18"/>
+            </w:rPr>
+            <w:alias w:val="YourReference_Lbl"/>
+            <w:tag w:val="#BC:InsertDataItem,DataItems/Header/YourReference_Lbl"/>
+            <w:id w:val="1444269289"/>
+            <w:placeholder>
+              <w:docPart w:val="67EE593905584E38A88F0701E11A2324"/>
+            </w:placeholder>
+            <w:dataBinding w:prefixMappings="xmlns:ns0='urn:microsoft-dynamics-nav/reports/Standard_Sales_Credit_Memo/1307/'" w:xpath="/ns0:NavWordReportXmlPart[1]/ns0:Header[1]/ns0:YourReference_Lbl[1]" w:storeItemID="{2C0E3694-AC57-46EE-8053-99B806001417}"/>
+            <w15:color w:val="808080"/>
+            <w:text/>
+          </w:sdtPr>
+          <w:sdtContent>
+            <w:tc>
+              <w:tcPr>
+                <w:tcW w:w="2624" w:type="dxa"/>
+              </w:tcPr>
+              <w:p>
+                <w:pPr>
+                  <w:pStyle w:val="Heading2"/>
+                  <w:spacing w:before="0" w:after="0" w:line="276" w:lineRule="auto"/>
+                  <w:rPr>
+                    <w:rFonts w:ascii="Segoe UI Semibold" w:hAnsi="Segoe UI Semibold" w:cs="Segoe UI Semibold"/>
+                    <w:sz w:val="18"/>
+                    <w:szCs w:val="18"/>
+                  </w:rPr>
+                </w:pPr>
+                <w:proofErr w:type="spellStart"/>
+                <w:r>
+                  <w:rPr>
+                    <w:rFonts w:ascii="Segoe UI Semibold" w:hAnsi="Segoe UI Semibold" w:cs="Segoe UI Semibold"/>
+                    <w:sz w:val="18"/>
+                    <w:szCs w:val="18"/>
+                  </w:rPr>
+                  <w:t>YourReference_Lbl</w:t>
+                </w:r>
+                <w:proofErr w:type="spellEnd"/>
+              </w:p>
+            </w:tc>
+          </w:sdtContent>
+        </w:sdt>
+        <w:sdt>
+          <w:sdtPr>
+            <w:rPr>
+              <w:rFonts w:ascii="Segoe UI Semibold" w:hAnsi="Segoe UI Semibold" w:cs="Segoe UI Semibold"/>
+              <w:sz w:val="18"/>
+              <w:szCs w:val="18"/>
+            </w:rPr>
+            <w:alias w:val="SalesPersonBlank_Lbl"/>
+            <w:tag w:val="#BC:InsertDataItem,DataItems/Header/SalesPersonBlank_Lbl"/>
+            <w:id w:val="-829743997"/>
+            <w:placeholder>
+              <w:docPart w:val="1FDB2023363642548C38AD348CBB7D3D"/>
+            </w:placeholder>
+            <w:dataBinding w:prefixMappings="xmlns:ns0='urn:microsoft-dynamics-nav/reports/Standard_Sales_Credit_Memo/1307/'" w:xpath="/ns0:NavWordReportXmlPart[1]/ns0:Header[1]/ns0:SalesPersonBlank_Lbl[1]" w:storeItemID="{2C0E3694-AC57-46EE-8053-99B806001417}"/>
+            <w15:color w:val="808080"/>
+            <w:text/>
+          </w:sdtPr>
+          <w:sdtContent>
+            <w:tc>
+              <w:tcPr>
+                <w:tcW w:w="2625" w:type="dxa"/>
+              </w:tcPr>
+              <w:p>
+                <w:pPr>
+                  <w:pStyle w:val="Heading2"/>
+                  <w:spacing w:before="0" w:after="0" w:line="276" w:lineRule="auto"/>
+                  <w:rPr>
+                    <w:rFonts w:ascii="Segoe UI Semibold" w:hAnsi="Segoe UI Semibold" w:cs="Segoe UI Semibold"/>
+                    <w:sz w:val="18"/>
+                    <w:szCs w:val="18"/>
+                  </w:rPr>
+                </w:pPr>
+                <w:proofErr w:type="spellStart"/>
+                <w:r>
+                  <w:rPr>
+                    <w:rFonts w:ascii="Segoe UI Semibold" w:hAnsi="Segoe UI Semibold" w:cs="Segoe UI Semibold"/>
+                    <w:sz w:val="18"/>
+                    <w:szCs w:val="18"/>
+                  </w:rPr>
+                  <w:t>SalesPersonBlank_Lbl</w:t>
+                </w:r>
+                <w:proofErr w:type="spellEnd"/>
+              </w:p>
+            </w:tc>
+          </w:sdtContent>
+        </w:sdt>
+        <w:sdt>
+          <w:sdtPr>
+            <w:rPr>
+              <w:rFonts w:ascii="Segoe UI Semibold" w:hAnsi="Segoe UI Semibold" w:cs="Segoe UI Semibold"/>
+              <w:sz w:val="18"/>
+              <w:szCs w:val="18"/>
+            </w:rPr>
+            <w:alias w:val="AppliesToDocument_Lbl"/>
+            <w:tag w:val="#BC:InsertDataItem,DataItems/Header/AppliesToDocument_Lbl"/>
+            <w:id w:val="-878249001"/>
+            <w:placeholder>
+              <w:docPart w:val="DB331ED79B5B4319899A61465048ABC8"/>
+            </w:placeholder>
+            <w:dataBinding w:prefixMappings="xmlns:ns0='urn:microsoft-dynamics-nav/reports/Standard_Sales_Credit_Memo/1307/'" w:xpath="/ns0:NavWordReportXmlPart[1]/ns0:Header[1]/ns0:AppliesToDocument_Lbl[1]" w:storeItemID="{2C0E3694-AC57-46EE-8053-99B806001417}"/>
+            <w15:color w:val="808080"/>
+            <w:text/>
+          </w:sdtPr>
+          <w:sdtContent>
+            <w:tc>
+              <w:tcPr>
+                <w:tcW w:w="2624" w:type="dxa"/>
+              </w:tcPr>
+              <w:p>
+                <w:pPr>
+                  <w:pStyle w:val="Heading2"/>
+                  <w:spacing w:before="0" w:after="0" w:line="276" w:lineRule="auto"/>
+                  <w:rPr>
+                    <w:rFonts w:ascii="Segoe UI Semibold" w:hAnsi="Segoe UI Semibold" w:cs="Segoe UI Semibold"/>
+                    <w:sz w:val="18"/>
+                    <w:szCs w:val="18"/>
+                  </w:rPr>
+                </w:pPr>
+                <w:proofErr w:type="spellStart"/>
+                <w:r>
+                  <w:rPr>
+                    <w:rFonts w:ascii="Segoe UI Semibold" w:hAnsi="Segoe UI Semibold" w:cs="Segoe UI Semibold"/>
+                    <w:sz w:val="18"/>
+                    <w:szCs w:val="18"/>
+                  </w:rPr>
+                  <w:t>AppliesToDocument_Lbl</w:t>
+                </w:r>
+                <w:proofErr w:type="spellEnd"/>
+              </w:p>
+            </w:tc>
+          </w:sdtContent>
+        </w:sdt>
+        <w:sdt>
+          <w:sdtPr>
+            <w:rPr>
+              <w:rFonts w:ascii="Segoe UI Semibold" w:hAnsi="Segoe UI Semibold" w:cs="Segoe UI Semibold"/>
+              <w:sz w:val="18"/>
+              <w:szCs w:val="18"/>
+            </w:rPr>
+            <w:alias w:val="DueDate_Lbl"/>
+            <w:tag w:val="#BC:InsertDataItem,DataItems/Header/DueDate_Lbl"/>
+            <w:id w:val="1886915070"/>
+            <w:placeholder>
+              <w:docPart w:val="5F0EF72654094BF8A3E1E2EE65CAB393"/>
+            </w:placeholder>
+            <w:dataBinding w:prefixMappings="xmlns:ns0='urn:microsoft-dynamics-nav/reports/Standard_Sales_Credit_Memo/1307/'" w:xpath="/ns0:NavWordReportXmlPart[1]/ns0:Header[1]/ns0:DueDate_Lbl[1]" w:storeItemID="{2C0E3694-AC57-46EE-8053-99B806001417}"/>
+            <w15:color w:val="808080"/>
+            <w:text/>
+          </w:sdtPr>
+          <w:sdtContent>
+            <w:tc>
+              <w:tcPr>
+                <w:tcW w:w="2625" w:type="dxa"/>
+              </w:tcPr>
+              <w:p>
+                <w:pPr>
+                  <w:pStyle w:val="Heading2"/>
+                  <w:spacing w:before="0" w:after="0" w:line="276" w:lineRule="auto"/>
+                  <w:rPr>
+                    <w:rFonts w:ascii="Segoe UI Semibold" w:hAnsi="Segoe UI Semibold" w:cs="Segoe UI Semibold"/>
+                    <w:sz w:val="18"/>
+                    <w:szCs w:val="18"/>
+                  </w:rPr>
+                </w:pPr>
+                <w:proofErr w:type="spellStart"/>
+                <w:r>
+                  <w:rPr>
+                    <w:rFonts w:ascii="Segoe UI Semibold" w:hAnsi="Segoe UI Semibold" w:cs="Segoe UI Semibold"/>
+                    <w:sz w:val="18"/>
+                    <w:szCs w:val="18"/>
+                  </w:rPr>
+                  <w:t>DueDate_Lbl</w:t>
                 </w:r>
                 <w:proofErr w:type="spellEnd"/>
               </w:p>
@@ -810,99 +1091,189 @@
         <w:sdt>
           <w:sdtPr>
             <w:rPr>
-              <w:rFonts w:cs="Segoe UI Semibold"/>
-              <w:sz w:val="22"/>
-              <w:szCs w:val="22"/>
-            </w:rPr>
-            <w:alias w:val="CustomerAddress8"/>
-            <w:tag w:val="#BC:InsertDataItem,DataItems/Header/CustomerAddress8"/>
-            <w:id w:val="-1986933782"/>
+              <w:rFonts w:cs="Segoe UI"/>
+              <w:color w:val="242424"/>
+              <w:sz w:val="18"/>
+              <w:szCs w:val="18"/>
+            </w:rPr>
+            <w:alias w:val="YourReference"/>
+            <w:tag w:val="#BC:InsertDataItem,DataItems/Header/YourReference"/>
+            <w:id w:val="-2046133057"/>
             <w:placeholder>
-              <w:docPart w:val="12BE470CD3E0468886911E4D534EDF5C"/>
+              <w:docPart w:val="53EB7E5142514976A56C07BBB690AFA8"/>
             </w:placeholder>
+            <w:dataBinding w:prefixMappings="xmlns:ns0='urn:microsoft-dynamics-nav/reports/Standard_Sales_Credit_Memo/1307/'" w:xpath="/ns0:NavWordReportXmlPart[1]/ns0:Header[1]/ns0:YourReference[1]" w:storeItemID="{2C0E3694-AC57-46EE-8053-99B806001417}"/>
             <w15:color w:val="808080"/>
             <w:text/>
-            <w:dataBinding w:prefixMappings="xmlns:ns0='urn:microsoft-dynamics-nav/reports/Standard_Sales_Credit_Memo/1307/'" w:xpath="/ns0:NavWordReportXmlPart[1]/ns0:Header[1]/ns0:CustomerAddress8[1]"/>
           </w:sdtPr>
-          <w:sdtEndPr/>
           <w:sdtContent>
             <w:tc>
               <w:tcPr>
-                <w:tcW w:w="1250" w:type="pct"/>
+                <w:tcW w:w="2624" w:type="dxa"/>
               </w:tcPr>
               <w:p>
                 <w:pPr>
-                  <w:rPr>
-                    <w:rFonts w:cs="Segoe UI Semibold" w:asciiTheme="minorHAnsi" w:hAnsiTheme="minorHAnsi"/>
-                    <w:sz w:val="22"/>
-                    <w:szCs w:val="22"/>
+                  <w:pStyle w:val="Heading2"/>
+                  <w:spacing w:before="0" w:after="0" w:line="276" w:lineRule="auto"/>
+                  <w:rPr>
+                    <w:rFonts w:ascii="Segoe UI Semibold" w:hAnsi="Segoe UI Semibold" w:cs="Segoe UI Semibold"/>
+                    <w:sz w:val="18"/>
+                    <w:szCs w:val="18"/>
                   </w:rPr>
                 </w:pPr>
+                <w:proofErr w:type="spellStart"/>
                 <w:r>
                   <w:rPr>
-                    <w:rFonts w:cs="Segoe UI Semibold" w:asciiTheme="minorHAnsi" w:hAnsiTheme="minorHAnsi"/>
-                    <w:sz w:val="22"/>
-                    <w:szCs w:val="22"/>
-                  </w:rPr>
-                  <w:t>CustomerAddress8</w:t>
+                    <w:rFonts w:asciiTheme="minorHAnsi" w:hAnsiTheme="minorHAnsi" w:cs="Segoe UI"/>
+                    <w:color w:val="242424"/>
+                    <w:sz w:val="18"/>
+                    <w:szCs w:val="18"/>
+                  </w:rPr>
+                  <w:t>YourReference</w:t>
                 </w:r>
+                <w:proofErr w:type="spellEnd"/>
               </w:p>
             </w:tc>
           </w:sdtContent>
         </w:sdt>
-        <w:tc>
-          <w:tcPr>
-            <w:tcW w:w="2500" w:type="pct"/>
-          </w:tcPr>
-          <w:p>
-            <w:pPr>
-              <w:rPr>
-                <w:rFonts w:cs="Segoe UI Semibold" w:asciiTheme="minorHAnsi" w:hAnsiTheme="minorHAnsi"/>
-                <w:sz w:val="22"/>
-                <w:szCs w:val="22"/>
-              </w:rPr>
-            </w:pPr>
-          </w:p>
-        </w:tc>
         <w:sdt>
           <w:sdtPr>
             <w:rPr>
-              <w:rFonts w:cs="Segoe UI Semibold"/>
-              <w:sz w:val="22"/>
-              <w:szCs w:val="22"/>
-            </w:rPr>
-            <w:alias w:val="CompanyLegalOffice"/>
-            <w:tag w:val="#BC:InsertDataItem,DataItems/Header/CompanyLegalOffice"/>
-            <w:id w:val="-1993854372"/>
+              <w:rFonts w:cs="Segoe UI"/>
+              <w:color w:val="242424"/>
+              <w:sz w:val="18"/>
+              <w:szCs w:val="18"/>
+            </w:rPr>
+            <w:alias w:val="SalesPersonName"/>
+            <w:tag w:val="#BC:InsertDataItem,DataItems/Header/SalesPersonName"/>
+            <w:id w:val="-80454574"/>
             <w:placeholder>
-              <w:docPart w:val="57E9537AA3C64B0287D7A4CCB72CC21E"/>
+              <w:docPart w:val="4CFDDC5025184F1190A336A748FCA821"/>
             </w:placeholder>
+            <w:dataBinding w:prefixMappings="xmlns:ns0='urn:microsoft-dynamics-nav/reports/Standard_Sales_Credit_Memo/1307/'" w:xpath="/ns0:NavWordReportXmlPart[1]/ns0:Header[1]/ns0:SalesPersonName[1]" w:storeItemID="{2C0E3694-AC57-46EE-8053-99B806001417}"/>
             <w15:color w:val="808080"/>
             <w:text/>
-            <w:dataBinding w:prefixMappings="xmlns:ns0='urn:microsoft-dynamics-nav/reports/Standard_Sales_Credit_Memo/1307/'" w:xpath="/ns0:NavWordReportXmlPart[1]/ns0:Header[1]/ns0:CompanyLegalOffice[1]"/>
           </w:sdtPr>
-          <w:sdtEndPr/>
           <w:sdtContent>
             <w:tc>
               <w:tcPr>
-                <w:tcW w:w="1250" w:type="pct"/>
+                <w:tcW w:w="2625" w:type="dxa"/>
               </w:tcPr>
               <w:p>
                 <w:pPr>
-                  <w:jc w:val="right"/>
-                  <w:rPr>
-                    <w:sz w:val="22"/>
-                    <w:szCs w:val="22"/>
+                  <w:pStyle w:val="Heading2"/>
+                  <w:spacing w:before="0" w:after="0" w:line="276" w:lineRule="auto"/>
+                  <w:rPr>
+                    <w:rFonts w:ascii="Segoe UI Semibold" w:hAnsi="Segoe UI Semibold" w:cs="Segoe UI Semibold"/>
+                    <w:sz w:val="18"/>
+                    <w:szCs w:val="18"/>
                   </w:rPr>
                 </w:pPr>
                 <w:proofErr w:type="spellStart"/>
                 <w:r>
                   <w:rPr>
-                    <w:rFonts w:cs="Segoe UI Semibold" w:asciiTheme="minorHAnsi" w:hAnsiTheme="minorHAnsi"/>
-                    <w:sz w:val="22"/>
-                    <w:szCs w:val="22"/>
-                  </w:rPr>
-                  <w:t>CompanyLegalOffice</w:t>
+                    <w:rFonts w:asciiTheme="minorHAnsi" w:hAnsiTheme="minorHAnsi" w:cs="Segoe UI"/>
+                    <w:color w:val="242424"/>
+                    <w:sz w:val="18"/>
+                    <w:szCs w:val="18"/>
+                  </w:rPr>
+                  <w:t>SalesPersonName</w:t>
+                </w:r>
+                <w:proofErr w:type="spellEnd"/>
+              </w:p>
+            </w:tc>
+          </w:sdtContent>
+        </w:sdt>
+        <w:sdt>
+          <w:sdtPr>
+            <w:rPr>
+              <w:rFonts w:cs="Segoe UI"/>
+              <w:color w:val="242424"/>
+              <w:sz w:val="18"/>
+              <w:szCs w:val="18"/>
+            </w:rPr>
+            <w:alias w:val="AppliesToDocument"/>
+            <w:tag w:val="#BC:InsertDataItem,DataItems/Header/AppliesToDocument"/>
+            <w:id w:val="1368718282"/>
+            <w:placeholder>
+              <w:docPart w:val="CFB2A04FDD2241F09D9DE97DC68EAE19"/>
+            </w:placeholder>
+            <w:dataBinding w:prefixMappings="xmlns:ns0='urn:microsoft-dynamics-nav/reports/Standard_Sales_Credit_Memo/1307/'" w:xpath="/ns0:NavWordReportXmlPart[1]/ns0:Header[1]/ns0:AppliesToDocument[1]" w:storeItemID="{2C0E3694-AC57-46EE-8053-99B806001417}"/>
+            <w15:color w:val="808080"/>
+            <w:text/>
+          </w:sdtPr>
+          <w:sdtContent>
+            <w:tc>
+              <w:tcPr>
+                <w:tcW w:w="2624" w:type="dxa"/>
+              </w:tcPr>
+              <w:p>
+                <w:pPr>
+                  <w:pStyle w:val="Heading2"/>
+                  <w:spacing w:before="0" w:after="0" w:line="276" w:lineRule="auto"/>
+                  <w:rPr>
+                    <w:rFonts w:ascii="Segoe UI Semibold" w:hAnsi="Segoe UI Semibold" w:cs="Segoe UI Semibold"/>
+                    <w:sz w:val="18"/>
+                    <w:szCs w:val="18"/>
+                  </w:rPr>
+                </w:pPr>
+                <w:proofErr w:type="spellStart"/>
+                <w:r>
+                  <w:rPr>
+                    <w:rFonts w:asciiTheme="minorHAnsi" w:hAnsiTheme="minorHAnsi" w:cs="Segoe UI"/>
+                    <w:color w:val="242424"/>
+                    <w:sz w:val="18"/>
+                    <w:szCs w:val="18"/>
+                  </w:rPr>
+                  <w:t>AppliesToDocument</w:t>
+                </w:r>
+                <w:proofErr w:type="spellEnd"/>
+              </w:p>
+            </w:tc>
+          </w:sdtContent>
+        </w:sdt>
+        <w:sdt>
+          <w:sdtPr>
+            <w:rPr>
+              <w:rFonts w:cs="Segoe UI"/>
+              <w:color w:val="242424"/>
+              <w:sz w:val="18"/>
+              <w:szCs w:val="18"/>
+            </w:rPr>
+            <w:alias w:val="DueDate"/>
+            <w:tag w:val="#BC:InsertDataItem,DataItems/Header/DueDate"/>
+            <w:id w:val="1631135760"/>
+            <w:placeholder>
+              <w:docPart w:val="D24D9F3836514D7A8C6D2BC80C9C3119"/>
+            </w:placeholder>
+            <w:dataBinding w:prefixMappings="xmlns:ns0='urn:microsoft-dynamics-nav/reports/Standard_Sales_Credit_Memo/1307/'" w:xpath="/ns0:NavWordReportXmlPart[1]/ns0:Header[1]/ns0:DueDate[1]" w:storeItemID="{2C0E3694-AC57-46EE-8053-99B806001417}"/>
+            <w15:color w:val="808080"/>
+            <w:text/>
+          </w:sdtPr>
+          <w:sdtContent>
+            <w:tc>
+              <w:tcPr>
+                <w:tcW w:w="2625" w:type="dxa"/>
+              </w:tcPr>
+              <w:p>
+                <w:pPr>
+                  <w:pStyle w:val="Heading2"/>
+                  <w:spacing w:before="0" w:after="0" w:line="276" w:lineRule="auto"/>
+                  <w:rPr>
+                    <w:rFonts w:ascii="Segoe UI Semibold" w:hAnsi="Segoe UI Semibold" w:cs="Segoe UI Semibold"/>
+                    <w:sz w:val="18"/>
+                    <w:szCs w:val="18"/>
+                  </w:rPr>
+                </w:pPr>
+                <w:proofErr w:type="spellStart"/>
+                <w:r>
+                  <w:rPr>
+                    <w:rFonts w:asciiTheme="minorHAnsi" w:hAnsiTheme="minorHAnsi" w:cs="Segoe UI"/>
+                    <w:color w:val="242424"/>
+                    <w:sz w:val="18"/>
+                    <w:szCs w:val="18"/>
+                  </w:rPr>
+                  <w:t>DueDate</w:t>
                 </w:r>
                 <w:proofErr w:type="spellEnd"/>
               </w:p>
@@ -913,521 +1284,30 @@
     </w:tbl>
     <w:p>
       <w:pPr>
-        <w:spacing w:after="0" w:line="276" w:lineRule="auto"/>
         <w:rPr>
-          <w:sz w:val="22"/>
-          <w:szCs w:val="22"/>
+          <w:sz w:val="18"/>
+          <w:szCs w:val="18"/>
         </w:rPr>
       </w:pPr>
     </w:p>
     <w:tbl>
       <w:tblPr>
-        <w:tblStyle w:val="TableGrid"/>
-        <w:tblW w:w="15422" w:type="dxa"/>
-        <w:tblBorders>
-          <w:top w:val="none" w:color="auto" w:sz="0" w:space="0"/>
-          <w:left w:val="none" w:color="auto" w:sz="0" w:space="0"/>
-          <w:bottom w:val="none" w:color="auto" w:sz="0" w:space="0"/>
-          <w:right w:val="none" w:color="auto" w:sz="0" w:space="0"/>
-          <w:insideH w:val="none" w:color="auto" w:sz="0" w:space="0"/>
-          <w:insideV w:val="none" w:color="auto" w:sz="0" w:space="0"/>
-        </w:tblBorders>
-        <w:tblLayout w:type="fixed"/>
-        <w:tblCellMar>
-          <w:left w:w="0" w:type="dxa"/>
-          <w:right w:w="0" w:type="dxa"/>
-        </w:tblCellMar>
-        <w:tblLook w:val="04A0" w:firstRow="1" w:lastRow="0" w:firstColumn="1" w:lastColumn="0" w:noHBand="0" w:noVBand="1"/>
-        <w:tblCaption w:val="Document Information Block"/>
-      </w:tblPr>
-      <w:tblGrid>
-        <w:gridCol w:w="2570"/>
-        <w:gridCol w:w="2570"/>
-        <w:gridCol w:w="2571"/>
-        <w:gridCol w:w="2570"/>
-        <w:gridCol w:w="2570"/>
-        <w:gridCol w:w="2571"/>
-      </w:tblGrid>
-      <w:tr>
-        <w:trPr>
-          <w:cnfStyle w:val="100000000000" w:firstRow="1" w:lastRow="0" w:firstColumn="0" w:lastColumn="0" w:oddVBand="0" w:evenVBand="0" w:oddHBand="0" w:evenHBand="0" w:firstRowFirstColumn="0" w:firstRowLastColumn="0" w:lastRowFirstColumn="0" w:lastRowLastColumn="0"/>
-          <w:trHeight w:val="254"/>
-        </w:trPr>
-        <w:sdt>
-          <w:sdtPr>
-            <w:rPr>
-              <w:rFonts w:ascii="Segoe UI Semibold" w:hAnsi="Segoe UI Semibold" w:cs="Segoe UI Semibold"/>
-              <w:sz w:val="22"/>
-              <w:szCs w:val="22"/>
-            </w:rPr>
-            <w:alias w:val="YourReference_Lbl"/>
-            <w:tag w:val="#BC:InsertDataItem,DataItems/Header/YourReference_Lbl"/>
-            <w:id w:val="1444269289"/>
-            <w:placeholder>
-              <w:docPart w:val="7DE8AF6673594E96A32576622076C01B"/>
-            </w:placeholder>
-            <w15:color w:val="808080"/>
-            <w:text/>
-            <w:dataBinding w:prefixMappings="xmlns:ns0='urn:microsoft-dynamics-nav/reports/Standard_Sales_Credit_Memo/1307/'" w:xpath="/ns0:NavWordReportXmlPart[1]/ns0:Header[1]/ns0:YourReference_Lbl[1]"/>
-          </w:sdtPr>
-          <w:sdtEndPr/>
-          <w:sdtContent>
-            <w:tc>
-              <w:tcPr>
-                <w:tcW w:w="2614" w:type="dxa"/>
-              </w:tcPr>
-              <w:p>
-                <w:pPr>
-                  <w:pStyle w:val="Heading2"/>
-                  <w:spacing w:before="0" w:after="0" w:line="276" w:lineRule="auto"/>
-                  <w:rPr>
-                    <w:rFonts w:ascii="Segoe UI Semibold" w:hAnsi="Segoe UI Semibold" w:cs="Segoe UI Semibold"/>
-                    <w:sz w:val="22"/>
-                    <w:szCs w:val="22"/>
-                  </w:rPr>
-                </w:pPr>
-                <w:proofErr w:type="spellStart"/>
-                <w:r>
-                  <w:rPr>
-                    <w:rFonts w:ascii="Segoe UI Semibold" w:hAnsi="Segoe UI Semibold" w:cs="Segoe UI Semibold"/>
-                    <w:sz w:val="22"/>
-                    <w:szCs w:val="22"/>
-                  </w:rPr>
-                  <w:t>YourReference_Lbl</w:t>
-                </w:r>
-                <w:proofErr w:type="spellEnd"/>
-              </w:p>
-            </w:tc>
-          </w:sdtContent>
-        </w:sdt>
-        <w:sdt>
-          <w:sdtPr>
-            <w:rPr>
-              <w:rFonts w:ascii="Segoe UI Semibold" w:hAnsi="Segoe UI Semibold" w:cs="Segoe UI Semibold"/>
-              <w:sz w:val="22"/>
-              <w:szCs w:val="22"/>
-            </w:rPr>
-            <w:alias w:val="SalesPersonBlank_Lbl"/>
-            <w:tag w:val="#BC:InsertDataItem,DataItems/Header/SalesPersonBlank_Lbl"/>
-            <w:id w:val="-829743997"/>
-            <w:placeholder>
-              <w:docPart w:val="694FE79F6BF445F1A7D1E44F89A49422"/>
-            </w:placeholder>
-            <w15:color w:val="808080"/>
-            <w:text/>
-            <w:dataBinding w:prefixMappings="xmlns:ns0='urn:microsoft-dynamics-nav/reports/Standard_Sales_Credit_Memo/1307/'" w:xpath="/ns0:NavWordReportXmlPart[1]/ns0:Header[1]/ns0:SalesPersonBlank_Lbl[1]"/>
-          </w:sdtPr>
-          <w:sdtEndPr/>
-          <w:sdtContent>
-            <w:tc>
-              <w:tcPr>
-                <w:tcW w:w="2614" w:type="dxa"/>
-              </w:tcPr>
-              <w:p>
-                <w:pPr>
-                  <w:pStyle w:val="Heading2"/>
-                  <w:spacing w:before="0" w:after="0" w:line="276" w:lineRule="auto"/>
-                  <w:rPr>
-                    <w:rFonts w:ascii="Segoe UI Semibold" w:hAnsi="Segoe UI Semibold" w:cs="Segoe UI Semibold"/>
-                    <w:sz w:val="22"/>
-                    <w:szCs w:val="22"/>
-                  </w:rPr>
-                </w:pPr>
-                <w:proofErr w:type="spellStart"/>
-                <w:r>
-                  <w:rPr>
-                    <w:rFonts w:ascii="Segoe UI Semibold" w:hAnsi="Segoe UI Semibold" w:cs="Segoe UI Semibold"/>
-                    <w:sz w:val="22"/>
-                    <w:szCs w:val="22"/>
-                  </w:rPr>
-                  <w:t>SalesPersonBlank_Lbl</w:t>
-                </w:r>
-                <w:proofErr w:type="spellEnd"/>
-              </w:p>
-            </w:tc>
-          </w:sdtContent>
-        </w:sdt>
-        <w:sdt>
-          <w:sdtPr>
-            <w:rPr>
-              <w:rFonts w:ascii="Segoe UI Semibold" w:hAnsi="Segoe UI Semibold" w:cs="Segoe UI Semibold"/>
-              <w:sz w:val="22"/>
-              <w:szCs w:val="22"/>
-            </w:rPr>
-            <w:alias w:val="AppliesToDocument_Lbl"/>
-            <w:tag w:val="#BC:InsertDataItem,DataItems/Header/AppliesToDocument_Lbl"/>
-            <w:id w:val="-878249001"/>
-            <w:placeholder>
-              <w:docPart w:val="694FE79F6BF445F1A7D1E44F89A49422"/>
-            </w:placeholder>
-            <w15:color w:val="808080"/>
-            <w:text/>
-            <w:dataBinding w:prefixMappings="xmlns:ns0='urn:microsoft-dynamics-nav/reports/Standard_Sales_Credit_Memo/1307/'" w:xpath="/ns0:NavWordReportXmlPart[1]/ns0:Header[1]/ns0:AppliesToDocument_Lbl[1]"/>
-          </w:sdtPr>
-          <w:sdtEndPr/>
-          <w:sdtContent>
-            <w:tc>
-              <w:tcPr>
-                <w:tcW w:w="2615" w:type="dxa"/>
-              </w:tcPr>
-              <w:p>
-                <w:pPr>
-                  <w:pStyle w:val="Heading2"/>
-                  <w:spacing w:before="0" w:after="0" w:line="276" w:lineRule="auto"/>
-                  <w:rPr>
-                    <w:rFonts w:ascii="Segoe UI Semibold" w:hAnsi="Segoe UI Semibold" w:cs="Segoe UI Semibold"/>
-                    <w:sz w:val="22"/>
-                    <w:szCs w:val="22"/>
-                  </w:rPr>
-                </w:pPr>
-                <w:proofErr w:type="spellStart"/>
-                <w:r>
-                  <w:rPr>
-                    <w:rFonts w:ascii="Segoe UI Semibold" w:hAnsi="Segoe UI Semibold" w:cs="Segoe UI Semibold"/>
-                    <w:sz w:val="22"/>
-                    <w:szCs w:val="22"/>
-                  </w:rPr>
-                  <w:t>AppliesToDocument_Lbl</w:t>
-                </w:r>
-                <w:proofErr w:type="spellEnd"/>
-              </w:p>
-            </w:tc>
-          </w:sdtContent>
-        </w:sdt>
-        <w:sdt>
-          <w:sdtPr>
-            <w:rPr>
-              <w:rFonts w:ascii="Segoe UI Semibold" w:hAnsi="Segoe UI Semibold" w:cs="Segoe UI Semibold"/>
-              <w:sz w:val="22"/>
-              <w:szCs w:val="22"/>
-            </w:rPr>
-            <w:alias w:val="DueDate_Lbl"/>
-            <w:tag w:val="#BC:InsertDataItem,DataItems/Header/DueDate_Lbl"/>
-            <w:id w:val="1886915070"/>
-            <w:placeholder>
-              <w:docPart w:val="694FE79F6BF445F1A7D1E44F89A49422"/>
-            </w:placeholder>
-            <w15:color w:val="808080"/>
-            <w:text/>
-            <w:dataBinding w:prefixMappings="xmlns:ns0='urn:microsoft-dynamics-nav/reports/Standard_Sales_Credit_Memo/1307/'" w:xpath="/ns0:NavWordReportXmlPart[1]/ns0:Header[1]/ns0:DueDate_Lbl[1]"/>
-          </w:sdtPr>
-          <w:sdtEndPr/>
-          <w:sdtContent>
-            <w:tc>
-              <w:tcPr>
-                <w:tcW w:w="2614" w:type="dxa"/>
-              </w:tcPr>
-              <w:p>
-                <w:pPr>
-                  <w:pStyle w:val="Heading2"/>
-                  <w:spacing w:before="0" w:after="0" w:line="276" w:lineRule="auto"/>
-                  <w:rPr>
-                    <w:rFonts w:ascii="Segoe UI Semibold" w:hAnsi="Segoe UI Semibold" w:cs="Segoe UI Semibold"/>
-                    <w:sz w:val="22"/>
-                    <w:szCs w:val="22"/>
-                  </w:rPr>
-                </w:pPr>
-                <w:proofErr w:type="spellStart"/>
-                <w:r>
-                  <w:rPr>
-                    <w:rFonts w:ascii="Segoe UI Semibold" w:hAnsi="Segoe UI Semibold" w:cs="Segoe UI Semibold"/>
-                    <w:sz w:val="22"/>
-                    <w:szCs w:val="22"/>
-                  </w:rPr>
-                  <w:t>DueDate_Lbl</w:t>
-                </w:r>
-                <w:proofErr w:type="spellEnd"/>
-              </w:p>
-            </w:tc>
-          </w:sdtContent>
-        </w:sdt>
-        <w:tc>
-          <w:tcPr>
-            <w:tcW w:w="2614" w:type="dxa"/>
-          </w:tcPr>
-          <w:p>
-            <w:pPr>
-              <w:pStyle w:val="Heading2"/>
-              <w:spacing w:before="0" w:after="0" w:line="276" w:lineRule="auto"/>
-              <w:rPr>
-                <w:rFonts w:ascii="Segoe UI Semibold" w:hAnsi="Segoe UI Semibold" w:cs="Segoe UI Semibold"/>
-                <w:sz w:val="22"/>
-                <w:szCs w:val="22"/>
-              </w:rPr>
-            </w:pPr>
-          </w:p>
-        </w:tc>
-        <w:tc>
-          <w:tcPr>
-            <w:tcW w:w="2615" w:type="dxa"/>
-          </w:tcPr>
-          <w:p>
-            <w:pPr>
-              <w:pStyle w:val="Heading2"/>
-              <w:spacing w:before="0" w:after="0" w:line="276" w:lineRule="auto"/>
-              <w:rPr>
-                <w:rFonts w:ascii="Segoe UI Semibold" w:hAnsi="Segoe UI Semibold" w:cs="Segoe UI Semibold"/>
-                <w:sz w:val="22"/>
-                <w:szCs w:val="22"/>
-              </w:rPr>
-            </w:pPr>
-          </w:p>
-        </w:tc>
-      </w:tr>
-      <w:tr>
-        <w:trPr>
-          <w:trHeight w:val="242"/>
-        </w:trPr>
-        <w:sdt>
-          <w:sdtPr>
-            <w:rPr>
-              <w:rFonts w:cs="Segoe UI"/>
-              <w:color w:val="242424"/>
-              <w:sz w:val="22"/>
-              <w:szCs w:val="22"/>
-            </w:rPr>
-            <w:alias w:val="YourReference"/>
-            <w:tag w:val="#BC:InsertDataItem,DataItems/Header/YourReference"/>
-            <w:id w:val="-2046133057"/>
-            <w:placeholder>
-              <w:docPart w:val="7DE8AF6673594E96A32576622076C01B"/>
-            </w:placeholder>
-            <w15:color w:val="808080"/>
-            <w:text/>
-            <w:dataBinding w:prefixMappings="xmlns:ns0='urn:microsoft-dynamics-nav/reports/Standard_Sales_Credit_Memo/1307/'" w:xpath="/ns0:NavWordReportXmlPart[1]/ns0:Header[1]/ns0:YourReference[1]"/>
-          </w:sdtPr>
-          <w:sdtEndPr/>
-          <w:sdtContent>
-            <w:tc>
-              <w:tcPr>
-                <w:tcW w:w="2614" w:type="dxa"/>
-              </w:tcPr>
-              <w:p>
-                <w:pPr>
-                  <w:rPr>
-                    <w:rFonts w:cs="Segoe UI" w:asciiTheme="minorHAnsi" w:hAnsiTheme="minorHAnsi"/>
-                    <w:color w:val="242424"/>
-                    <w:sz w:val="22"/>
-                    <w:szCs w:val="22"/>
-                  </w:rPr>
-                </w:pPr>
-                <w:proofErr w:type="spellStart"/>
-                <w:r>
-                  <w:rPr>
-                    <w:rFonts w:cs="Segoe UI" w:asciiTheme="minorHAnsi" w:hAnsiTheme="minorHAnsi"/>
-                    <w:color w:val="242424"/>
-                    <w:sz w:val="22"/>
-                    <w:szCs w:val="22"/>
-                  </w:rPr>
-                  <w:t>YourReference</w:t>
-                </w:r>
-                <w:proofErr w:type="spellEnd"/>
-              </w:p>
-            </w:tc>
-          </w:sdtContent>
-        </w:sdt>
-        <w:sdt>
-          <w:sdtPr>
-            <w:rPr>
-              <w:rFonts w:cs="Segoe UI"/>
-              <w:color w:val="242424"/>
-              <w:sz w:val="22"/>
-              <w:szCs w:val="22"/>
-            </w:rPr>
-            <w:alias w:val="SalesPersonName"/>
-            <w:tag w:val="#BC:InsertDataItem,DataItems/Header/SalesPersonName"/>
-            <w:id w:val="-80454574"/>
-            <w:placeholder>
-              <w:docPart w:val="694FE79F6BF445F1A7D1E44F89A49422"/>
-            </w:placeholder>
-            <w15:color w:val="808080"/>
-            <w:text/>
-            <w:dataBinding w:prefixMappings="xmlns:ns0='urn:microsoft-dynamics-nav/reports/Standard_Sales_Credit_Memo/1307/'" w:xpath="/ns0:NavWordReportXmlPart[1]/ns0:Header[1]/ns0:SalesPersonName[1]"/>
-          </w:sdtPr>
-          <w:sdtEndPr/>
-          <w:sdtContent>
-            <w:tc>
-              <w:tcPr>
-                <w:tcW w:w="2614" w:type="dxa"/>
-              </w:tcPr>
-              <w:p>
-                <w:pPr>
-                  <w:rPr>
-                    <w:rFonts w:cs="Segoe UI" w:asciiTheme="minorHAnsi" w:hAnsiTheme="minorHAnsi"/>
-                    <w:color w:val="242424"/>
-                    <w:sz w:val="22"/>
-                    <w:szCs w:val="22"/>
-                  </w:rPr>
-                </w:pPr>
-                <w:proofErr w:type="spellStart"/>
-                <w:r>
-                  <w:rPr>
-                    <w:rFonts w:cs="Segoe UI" w:asciiTheme="minorHAnsi" w:hAnsiTheme="minorHAnsi"/>
-                    <w:color w:val="242424"/>
-                    <w:sz w:val="22"/>
-                    <w:szCs w:val="22"/>
-                  </w:rPr>
-                  <w:t>SalesPersonName</w:t>
-                </w:r>
-                <w:proofErr w:type="spellEnd"/>
-              </w:p>
-            </w:tc>
-          </w:sdtContent>
-        </w:sdt>
-        <w:sdt>
-          <w:sdtPr>
-            <w:rPr>
-              <w:rFonts w:cs="Segoe UI"/>
-              <w:color w:val="242424"/>
-              <w:sz w:val="22"/>
-              <w:szCs w:val="22"/>
-            </w:rPr>
-            <w:alias w:val="AppliesToDocument"/>
-            <w:tag w:val="#BC:InsertDataItem,DataItems/Header/AppliesToDocument"/>
-            <w:id w:val="1368718282"/>
-            <w:placeholder>
-              <w:docPart w:val="694FE79F6BF445F1A7D1E44F89A49422"/>
-            </w:placeholder>
-            <w15:color w:val="808080"/>
-            <w:text/>
-            <w:dataBinding w:prefixMappings="xmlns:ns0='urn:microsoft-dynamics-nav/reports/Standard_Sales_Credit_Memo/1307/'" w:xpath="/ns0:NavWordReportXmlPart[1]/ns0:Header[1]/ns0:AppliesToDocument[1]"/>
-          </w:sdtPr>
-          <w:sdtEndPr/>
-          <w:sdtContent>
-            <w:tc>
-              <w:tcPr>
-                <w:tcW w:w="2615" w:type="dxa"/>
-              </w:tcPr>
-              <w:p>
-                <w:pPr>
-                  <w:rPr>
-                    <w:rFonts w:cs="Segoe UI" w:asciiTheme="minorHAnsi" w:hAnsiTheme="minorHAnsi"/>
-                    <w:color w:val="242424"/>
-                    <w:sz w:val="22"/>
-                    <w:szCs w:val="22"/>
-                  </w:rPr>
-                </w:pPr>
-                <w:proofErr w:type="spellStart"/>
-                <w:r>
-                  <w:rPr>
-                    <w:rFonts w:cs="Segoe UI" w:asciiTheme="minorHAnsi" w:hAnsiTheme="minorHAnsi"/>
-                    <w:color w:val="242424"/>
-                    <w:sz w:val="22"/>
-                    <w:szCs w:val="22"/>
-                  </w:rPr>
-                  <w:t>AppliesToDocument</w:t>
-                </w:r>
-                <w:proofErr w:type="spellEnd"/>
-              </w:p>
-            </w:tc>
-          </w:sdtContent>
-        </w:sdt>
-        <w:sdt>
-          <w:sdtPr>
-            <w:rPr>
-              <w:rFonts w:cs="Segoe UI"/>
-              <w:color w:val="242424"/>
-              <w:sz w:val="22"/>
-              <w:szCs w:val="22"/>
-            </w:rPr>
-            <w:alias w:val="DueDate"/>
-            <w:tag w:val="#BC:InsertDataItem,DataItems/Header/DueDate"/>
-            <w:id w:val="1631135760"/>
-            <w:placeholder>
-              <w:docPart w:val="694FE79F6BF445F1A7D1E44F89A49422"/>
-            </w:placeholder>
-            <w15:color w:val="808080"/>
-            <w:text/>
-            <w:dataBinding w:prefixMappings="xmlns:ns0='urn:microsoft-dynamics-nav/reports/Standard_Sales_Credit_Memo/1307/'" w:xpath="/ns0:NavWordReportXmlPart[1]/ns0:Header[1]/ns0:DueDate[1]"/>
-          </w:sdtPr>
-          <w:sdtEndPr/>
-          <w:sdtContent>
-            <w:tc>
-              <w:tcPr>
-                <w:tcW w:w="2614" w:type="dxa"/>
-              </w:tcPr>
-              <w:p>
-                <w:pPr>
-                  <w:rPr>
-                    <w:rFonts w:cs="Segoe UI" w:asciiTheme="minorHAnsi" w:hAnsiTheme="minorHAnsi"/>
-                    <w:color w:val="242424"/>
-                    <w:sz w:val="22"/>
-                    <w:szCs w:val="22"/>
-                  </w:rPr>
-                </w:pPr>
-                <w:proofErr w:type="spellStart"/>
-                <w:r>
-                  <w:rPr>
-                    <w:rFonts w:cs="Segoe UI" w:asciiTheme="minorHAnsi" w:hAnsiTheme="minorHAnsi"/>
-                    <w:color w:val="242424"/>
-                    <w:sz w:val="22"/>
-                    <w:szCs w:val="22"/>
-                  </w:rPr>
-                  <w:t>DueDate</w:t>
-                </w:r>
-                <w:proofErr w:type="spellEnd"/>
-              </w:p>
-            </w:tc>
-          </w:sdtContent>
-        </w:sdt>
-        <w:tc>
-          <w:tcPr>
-            <w:tcW w:w="2614" w:type="dxa"/>
-          </w:tcPr>
-          <w:p>
-            <w:pPr>
-              <w:rPr>
-                <w:rFonts w:cs="Segoe UI"/>
-                <w:color w:val="242424"/>
-                <w:sz w:val="22"/>
-                <w:szCs w:val="22"/>
-              </w:rPr>
-            </w:pPr>
-          </w:p>
-        </w:tc>
-        <w:tc>
-          <w:tcPr>
-            <w:tcW w:w="2615" w:type="dxa"/>
-          </w:tcPr>
-          <w:p>
-            <w:pPr>
-              <w:rPr>
-                <w:rFonts w:cs="Segoe UI"/>
-                <w:color w:val="242424"/>
-                <w:sz w:val="22"/>
-                <w:szCs w:val="22"/>
-              </w:rPr>
-            </w:pPr>
-          </w:p>
-        </w:tc>
-      </w:tr>
-    </w:tbl>
-    <w:p>
-      <w:pPr>
-        <w:rPr>
-          <w:sz w:val="22"/>
-          <w:szCs w:val="22"/>
-        </w:rPr>
-      </w:pPr>
-    </w:p>
-    <w:tbl>
-      <w:tblPr>
-        <w:tblStyle w:val="CLSequoiatablestyle021"/>
-        <w:tblW w:w="15422" w:type="dxa"/>
+        <w:tblStyle w:val="BCDataTable"/>
+        <w:tblW w:w="10498" w:type="dxa"/>
         <w:tblLayout w:type="fixed"/>
         <w:tblLook w:val="04A0" w:firstRow="1" w:lastRow="0" w:firstColumn="1" w:lastColumn="0" w:noHBand="0" w:noVBand="1"/>
         <w:tblCaption w:val="Data Table Block"/>
       </w:tblPr>
       <w:tblGrid>
-        <w:gridCol w:w="1197"/>
-        <w:gridCol w:w="2763"/>
-        <w:gridCol w:w="1350"/>
-        <w:gridCol w:w="1637"/>
-        <w:gridCol w:w="1782"/>
-        <w:gridCol w:w="1903"/>
-        <w:gridCol w:w="1768"/>
-        <w:gridCol w:w="1155"/>
-        <w:gridCol w:w="1867"/>
+        <w:gridCol w:w="842"/>
+        <w:gridCol w:w="1823"/>
+        <w:gridCol w:w="939"/>
+        <w:gridCol w:w="1119"/>
+        <w:gridCol w:w="1209"/>
+        <w:gridCol w:w="1285"/>
+        <w:gridCol w:w="1201"/>
+        <w:gridCol w:w="817"/>
+        <w:gridCol w:w="1263"/>
       </w:tblGrid>
       <w:tr>
         <w:trPr>
@@ -1436,18 +1316,14 @@
         </w:trPr>
         <w:tc>
           <w:tcPr>
-            <w:cnfStyle w:val="001000000000" w:firstRow="0" w:lastRow="0" w:firstColumn="1" w:lastColumn="0" w:oddVBand="0" w:evenVBand="0" w:oddHBand="0" w:evenHBand="0" w:firstRowFirstColumn="0" w:firstRowLastColumn="0" w:lastRowFirstColumn="0" w:lastRowLastColumn="0"/>
             <w:tcW w:w="1197" w:type="dxa"/>
-            <w:tcBorders>
-              <w:bottom w:val="single" w:color="auto" w:sz="4" w:space="0"/>
-            </w:tcBorders>
           </w:tcPr>
           <w:sdt>
             <w:sdtPr>
               <w:rPr>
-                <w:rFonts w:ascii="Segoe UI Semibold" w:hAnsi="Segoe UI Semibold" w:cs="Segoe UI Semibold" w:eastAsiaTheme="minorHAnsi"/>
-                <w:sz w:val="22"/>
-                <w:szCs w:val="22"/>
+                <w:rFonts w:ascii="Segoe UI Semibold" w:eastAsiaTheme="minorHAnsi" w:hAnsi="Segoe UI Semibold" w:cs="Segoe UI Semibold"/>
+                <w:sz w:val="18"/>
+                <w:szCs w:val="18"/>
               </w:rPr>
               <w:alias w:val="ItemNo_Line_Lbl"/>
               <w:tag w:val="#BC:InsertDataItem,DataItems/Header/Line/ItemNo_Line_Lbl"/>
@@ -1455,27 +1331,26 @@
               <w:placeholder>
                 <w:docPart w:val="4668C18C81C94D57840AD342F4B53EDC"/>
               </w:placeholder>
-              <w:dataBinding w:prefixMappings="xmlns:ns0='urn:microsoft-dynamics-nav/reports/Standard_Sales_Credit_Memo/1307/'" w:xpath="/ns0:NavWordReportXmlPart[1]/ns0:Header[1]/ns0:Line[1]/ns0:ItemNo_Line_Lbl[1]" w:storeItemID="{00000000-0000-0000-0000-000000000000}"/>
+              <w:dataBinding w:prefixMappings="xmlns:ns0='urn:microsoft-dynamics-nav/reports/Standard_Sales_Credit_Memo/1307/'" w:xpath="/ns0:NavWordReportXmlPart[1]/ns0:Header[1]/ns0:Line[1]/ns0:ItemNo_Line_Lbl[1]" w:storeItemID="{2C0E3694-AC57-46EE-8053-99B806001417}"/>
               <w15:color w:val="808080"/>
               <w:text/>
             </w:sdtPr>
-            <w:sdtEndPr/>
             <w:sdtContent>
               <w:p>
                 <w:pPr>
                   <w:pStyle w:val="Heading2"/>
                   <w:rPr>
-                    <w:rFonts w:ascii="Segoe UI Semibold" w:hAnsi="Segoe UI Semibold" w:cs="Segoe UI Semibold" w:eastAsiaTheme="minorHAnsi"/>
-                    <w:sz w:val="22"/>
-                    <w:szCs w:val="22"/>
+                    <w:rFonts w:ascii="Segoe UI Semibold" w:eastAsiaTheme="minorHAnsi" w:hAnsi="Segoe UI Semibold" w:cs="Segoe UI Semibold"/>
+                    <w:sz w:val="18"/>
+                    <w:szCs w:val="18"/>
                   </w:rPr>
                 </w:pPr>
                 <w:proofErr w:type="spellStart"/>
                 <w:r>
                   <w:rPr>
-                    <w:rFonts w:ascii="Segoe UI Semibold" w:hAnsi="Segoe UI Semibold" w:cs="Segoe UI Semibold" w:eastAsiaTheme="minorHAnsi"/>
-                    <w:sz w:val="22"/>
-                    <w:szCs w:val="22"/>
+                    <w:rFonts w:ascii="Segoe UI Semibold" w:eastAsiaTheme="minorHAnsi" w:hAnsi="Segoe UI Semibold" w:cs="Segoe UI Semibold"/>
+                    <w:sz w:val="18"/>
+                    <w:szCs w:val="18"/>
                   </w:rPr>
                   <w:t>ItemNo_Line_Lbl</w:t>
                 </w:r>
@@ -1488,8 +1363,8 @@
           <w:sdtPr>
             <w:rPr>
               <w:rFonts w:ascii="Segoe UI Semibold" w:hAnsi="Segoe UI Semibold" w:cs="Segoe UI Semibold"/>
-              <w:sz w:val="22"/>
-              <w:szCs w:val="22"/>
+              <w:sz w:val="18"/>
+              <w:szCs w:val="18"/>
             </w:rPr>
             <w:alias w:val="Description_Line_Lbl"/>
             <w:tag w:val="#BC:InsertDataItem,DataItems/Header/Line/Description_Line_Lbl"/>
@@ -1497,35 +1372,30 @@
             <w:placeholder>
               <w:docPart w:val="B1505F3DBBB540B797A26F2EA82AD79F"/>
             </w:placeholder>
-            <w:dataBinding w:prefixMappings="xmlns:ns0='urn:microsoft-dynamics-nav/reports/Standard_Sales_Credit_Memo/1307/'" w:xpath="/ns0:NavWordReportXmlPart[1]/ns0:Header[1]/ns0:Line[1]/ns0:Description_Line_Lbl[1]" w:storeItemID="{00000000-0000-0000-0000-000000000000}"/>
+            <w:dataBinding w:prefixMappings="xmlns:ns0='urn:microsoft-dynamics-nav/reports/Standard_Sales_Credit_Memo/1307/'" w:xpath="/ns0:NavWordReportXmlPart[1]/ns0:Header[1]/ns0:Line[1]/ns0:Description_Line_Lbl[1]" w:storeItemID="{2C0E3694-AC57-46EE-8053-99B806001417}"/>
             <w15:color w:val="808080"/>
             <w:text/>
           </w:sdtPr>
-          <w:sdtEndPr/>
           <w:sdtContent>
             <w:tc>
               <w:tcPr>
                 <w:tcW w:w="2763" w:type="dxa"/>
-                <w:tcBorders>
-                  <w:bottom w:val="single" w:color="auto" w:sz="4" w:space="0"/>
-                </w:tcBorders>
               </w:tcPr>
               <w:p>
                 <w:pPr>
                   <w:pStyle w:val="Heading2"/>
-                  <w:cnfStyle w:val="100000000000" w:firstRow="1" w:lastRow="0" w:firstColumn="0" w:lastColumn="0" w:oddVBand="0" w:evenVBand="0" w:oddHBand="0" w:evenHBand="0" w:firstRowFirstColumn="0" w:firstRowLastColumn="0" w:lastRowFirstColumn="0" w:lastRowLastColumn="0"/>
                   <w:rPr>
                     <w:rFonts w:ascii="Segoe UI Semibold" w:hAnsi="Segoe UI Semibold" w:cs="Segoe UI Semibold"/>
-                    <w:sz w:val="22"/>
-                    <w:szCs w:val="22"/>
+                    <w:sz w:val="18"/>
+                    <w:szCs w:val="18"/>
                   </w:rPr>
                 </w:pPr>
                 <w:proofErr w:type="spellStart"/>
                 <w:r>
                   <w:rPr>
                     <w:rFonts w:ascii="Segoe UI Semibold" w:hAnsi="Segoe UI Semibold" w:cs="Segoe UI Semibold"/>
-                    <w:sz w:val="22"/>
-                    <w:szCs w:val="22"/>
+                    <w:sz w:val="18"/>
+                    <w:szCs w:val="18"/>
                   </w:rPr>
                   <w:t>Description_Line_Lbl</w:t>
                 </w:r>
@@ -1538,8 +1408,8 @@
           <w:sdtPr>
             <w:rPr>
               <w:rFonts w:ascii="Segoe UI Semibold" w:hAnsi="Segoe UI Semibold" w:cs="Segoe UI Semibold"/>
-              <w:sz w:val="22"/>
-              <w:szCs w:val="22"/>
+              <w:sz w:val="18"/>
+              <w:szCs w:val="18"/>
             </w:rPr>
             <w:alias w:val="ShipmentDate_Lbl"/>
             <w:tag w:val="#BC:InsertDataItem,DataItems/Header/ShipmentDate_Lbl"/>
@@ -1547,35 +1417,30 @@
             <w:placeholder>
               <w:docPart w:val="DefaultPlaceholder_-1854013440"/>
             </w:placeholder>
+            <w:dataBinding w:prefixMappings="xmlns:ns0='urn:microsoft-dynamics-nav/reports/Standard_Sales_Credit_Memo/1307/'" w:xpath="/ns0:NavWordReportXmlPart[1]/ns0:Header[1]/ns0:ShipmentDate_Lbl[1]" w:storeItemID="{2C0E3694-AC57-46EE-8053-99B806001417}"/>
             <w15:color w:val="808080"/>
             <w:text/>
-            <w:dataBinding w:prefixMappings="xmlns:ns0='urn:microsoft-dynamics-nav/reports/Standard_Sales_Credit_Memo/1307/'" w:xpath="/ns0:NavWordReportXmlPart[1]/ns0:Header[1]/ns0:ShipmentDate_Lbl[1]"/>
           </w:sdtPr>
-          <w:sdtEndPr/>
           <w:sdtContent>
             <w:tc>
               <w:tcPr>
                 <w:tcW w:w="1350" w:type="dxa"/>
-                <w:tcBorders>
-                  <w:bottom w:val="single" w:color="auto" w:sz="4" w:space="0"/>
-                </w:tcBorders>
               </w:tcPr>
               <w:p>
                 <w:pPr>
                   <w:pStyle w:val="Heading2"/>
-                  <w:cnfStyle w:val="100000000000" w:firstRow="1" w:lastRow="0" w:firstColumn="0" w:lastColumn="0" w:oddVBand="0" w:evenVBand="0" w:oddHBand="0" w:evenHBand="0" w:firstRowFirstColumn="0" w:firstRowLastColumn="0" w:lastRowFirstColumn="0" w:lastRowLastColumn="0"/>
                   <w:rPr>
                     <w:rFonts w:ascii="Segoe UI Semibold" w:hAnsi="Segoe UI Semibold" w:cs="Segoe UI Semibold"/>
-                    <w:sz w:val="22"/>
-                    <w:szCs w:val="22"/>
+                    <w:sz w:val="18"/>
+                    <w:szCs w:val="18"/>
                   </w:rPr>
                 </w:pPr>
                 <w:proofErr w:type="spellStart"/>
                 <w:r>
                   <w:rPr>
                     <w:rFonts w:ascii="Segoe UI Semibold" w:hAnsi="Segoe UI Semibold" w:cs="Segoe UI Semibold"/>
-                    <w:sz w:val="22"/>
-                    <w:szCs w:val="22"/>
+                    <w:sz w:val="18"/>
+                    <w:szCs w:val="18"/>
                   </w:rPr>
                   <w:t>ShipmentDate_Lbl</w:t>
                 </w:r>
@@ -1588,8 +1453,8 @@
           <w:sdtPr>
             <w:rPr>
               <w:rFonts w:ascii="Segoe UI Semibold" w:hAnsi="Segoe UI Semibold" w:cs="Segoe UI Semibold"/>
-              <w:sz w:val="22"/>
-              <w:szCs w:val="22"/>
+              <w:sz w:val="18"/>
+              <w:szCs w:val="18"/>
             </w:rPr>
             <w:alias w:val="Quantity_Line_Lbl"/>
             <w:tag w:val="#BC:InsertDataItem,DataItems/Header/Line/Quantity_Line_Lbl"/>
@@ -1597,36 +1462,31 @@
             <w:placeholder>
               <w:docPart w:val="C3F24EF614ED41B085DBBC77C1A49E33"/>
             </w:placeholder>
-            <w:dataBinding w:prefixMappings="xmlns:ns0='urn:microsoft-dynamics-nav/reports/Standard_Sales_Credit_Memo/1307/'" w:xpath="/ns0:NavWordReportXmlPart[1]/ns0:Header[1]/ns0:Line[1]/ns0:Quantity_Line_Lbl[1]" w:storeItemID="{00000000-0000-0000-0000-000000000000}"/>
+            <w:dataBinding w:prefixMappings="xmlns:ns0='urn:microsoft-dynamics-nav/reports/Standard_Sales_Credit_Memo/1307/'" w:xpath="/ns0:NavWordReportXmlPart[1]/ns0:Header[1]/ns0:Line[1]/ns0:Quantity_Line_Lbl[1]" w:storeItemID="{2C0E3694-AC57-46EE-8053-99B806001417}"/>
             <w15:color w:val="808080"/>
             <w:text/>
           </w:sdtPr>
-          <w:sdtEndPr/>
           <w:sdtContent>
             <w:tc>
               <w:tcPr>
                 <w:tcW w:w="1637" w:type="dxa"/>
-                <w:tcBorders>
-                  <w:bottom w:val="single" w:color="auto" w:sz="4" w:space="0"/>
-                </w:tcBorders>
               </w:tcPr>
               <w:p>
                 <w:pPr>
                   <w:pStyle w:val="Heading2"/>
                   <w:jc w:val="right"/>
-                  <w:cnfStyle w:val="100000000000" w:firstRow="1" w:lastRow="0" w:firstColumn="0" w:lastColumn="0" w:oddVBand="0" w:evenVBand="0" w:oddHBand="0" w:evenHBand="0" w:firstRowFirstColumn="0" w:firstRowLastColumn="0" w:lastRowFirstColumn="0" w:lastRowLastColumn="0"/>
                   <w:rPr>
                     <w:rFonts w:ascii="Segoe UI Semibold" w:hAnsi="Segoe UI Semibold" w:cs="Segoe UI Semibold"/>
-                    <w:sz w:val="22"/>
-                    <w:szCs w:val="22"/>
+                    <w:sz w:val="18"/>
+                    <w:szCs w:val="18"/>
                   </w:rPr>
                 </w:pPr>
                 <w:proofErr w:type="spellStart"/>
                 <w:r>
                   <w:rPr>
                     <w:rFonts w:ascii="Segoe UI Semibold" w:hAnsi="Segoe UI Semibold" w:cs="Segoe UI Semibold"/>
-                    <w:sz w:val="22"/>
-                    <w:szCs w:val="22"/>
+                    <w:sz w:val="18"/>
+                    <w:szCs w:val="18"/>
                   </w:rPr>
                   <w:t>Quantity_Line_Lbl</w:t>
                 </w:r>
@@ -1639,8 +1499,8 @@
           <w:sdtPr>
             <w:rPr>
               <w:rFonts w:ascii="Segoe UI Semibold" w:hAnsi="Segoe UI Semibold" w:cs="Segoe UI Semibold"/>
-              <w:sz w:val="22"/>
-              <w:szCs w:val="22"/>
+              <w:sz w:val="18"/>
+              <w:szCs w:val="18"/>
             </w:rPr>
             <w:alias w:val="UnitOfMeasure_Lbl"/>
             <w:tag w:val="#BC:InsertDataItem,DataItems/Header/Line/UnitOfMeasure_Lbl"/>
@@ -1648,35 +1508,30 @@
             <w:placeholder>
               <w:docPart w:val="DefaultPlaceholder_-1854013440"/>
             </w:placeholder>
+            <w:dataBinding w:prefixMappings="xmlns:ns0='urn:microsoft-dynamics-nav/reports/Standard_Sales_Credit_Memo/1307/'" w:xpath="/ns0:NavWordReportXmlPart[1]/ns0:Header[1]/ns0:Line[1]/ns0:UnitOfMeasure_Lbl[1]" w:storeItemID="{2C0E3694-AC57-46EE-8053-99B806001417}"/>
             <w15:color w:val="808080"/>
             <w:text/>
-            <w:dataBinding w:prefixMappings="xmlns:ns0='urn:microsoft-dynamics-nav/reports/Standard_Sales_Credit_Memo/1307/'" w:xpath="/ns0:NavWordReportXmlPart[1]/ns0:Header[1]/ns0:Line[1]/ns0:UnitOfMeasure_Lbl[1]"/>
           </w:sdtPr>
-          <w:sdtEndPr/>
           <w:sdtContent>
             <w:tc>
               <w:tcPr>
                 <w:tcW w:w="1782" w:type="dxa"/>
-                <w:tcBorders>
-                  <w:bottom w:val="single" w:color="auto" w:sz="4" w:space="0"/>
-                </w:tcBorders>
               </w:tcPr>
               <w:p>
                 <w:pPr>
                   <w:pStyle w:val="Heading2"/>
-                  <w:cnfStyle w:val="100000000000" w:firstRow="1" w:lastRow="0" w:firstColumn="0" w:lastColumn="0" w:oddVBand="0" w:evenVBand="0" w:oddHBand="0" w:evenHBand="0" w:firstRowFirstColumn="0" w:firstRowLastColumn="0" w:lastRowFirstColumn="0" w:lastRowLastColumn="0"/>
                   <w:rPr>
                     <w:rFonts w:ascii="Segoe UI Semibold" w:hAnsi="Segoe UI Semibold" w:cs="Segoe UI Semibold"/>
-                    <w:sz w:val="22"/>
-                    <w:szCs w:val="22"/>
+                    <w:sz w:val="18"/>
+                    <w:szCs w:val="18"/>
                   </w:rPr>
                 </w:pPr>
                 <w:proofErr w:type="spellStart"/>
                 <w:r>
                   <w:rPr>
                     <w:rFonts w:ascii="Segoe UI Semibold" w:hAnsi="Segoe UI Semibold" w:cs="Segoe UI Semibold"/>
-                    <w:sz w:val="22"/>
-                    <w:szCs w:val="22"/>
+                    <w:sz w:val="18"/>
+                    <w:szCs w:val="18"/>
                   </w:rPr>
                   <w:t>UnitOfMeasure_Lbl</w:t>
                 </w:r>
@@ -1689,8 +1544,8 @@
           <w:sdtPr>
             <w:rPr>
               <w:rFonts w:ascii="Segoe UI Semibold" w:hAnsi="Segoe UI Semibold" w:cs="Segoe UI Semibold"/>
-              <w:sz w:val="22"/>
-              <w:szCs w:val="22"/>
+              <w:sz w:val="18"/>
+              <w:szCs w:val="18"/>
             </w:rPr>
             <w:alias w:val="UnitPrice_Lbl"/>
             <w:tag w:val="#BC:InsertDataItem,DataItems/Header/Line/UnitPrice_Lbl"/>
@@ -1698,35 +1553,30 @@
             <w:placeholder>
               <w:docPart w:val="49619361109E48CB8AF54CFDD8A01F1C"/>
             </w:placeholder>
-            <w:dataBinding w:prefixMappings="xmlns:ns0='urn:microsoft-dynamics-nav/reports/Standard_Sales_Credit_Memo/1307/'" w:xpath="/ns0:NavWordReportXmlPart[1]/ns0:Header[1]/ns0:Line[1]/ns0:UnitPrice_Lbl[1]" w:storeItemID="{00000000-0000-0000-0000-000000000000}"/>
+            <w:dataBinding w:prefixMappings="xmlns:ns0='urn:microsoft-dynamics-nav/reports/Standard_Sales_Credit_Memo/1307/'" w:xpath="/ns0:NavWordReportXmlPart[1]/ns0:Header[1]/ns0:Line[1]/ns0:UnitPrice_Lbl[1]" w:storeItemID="{2C0E3694-AC57-46EE-8053-99B806001417}"/>
             <w15:color w:val="808080"/>
             <w:text/>
           </w:sdtPr>
-          <w:sdtEndPr/>
           <w:sdtContent>
             <w:tc>
               <w:tcPr>
                 <w:tcW w:w="1903" w:type="dxa"/>
-                <w:tcBorders>
-                  <w:bottom w:val="single" w:color="auto" w:sz="4" w:space="0"/>
-                </w:tcBorders>
               </w:tcPr>
               <w:p>
                 <w:pPr>
                   <w:pStyle w:val="Heading2"/>
-                  <w:cnfStyle w:val="100000000000" w:firstRow="1" w:lastRow="0" w:firstColumn="0" w:lastColumn="0" w:oddVBand="0" w:evenVBand="0" w:oddHBand="0" w:evenHBand="0" w:firstRowFirstColumn="0" w:firstRowLastColumn="0" w:lastRowFirstColumn="0" w:lastRowLastColumn="0"/>
                   <w:rPr>
                     <w:rFonts w:ascii="Segoe UI Semibold" w:hAnsi="Segoe UI Semibold" w:cs="Segoe UI Semibold"/>
-                    <w:sz w:val="22"/>
-                    <w:szCs w:val="22"/>
+                    <w:sz w:val="18"/>
+                    <w:szCs w:val="18"/>
                   </w:rPr>
                 </w:pPr>
                 <w:proofErr w:type="spellStart"/>
                 <w:r>
                   <w:rPr>
                     <w:rFonts w:ascii="Segoe UI Semibold" w:hAnsi="Segoe UI Semibold" w:cs="Segoe UI Semibold"/>
-                    <w:sz w:val="22"/>
-                    <w:szCs w:val="22"/>
+                    <w:sz w:val="18"/>
+                    <w:szCs w:val="18"/>
                   </w:rPr>
                   <w:t>UnitPrice_Lbl</w:t>
                 </w:r>
@@ -1739,8 +1589,8 @@
           <w:sdtPr>
             <w:rPr>
               <w:rFonts w:ascii="Segoe UI Semibold" w:hAnsi="Segoe UI Semibold" w:cs="Segoe UI Semibold"/>
-              <w:sz w:val="22"/>
-              <w:szCs w:val="22"/>
+              <w:sz w:val="18"/>
+              <w:szCs w:val="18"/>
             </w:rPr>
             <w:alias w:val="SalesInvoiceLineDiscount_Lbl"/>
             <w:tag w:val="#BC:InsertDataItem,DataItems/Header/SalesInvoiceLineDiscount_Lbl"/>
@@ -1748,35 +1598,30 @@
             <w:placeholder>
               <w:docPart w:val="2F52A3E70080416BA5347293045AD5F0"/>
             </w:placeholder>
+            <w:dataBinding w:prefixMappings="xmlns:ns0='urn:microsoft-dynamics-nav/reports/Standard_Sales_Credit_Memo/1307/'" w:xpath="/ns0:NavWordReportXmlPart[1]/ns0:Header[1]/ns0:SalesInvoiceLineDiscount_Lbl[1]" w:storeItemID="{2C0E3694-AC57-46EE-8053-99B806001417}"/>
             <w15:color w:val="808080"/>
             <w:text/>
-            <w:dataBinding w:prefixMappings="xmlns:ns0='urn:microsoft-dynamics-nav/reports/Standard_Sales_Credit_Memo/1307/'" w:xpath="/ns0:NavWordReportXmlPart[1]/ns0:Header[1]/ns0:SalesInvoiceLineDiscount_Lbl[1]"/>
           </w:sdtPr>
-          <w:sdtEndPr/>
           <w:sdtContent>
             <w:tc>
               <w:tcPr>
                 <w:tcW w:w="1768" w:type="dxa"/>
-                <w:tcBorders>
-                  <w:bottom w:val="single" w:color="auto" w:sz="4" w:space="0"/>
-                </w:tcBorders>
               </w:tcPr>
               <w:p>
                 <w:pPr>
                   <w:pStyle w:val="Heading2"/>
-                  <w:cnfStyle w:val="100000000000" w:firstRow="1" w:lastRow="0" w:firstColumn="0" w:lastColumn="0" w:oddVBand="0" w:evenVBand="0" w:oddHBand="0" w:evenHBand="0" w:firstRowFirstColumn="0" w:firstRowLastColumn="0" w:lastRowFirstColumn="0" w:lastRowLastColumn="0"/>
                   <w:rPr>
                     <w:rFonts w:ascii="Segoe UI Semibold" w:hAnsi="Segoe UI Semibold" w:cs="Segoe UI Semibold"/>
-                    <w:sz w:val="22"/>
-                    <w:szCs w:val="22"/>
+                    <w:sz w:val="18"/>
+                    <w:szCs w:val="18"/>
                   </w:rPr>
                 </w:pPr>
                 <w:proofErr w:type="spellStart"/>
                 <w:r>
                   <w:rPr>
                     <w:rFonts w:ascii="Segoe UI Semibold" w:hAnsi="Segoe UI Semibold" w:cs="Segoe UI Semibold"/>
-                    <w:sz w:val="22"/>
-                    <w:szCs w:val="22"/>
+                    <w:sz w:val="18"/>
+                    <w:szCs w:val="18"/>
                   </w:rPr>
                   <w:t>SalesInvoiceLineDiscount_Lbl</w:t>
                 </w:r>
@@ -1789,8 +1634,8 @@
           <w:sdtPr>
             <w:rPr>
               <w:rFonts w:ascii="Segoe UI Semibold" w:hAnsi="Segoe UI Semibold" w:cs="Segoe UI Semibold"/>
-              <w:sz w:val="22"/>
-              <w:szCs w:val="22"/>
+              <w:sz w:val="18"/>
+              <w:szCs w:val="18"/>
             </w:rPr>
             <w:alias w:val="VATPct_Line_Lbl"/>
             <w:tag w:val="#BC:InsertDataItem,DataItems/Header/Line/VATPct_Line_Lbl"/>
@@ -1798,35 +1643,30 @@
             <w:placeholder>
               <w:docPart w:val="63A635E5E8D9421ABEDE368ED10ABCF4"/>
             </w:placeholder>
+            <w:dataBinding w:prefixMappings="xmlns:ns0='urn:microsoft-dynamics-nav/reports/Standard_Sales_Credit_Memo/1307/'" w:xpath="/ns0:NavWordReportXmlPart[1]/ns0:Header[1]/ns0:Line[1]/ns0:VATPct_Line_Lbl[1]" w:storeItemID="{2C0E3694-AC57-46EE-8053-99B806001417}"/>
             <w15:color w:val="808080"/>
             <w:text/>
-            <w:dataBinding w:prefixMappings="xmlns:ns0='urn:microsoft-dynamics-nav/reports/Standard_Sales_Credit_Memo/1307/'" w:xpath="/ns0:NavWordReportXmlPart[1]/ns0:Header[1]/ns0:Line[1]/ns0:VATPct_Line_Lbl[1]"/>
           </w:sdtPr>
-          <w:sdtEndPr/>
           <w:sdtContent>
             <w:tc>
               <w:tcPr>
                 <w:tcW w:w="1155" w:type="dxa"/>
-                <w:tcBorders>
-                  <w:bottom w:val="single" w:color="auto" w:sz="4" w:space="0"/>
-                </w:tcBorders>
               </w:tcPr>
               <w:p>
                 <w:pPr>
                   <w:pStyle w:val="Heading2"/>
-                  <w:cnfStyle w:val="100000000000" w:firstRow="1" w:lastRow="0" w:firstColumn="0" w:lastColumn="0" w:oddVBand="0" w:evenVBand="0" w:oddHBand="0" w:evenHBand="0" w:firstRowFirstColumn="0" w:firstRowLastColumn="0" w:lastRowFirstColumn="0" w:lastRowLastColumn="0"/>
                   <w:rPr>
                     <w:rFonts w:ascii="Segoe UI Semibold" w:hAnsi="Segoe UI Semibold" w:cs="Segoe UI Semibold"/>
-                    <w:sz w:val="22"/>
-                    <w:szCs w:val="22"/>
+                    <w:sz w:val="18"/>
+                    <w:szCs w:val="18"/>
                   </w:rPr>
                 </w:pPr>
                 <w:proofErr w:type="spellStart"/>
                 <w:r>
                   <w:rPr>
                     <w:rFonts w:ascii="Segoe UI Semibold" w:hAnsi="Segoe UI Semibold" w:cs="Segoe UI Semibold"/>
-                    <w:sz w:val="22"/>
-                    <w:szCs w:val="22"/>
+                    <w:sz w:val="18"/>
+                    <w:szCs w:val="18"/>
                   </w:rPr>
                   <w:t>VATPct_Line_Lbl</w:t>
                 </w:r>
@@ -1839,8 +1679,8 @@
           <w:sdtPr>
             <w:rPr>
               <w:rFonts w:ascii="Segoe UI Semibold" w:hAnsi="Segoe UI Semibold" w:cs="Segoe UI Semibold"/>
-              <w:sz w:val="22"/>
-              <w:szCs w:val="22"/>
+              <w:sz w:val="18"/>
+              <w:szCs w:val="18"/>
             </w:rPr>
             <w:alias w:val="LineAmount_Line_Lbl"/>
             <w:tag w:val="#BC:InsertDataItem,DataItems/Header/Line/LineAmount_Line_Lbl"/>
@@ -1848,36 +1688,31 @@
             <w:placeholder>
               <w:docPart w:val="81A6BCF9284F48D68B0B0235346FC9F6"/>
             </w:placeholder>
-            <w:dataBinding w:prefixMappings="xmlns:ns0='urn:microsoft-dynamics-nav/reports/Standard_Sales_Credit_Memo/1307/'" w:xpath="/ns0:NavWordReportXmlPart[1]/ns0:Header[1]/ns0:Line[1]/ns0:LineAmount_Line_Lbl[1]" w:storeItemID="{00000000-0000-0000-0000-000000000000}"/>
+            <w:dataBinding w:prefixMappings="xmlns:ns0='urn:microsoft-dynamics-nav/reports/Standard_Sales_Credit_Memo/1307/'" w:xpath="/ns0:NavWordReportXmlPart[1]/ns0:Header[1]/ns0:Line[1]/ns0:LineAmount_Line_Lbl[1]" w:storeItemID="{2C0E3694-AC57-46EE-8053-99B806001417}"/>
             <w15:color w:val="808080"/>
             <w:text/>
           </w:sdtPr>
-          <w:sdtEndPr/>
           <w:sdtContent>
             <w:tc>
               <w:tcPr>
                 <w:tcW w:w="1867" w:type="dxa"/>
-                <w:tcBorders>
-                  <w:bottom w:val="single" w:color="auto" w:sz="4" w:space="0"/>
-                </w:tcBorders>
               </w:tcPr>
               <w:p>
                 <w:pPr>
                   <w:pStyle w:val="Heading2"/>
                   <w:jc w:val="right"/>
-                  <w:cnfStyle w:val="100000000000" w:firstRow="1" w:lastRow="0" w:firstColumn="0" w:lastColumn="0" w:oddVBand="0" w:evenVBand="0" w:oddHBand="0" w:evenHBand="0" w:firstRowFirstColumn="0" w:firstRowLastColumn="0" w:lastRowFirstColumn="0" w:lastRowLastColumn="0"/>
                   <w:rPr>
                     <w:rFonts w:ascii="Segoe UI Semibold" w:hAnsi="Segoe UI Semibold" w:cs="Segoe UI Semibold"/>
-                    <w:sz w:val="22"/>
-                    <w:szCs w:val="22"/>
+                    <w:sz w:val="18"/>
+                    <w:szCs w:val="18"/>
                   </w:rPr>
                 </w:pPr>
                 <w:proofErr w:type="spellStart"/>
                 <w:r>
                   <w:rPr>
                     <w:rFonts w:ascii="Segoe UI Semibold" w:hAnsi="Segoe UI Semibold" w:cs="Segoe UI Semibold"/>
-                    <w:sz w:val="22"/>
-                    <w:szCs w:val="22"/>
+                    <w:sz w:val="18"/>
+                    <w:szCs w:val="18"/>
                   </w:rPr>
                   <w:t>LineAmount_Line_Lbl</w:t>
                 </w:r>
@@ -1890,23 +1725,19 @@
       <w:tr>
         <w:trPr>
           <w:cnfStyle w:val="000000100000" w:firstRow="0" w:lastRow="0" w:firstColumn="0" w:lastColumn="0" w:oddVBand="0" w:evenVBand="0" w:oddHBand="1" w:evenHBand="0" w:firstRowFirstColumn="0" w:firstRowLastColumn="0" w:lastRowFirstColumn="0" w:lastRowLastColumn="0"/>
-          <w:trHeight w:val="245" w:hRule="exact"/>
+          <w:trHeight w:hRule="exact" w:val="245"/>
         </w:trPr>
         <w:tc>
           <w:tcPr>
-            <w:cnfStyle w:val="001000000000" w:firstRow="0" w:lastRow="0" w:firstColumn="1" w:lastColumn="0" w:oddVBand="0" w:evenVBand="0" w:oddHBand="0" w:evenHBand="0" w:firstRowFirstColumn="0" w:firstRowLastColumn="0" w:lastRowFirstColumn="0" w:lastRowLastColumn="0"/>
             <w:tcW w:w="1197" w:type="dxa"/>
-            <w:tcBorders>
-              <w:top w:val="single" w:color="auto" w:sz="4" w:space="0"/>
-            </w:tcBorders>
           </w:tcPr>
           <w:p>
             <w:pPr>
               <w:rPr>
                 <w:rFonts w:ascii="Segoe UI Semibold" w:hAnsi="Segoe UI Semibold" w:cs="Segoe UI Semibold"/>
                 <w:b/>
-                <w:sz w:val="22"/>
-                <w:szCs w:val="22"/>
+                <w:sz w:val="18"/>
+                <w:szCs w:val="18"/>
                 <w:lang w:val="en-US" w:eastAsia="en-US"/>
               </w:rPr>
             </w:pPr>
@@ -1915,19 +1746,15 @@
         <w:tc>
           <w:tcPr>
             <w:tcW w:w="2763" w:type="dxa"/>
-            <w:tcBorders>
-              <w:top w:val="single" w:color="auto" w:sz="4" w:space="0"/>
-            </w:tcBorders>
           </w:tcPr>
           <w:p>
             <w:pPr>
-              <w:cnfStyle w:val="000000100000" w:firstRow="0" w:lastRow="0" w:firstColumn="0" w:lastColumn="0" w:oddVBand="0" w:evenVBand="0" w:oddHBand="1" w:evenHBand="0" w:firstRowFirstColumn="0" w:firstRowLastColumn="0" w:lastRowFirstColumn="0" w:lastRowLastColumn="0"/>
               <w:rPr>
                 <w:rFonts w:ascii="Segoe UI Semibold" w:hAnsi="Segoe UI Semibold" w:cs="Segoe UI Semibold"/>
                 <w:b/>
                 <w:bCs/>
-                <w:sz w:val="22"/>
-                <w:szCs w:val="22"/>
+                <w:sz w:val="18"/>
+                <w:szCs w:val="18"/>
                 <w:lang w:val="en-US" w:eastAsia="en-US"/>
               </w:rPr>
             </w:pPr>
@@ -1936,19 +1763,15 @@
         <w:tc>
           <w:tcPr>
             <w:tcW w:w="1350" w:type="dxa"/>
-            <w:tcBorders>
-              <w:top w:val="single" w:color="auto" w:sz="4" w:space="0"/>
-            </w:tcBorders>
           </w:tcPr>
           <w:p>
             <w:pPr>
-              <w:cnfStyle w:val="000000100000" w:firstRow="0" w:lastRow="0" w:firstColumn="0" w:lastColumn="0" w:oddVBand="0" w:evenVBand="0" w:oddHBand="1" w:evenHBand="0" w:firstRowFirstColumn="0" w:firstRowLastColumn="0" w:lastRowFirstColumn="0" w:lastRowLastColumn="0"/>
               <w:rPr>
                 <w:rFonts w:ascii="Segoe UI Semibold" w:hAnsi="Segoe UI Semibold" w:cs="Segoe UI Semibold"/>
                 <w:b/>
                 <w:bCs/>
-                <w:sz w:val="22"/>
-                <w:szCs w:val="22"/>
+                <w:sz w:val="18"/>
+                <w:szCs w:val="18"/>
                 <w:lang w:val="en-US" w:eastAsia="en-US"/>
               </w:rPr>
             </w:pPr>
@@ -1957,19 +1780,15 @@
         <w:tc>
           <w:tcPr>
             <w:tcW w:w="1637" w:type="dxa"/>
-            <w:tcBorders>
-              <w:top w:val="single" w:color="auto" w:sz="4" w:space="0"/>
-            </w:tcBorders>
           </w:tcPr>
           <w:p>
             <w:pPr>
-              <w:cnfStyle w:val="000000100000" w:firstRow="0" w:lastRow="0" w:firstColumn="0" w:lastColumn="0" w:oddVBand="0" w:evenVBand="0" w:oddHBand="1" w:evenHBand="0" w:firstRowFirstColumn="0" w:firstRowLastColumn="0" w:lastRowFirstColumn="0" w:lastRowLastColumn="0"/>
               <w:rPr>
                 <w:rFonts w:ascii="Segoe UI Semibold" w:hAnsi="Segoe UI Semibold" w:cs="Segoe UI Semibold"/>
                 <w:b/>
                 <w:bCs/>
-                <w:sz w:val="22"/>
-                <w:szCs w:val="22"/>
+                <w:sz w:val="18"/>
+                <w:szCs w:val="18"/>
                 <w:lang w:val="en-US" w:eastAsia="en-US"/>
               </w:rPr>
             </w:pPr>
@@ -1978,19 +1797,15 @@
         <w:tc>
           <w:tcPr>
             <w:tcW w:w="1782" w:type="dxa"/>
-            <w:tcBorders>
-              <w:top w:val="single" w:color="auto" w:sz="4" w:space="0"/>
-            </w:tcBorders>
           </w:tcPr>
           <w:p>
             <w:pPr>
-              <w:cnfStyle w:val="000000100000" w:firstRow="0" w:lastRow="0" w:firstColumn="0" w:lastColumn="0" w:oddVBand="0" w:evenVBand="0" w:oddHBand="1" w:evenHBand="0" w:firstRowFirstColumn="0" w:firstRowLastColumn="0" w:lastRowFirstColumn="0" w:lastRowLastColumn="0"/>
               <w:rPr>
                 <w:rFonts w:ascii="Segoe UI Semibold" w:hAnsi="Segoe UI Semibold" w:cs="Segoe UI Semibold"/>
                 <w:b/>
                 <w:bCs/>
-                <w:sz w:val="22"/>
-                <w:szCs w:val="22"/>
+                <w:sz w:val="18"/>
+                <w:szCs w:val="18"/>
                 <w:lang w:val="en-US" w:eastAsia="en-US"/>
               </w:rPr>
             </w:pPr>
@@ -1999,19 +1814,15 @@
         <w:tc>
           <w:tcPr>
             <w:tcW w:w="1903" w:type="dxa"/>
-            <w:tcBorders>
-              <w:top w:val="single" w:color="auto" w:sz="4" w:space="0"/>
-            </w:tcBorders>
           </w:tcPr>
           <w:p>
             <w:pPr>
-              <w:cnfStyle w:val="000000100000" w:firstRow="0" w:lastRow="0" w:firstColumn="0" w:lastColumn="0" w:oddVBand="0" w:evenVBand="0" w:oddHBand="1" w:evenHBand="0" w:firstRowFirstColumn="0" w:firstRowLastColumn="0" w:lastRowFirstColumn="0" w:lastRowLastColumn="0"/>
               <w:rPr>
                 <w:rFonts w:ascii="Segoe UI Semibold" w:hAnsi="Segoe UI Semibold" w:cs="Segoe UI Semibold"/>
                 <w:b/>
                 <w:bCs/>
-                <w:sz w:val="22"/>
-                <w:szCs w:val="22"/>
+                <w:sz w:val="18"/>
+                <w:szCs w:val="18"/>
                 <w:lang w:val="en-US" w:eastAsia="en-US"/>
               </w:rPr>
             </w:pPr>
@@ -2020,20 +1831,16 @@
         <w:tc>
           <w:tcPr>
             <w:tcW w:w="1768" w:type="dxa"/>
-            <w:tcBorders>
-              <w:top w:val="single" w:color="auto" w:sz="4" w:space="0"/>
-            </w:tcBorders>
           </w:tcPr>
           <w:p>
             <w:pPr>
               <w:jc w:val="right"/>
-              <w:cnfStyle w:val="000000100000" w:firstRow="0" w:lastRow="0" w:firstColumn="0" w:lastColumn="0" w:oddVBand="0" w:evenVBand="0" w:oddHBand="1" w:evenHBand="0" w:firstRowFirstColumn="0" w:firstRowLastColumn="0" w:lastRowFirstColumn="0" w:lastRowLastColumn="0"/>
               <w:rPr>
                 <w:rFonts w:ascii="Segoe UI Semibold" w:hAnsi="Segoe UI Semibold" w:cs="Segoe UI Semibold"/>
                 <w:b/>
                 <w:bCs/>
-                <w:sz w:val="22"/>
-                <w:szCs w:val="22"/>
+                <w:sz w:val="18"/>
+                <w:szCs w:val="18"/>
                 <w:lang w:val="en-US" w:eastAsia="en-US"/>
               </w:rPr>
             </w:pPr>
@@ -2042,20 +1849,16 @@
         <w:tc>
           <w:tcPr>
             <w:tcW w:w="1155" w:type="dxa"/>
-            <w:tcBorders>
-              <w:top w:val="single" w:color="auto" w:sz="4" w:space="0"/>
-            </w:tcBorders>
           </w:tcPr>
           <w:p>
             <w:pPr>
               <w:jc w:val="right"/>
-              <w:cnfStyle w:val="000000100000" w:firstRow="0" w:lastRow="0" w:firstColumn="0" w:lastColumn="0" w:oddVBand="0" w:evenVBand="0" w:oddHBand="1" w:evenHBand="0" w:firstRowFirstColumn="0" w:firstRowLastColumn="0" w:lastRowFirstColumn="0" w:lastRowLastColumn="0"/>
               <w:rPr>
                 <w:rFonts w:ascii="Segoe UI Semibold" w:hAnsi="Segoe UI Semibold" w:cs="Segoe UI Semibold"/>
                 <w:b/>
                 <w:bCs/>
-                <w:sz w:val="22"/>
-                <w:szCs w:val="22"/>
+                <w:sz w:val="18"/>
+                <w:szCs w:val="18"/>
                 <w:lang w:val="en-US" w:eastAsia="en-US"/>
               </w:rPr>
             </w:pPr>
@@ -2064,20 +1867,16 @@
         <w:tc>
           <w:tcPr>
             <w:tcW w:w="1867" w:type="dxa"/>
-            <w:tcBorders>
-              <w:top w:val="single" w:color="auto" w:sz="4" w:space="0"/>
-            </w:tcBorders>
           </w:tcPr>
           <w:p>
             <w:pPr>
               <w:jc w:val="right"/>
-              <w:cnfStyle w:val="000000100000" w:firstRow="0" w:lastRow="0" w:firstColumn="0" w:lastColumn="0" w:oddVBand="0" w:evenVBand="0" w:oddHBand="1" w:evenHBand="0" w:firstRowFirstColumn="0" w:firstRowLastColumn="0" w:lastRowFirstColumn="0" w:lastRowLastColumn="0"/>
               <w:rPr>
                 <w:rFonts w:ascii="Segoe UI Semibold" w:hAnsi="Segoe UI Semibold" w:cs="Segoe UI Semibold"/>
                 <w:b/>
                 <w:bCs/>
-                <w:sz w:val="22"/>
-                <w:szCs w:val="22"/>
+                <w:sz w:val="18"/>
+                <w:szCs w:val="18"/>
                 <w:lang w:val="en-US" w:eastAsia="en-US"/>
               </w:rPr>
             </w:pPr>
@@ -2087,13 +1886,11 @@
       <w:sdt>
         <w:sdtPr>
           <w:rPr>
-            <w:rFonts w:cs="Arial" w:asciiTheme="minorHAnsi" w:hAnsiTheme="minorHAnsi" w:eastAsiaTheme="minorEastAsia"/>
-            <w:bCs w:val="0"/>
-            <w:kern w:val="2"/>
-            <w:sz w:val="22"/>
-            <w:szCs w:val="22"/>
+            <w:rFonts w:cs="Arial"/>
+            <w:bCs/>
+            <w:sz w:val="18"/>
+            <w:szCs w:val="18"/>
             <w:lang w:val="en-US" w:eastAsia="en-US"/>
-            <w14:ligatures w14:val="standardContextual"/>
           </w:rPr>
           <w:alias w:val="Repeater: Line"/>
           <w:tag w:val="#BC:InsertRepeater,DataItems/Header/Line"/>
@@ -2106,6 +1903,7 @@
         <w:sdtEndPr>
           <w:rPr>
             <w:rFonts w:cstheme="minorBidi"/>
+            <w:bCs w:val="0"/>
             <w:lang w:val="en-DK" w:eastAsia="en-DK"/>
           </w:rPr>
         </w:sdtEndPr>
@@ -2118,13 +1916,11 @@
             <w:sdt>
               <w:sdtPr>
                 <w:rPr>
-                  <w:rFonts w:cs="Arial" w:asciiTheme="minorHAnsi" w:hAnsiTheme="minorHAnsi" w:eastAsiaTheme="minorEastAsia"/>
-                  <w:bCs w:val="0"/>
-                  <w:kern w:val="2"/>
-                  <w:sz w:val="22"/>
-                  <w:szCs w:val="22"/>
+                  <w:rFonts w:cs="Arial"/>
+                  <w:bCs/>
+                  <w:sz w:val="18"/>
+                  <w:szCs w:val="18"/>
                   <w:lang w:val="en-US" w:eastAsia="en-US"/>
-                  <w14:ligatures w14:val="standardContextual"/>
                 </w:rPr>
                 <w:alias w:val="ItemNo_Line"/>
                 <w:tag w:val="#BC:InsertDataItem,DataItems/Header/Line/ItemNo_Line"/>
@@ -2132,14 +1928,14 @@
                 <w:placeholder>
                   <w:docPart w:val="5CB3BA8ADDDA4E2DB43007BDDAAE04A2"/>
                 </w:placeholder>
-                <w:dataBinding w:prefixMappings="xmlns:ns0='urn:microsoft-dynamics-nav/reports/Standard_Sales_Credit_Memo/1307/'" w:xpath="/ns0:NavWordReportXmlPart[1]/ns0:Header[1]/ns0:Line[1]/ns0:ItemNo_Line[1]" w:storeItemID="{00000000-0000-0000-0000-000000000000}"/>
+                <w:dataBinding w:prefixMappings="xmlns:ns0='urn:microsoft-dynamics-nav/reports/Standard_Sales_Credit_Memo/1307/'" w:xpath="/ns0:NavWordReportXmlPart[1]/ns0:Header[1]/ns0:Line[1]/ns0:ItemNo_Line[1]" w:storeItemID="{2C0E3694-AC57-46EE-8053-99B806001417}"/>
                 <w15:color w:val="808080"/>
                 <w:text/>
               </w:sdtPr>
               <w:sdtEndPr>
                 <w:rPr>
-                  <w:rFonts w:ascii="Segoe UI" w:hAnsi="Segoe UI" w:eastAsia="Aptos"/>
-                  <w:bCs/>
+                  <w:rFonts w:ascii="Segoe UI" w:eastAsia="Aptos" w:hAnsi="Segoe UI"/>
+                  <w:bCs w:val="0"/>
                   <w:kern w:val="0"/>
                   <w14:ligatures w14:val="none"/>
                 </w:rPr>
@@ -2147,25 +1943,23 @@
               <w:sdtContent>
                 <w:tc>
                   <w:tcPr>
-                    <w:cnfStyle w:val="001000000000" w:firstRow="0" w:lastRow="0" w:firstColumn="1" w:lastColumn="0" w:oddVBand="0" w:evenVBand="0" w:oddHBand="0" w:evenHBand="0" w:firstRowFirstColumn="0" w:firstRowLastColumn="0" w:lastRowFirstColumn="0" w:lastRowLastColumn="0"/>
                     <w:tcW w:w="1197" w:type="dxa"/>
-                    <w:vAlign w:val="center"/>
                   </w:tcPr>
                   <w:p>
                     <w:pPr>
                       <w:rPr>
-                        <w:rFonts w:cs="Arial" w:asciiTheme="minorHAnsi" w:hAnsiTheme="minorHAnsi"/>
-                        <w:sz w:val="22"/>
-                        <w:szCs w:val="22"/>
+                        <w:rFonts w:cs="Arial"/>
+                        <w:sz w:val="18"/>
+                        <w:szCs w:val="18"/>
                         <w:lang w:val="en-US" w:eastAsia="en-US"/>
                       </w:rPr>
                     </w:pPr>
                     <w:proofErr w:type="spellStart"/>
                     <w:r>
                       <w:rPr>
-                        <w:rFonts w:cs="Arial" w:asciiTheme="minorHAnsi" w:hAnsiTheme="minorHAnsi"/>
-                        <w:sz w:val="22"/>
-                        <w:szCs w:val="22"/>
+                        <w:rFonts w:cs="Arial"/>
+                        <w:sz w:val="18"/>
+                        <w:szCs w:val="18"/>
                         <w:lang w:val="en-US" w:eastAsia="en-US"/>
                       </w:rPr>
                       <w:t>ItemNo_Line</w:t>
@@ -2179,8 +1973,8 @@
               <w:sdtPr>
                 <w:rPr>
                   <w:rFonts w:cs="Arial"/>
-                  <w:sz w:val="22"/>
-                  <w:szCs w:val="22"/>
+                  <w:sz w:val="18"/>
+                  <w:szCs w:val="18"/>
                   <w:lang w:eastAsia="en-US"/>
                 </w:rPr>
                 <w:alias w:val="Description_Line"/>
@@ -2189,33 +1983,30 @@
                 <w:placeholder>
                   <w:docPart w:val="5D54D03E440C42E88B679969F708ADA1"/>
                 </w:placeholder>
-                <w:dataBinding w:prefixMappings="xmlns:ns0='urn:microsoft-dynamics-nav/reports/Standard_Sales_Credit_Memo/1307/'" w:xpath="/ns0:NavWordReportXmlPart[1]/ns0:Header[1]/ns0:Line[1]/ns0:Description_Line[1]" w:storeItemID="{00000000-0000-0000-0000-000000000000}"/>
+                <w:dataBinding w:prefixMappings="xmlns:ns0='urn:microsoft-dynamics-nav/reports/Standard_Sales_Credit_Memo/1307/'" w:xpath="/ns0:NavWordReportXmlPart[1]/ns0:Header[1]/ns0:Line[1]/ns0:Description_Line[1]" w:storeItemID="{2C0E3694-AC57-46EE-8053-99B806001417}"/>
                 <w15:color w:val="808080"/>
                 <w:text/>
               </w:sdtPr>
-              <w:sdtEndPr/>
               <w:sdtContent>
                 <w:tc>
                   <w:tcPr>
                     <w:tcW w:w="2763" w:type="dxa"/>
-                    <w:vAlign w:val="center"/>
                   </w:tcPr>
                   <w:p>
                     <w:pPr>
-                      <w:cnfStyle w:val="000000010000" w:firstRow="0" w:lastRow="0" w:firstColumn="0" w:lastColumn="0" w:oddVBand="0" w:evenVBand="0" w:oddHBand="0" w:evenHBand="1" w:firstRowFirstColumn="0" w:firstRowLastColumn="0" w:lastRowFirstColumn="0" w:lastRowLastColumn="0"/>
                       <w:rPr>
-                        <w:rFonts w:cs="Arial" w:asciiTheme="minorHAnsi" w:hAnsiTheme="minorHAnsi"/>
-                        <w:sz w:val="22"/>
-                        <w:szCs w:val="22"/>
+                        <w:rFonts w:cs="Arial"/>
+                        <w:sz w:val="18"/>
+                        <w:szCs w:val="18"/>
                         <w:lang w:eastAsia="en-US"/>
                       </w:rPr>
                     </w:pPr>
                     <w:proofErr w:type="spellStart"/>
                     <w:r>
                       <w:rPr>
-                        <w:rFonts w:cs="Arial" w:asciiTheme="minorHAnsi" w:hAnsiTheme="minorHAnsi"/>
-                        <w:sz w:val="22"/>
-                        <w:szCs w:val="22"/>
+                        <w:rFonts w:cs="Arial"/>
+                        <w:sz w:val="18"/>
+                        <w:szCs w:val="18"/>
                         <w:lang w:eastAsia="en-US"/>
                       </w:rPr>
                       <w:t>Description_Line</w:t>
@@ -2229,8 +2020,8 @@
               <w:sdtPr>
                 <w:rPr>
                   <w:rFonts w:cs="Arial"/>
-                  <w:sz w:val="22"/>
-                  <w:szCs w:val="22"/>
+                  <w:sz w:val="18"/>
+                  <w:szCs w:val="18"/>
                   <w:lang w:val="en-US" w:eastAsia="en-US"/>
                 </w:rPr>
                 <w:alias w:val="ShipmentDate_Line"/>
@@ -2239,33 +2030,30 @@
                 <w:placeholder>
                   <w:docPart w:val="DefaultPlaceholder_-1854013440"/>
                 </w:placeholder>
+                <w:dataBinding w:prefixMappings="xmlns:ns0='urn:microsoft-dynamics-nav/reports/Standard_Sales_Credit_Memo/1307/'" w:xpath="/ns0:NavWordReportXmlPart[1]/ns0:Header[1]/ns0:Line[1]/ns0:ShipmentDate_Line[1]" w:storeItemID="{2C0E3694-AC57-46EE-8053-99B806001417}"/>
                 <w15:color w:val="808080"/>
                 <w:text/>
-                <w:dataBinding w:prefixMappings="xmlns:ns0='urn:microsoft-dynamics-nav/reports/Standard_Sales_Credit_Memo/1307/'" w:xpath="/ns0:NavWordReportXmlPart[1]/ns0:Header[1]/ns0:Line[1]/ns0:ShipmentDate_Line[1]"/>
               </w:sdtPr>
-              <w:sdtEndPr/>
               <w:sdtContent>
                 <w:tc>
                   <w:tcPr>
                     <w:tcW w:w="1350" w:type="dxa"/>
-                    <w:vAlign w:val="center"/>
                   </w:tcPr>
                   <w:p>
                     <w:pPr>
-                      <w:cnfStyle w:val="000000010000" w:firstRow="0" w:lastRow="0" w:firstColumn="0" w:lastColumn="0" w:oddVBand="0" w:evenVBand="0" w:oddHBand="0" w:evenHBand="1" w:firstRowFirstColumn="0" w:firstRowLastColumn="0" w:lastRowFirstColumn="0" w:lastRowLastColumn="0"/>
                       <w:rPr>
                         <w:rFonts w:cs="Arial"/>
-                        <w:sz w:val="22"/>
-                        <w:szCs w:val="22"/>
+                        <w:sz w:val="18"/>
+                        <w:szCs w:val="18"/>
                         <w:lang w:val="en-US" w:eastAsia="en-US"/>
                       </w:rPr>
                     </w:pPr>
                     <w:proofErr w:type="spellStart"/>
                     <w:r>
                       <w:rPr>
-                        <w:rFonts w:cs="Arial" w:asciiTheme="minorHAnsi" w:hAnsiTheme="minorHAnsi"/>
-                        <w:sz w:val="22"/>
-                        <w:szCs w:val="22"/>
+                        <w:rFonts w:cs="Arial"/>
+                        <w:sz w:val="18"/>
+                        <w:szCs w:val="18"/>
                         <w:lang w:val="en-US" w:eastAsia="en-US"/>
                       </w:rPr>
                       <w:t>ShipmentDate_Line</w:t>
@@ -2279,8 +2067,8 @@
               <w:sdtPr>
                 <w:rPr>
                   <w:rFonts w:cs="Arial"/>
-                  <w:sz w:val="22"/>
-                  <w:szCs w:val="22"/>
+                  <w:sz w:val="18"/>
+                  <w:szCs w:val="18"/>
                   <w:lang w:val="en-US" w:eastAsia="en-US"/>
                 </w:rPr>
                 <w:alias w:val="Quantity_Line"/>
@@ -2289,34 +2077,31 @@
                 <w:placeholder>
                   <w:docPart w:val="7CD475D66B4A42DA93C44085D6DE056D"/>
                 </w:placeholder>
-                <w:dataBinding w:prefixMappings="xmlns:ns0='urn:microsoft-dynamics-nav/reports/Standard_Sales_Credit_Memo/1307/'" w:xpath="/ns0:NavWordReportXmlPart[1]/ns0:Header[1]/ns0:Line[1]/ns0:Quantity_Line[1]" w:storeItemID="{00000000-0000-0000-0000-000000000000}"/>
+                <w:dataBinding w:prefixMappings="xmlns:ns0='urn:microsoft-dynamics-nav/reports/Standard_Sales_Credit_Memo/1307/'" w:xpath="/ns0:NavWordReportXmlPart[1]/ns0:Header[1]/ns0:Line[1]/ns0:Quantity_Line[1]" w:storeItemID="{2C0E3694-AC57-46EE-8053-99B806001417}"/>
                 <w15:color w:val="808080"/>
                 <w:text/>
               </w:sdtPr>
-              <w:sdtEndPr/>
               <w:sdtContent>
                 <w:tc>
                   <w:tcPr>
                     <w:tcW w:w="1637" w:type="dxa"/>
-                    <w:vAlign w:val="center"/>
                   </w:tcPr>
                   <w:p>
                     <w:pPr>
                       <w:jc w:val="right"/>
-                      <w:cnfStyle w:val="000000010000" w:firstRow="0" w:lastRow="0" w:firstColumn="0" w:lastColumn="0" w:oddVBand="0" w:evenVBand="0" w:oddHBand="0" w:evenHBand="1" w:firstRowFirstColumn="0" w:firstRowLastColumn="0" w:lastRowFirstColumn="0" w:lastRowLastColumn="0"/>
                       <w:rPr>
-                        <w:rFonts w:cs="Arial" w:asciiTheme="minorHAnsi" w:hAnsiTheme="minorHAnsi"/>
-                        <w:sz w:val="22"/>
-                        <w:szCs w:val="22"/>
+                        <w:rFonts w:cs="Arial"/>
+                        <w:sz w:val="18"/>
+                        <w:szCs w:val="18"/>
                         <w:lang w:val="en-US" w:eastAsia="en-US"/>
                       </w:rPr>
                     </w:pPr>
                     <w:proofErr w:type="spellStart"/>
                     <w:r>
                       <w:rPr>
-                        <w:rFonts w:cs="Arial" w:asciiTheme="minorHAnsi" w:hAnsiTheme="minorHAnsi"/>
-                        <w:sz w:val="22"/>
-                        <w:szCs w:val="22"/>
+                        <w:rFonts w:cs="Arial"/>
+                        <w:sz w:val="18"/>
+                        <w:szCs w:val="18"/>
                         <w:lang w:val="en-US" w:eastAsia="en-US"/>
                       </w:rPr>
                       <w:t>Quantity_Line</w:t>
@@ -2329,8 +2114,8 @@
             <w:sdt>
               <w:sdtPr>
                 <w:rPr>
-                  <w:sz w:val="22"/>
-                  <w:szCs w:val="22"/>
+                  <w:sz w:val="18"/>
+                  <w:szCs w:val="18"/>
                 </w:rPr>
                 <w:alias w:val="UnitOfMeasure"/>
                 <w:tag w:val="#BC:InsertDataItem,DataItems/Header/Line/UnitOfMeasure"/>
@@ -2338,32 +2123,27 @@
                 <w:placeholder>
                   <w:docPart w:val="BE5E07E362634C03B29ED51D24C55954"/>
                 </w:placeholder>
+                <w:dataBinding w:prefixMappings="xmlns:ns0='urn:microsoft-dynamics-nav/reports/Standard_Sales_Credit_Memo/1307/'" w:xpath="/ns0:NavWordReportXmlPart[1]/ns0:Header[1]/ns0:Line[1]/ns0:UnitOfMeasure[1]" w:storeItemID="{2C0E3694-AC57-46EE-8053-99B806001417}"/>
                 <w15:color w:val="808080"/>
                 <w:text/>
-                <w:dataBinding w:prefixMappings="xmlns:ns0='urn:microsoft-dynamics-nav/reports/Standard_Sales_Credit_Memo/1307/'" w:xpath="/ns0:NavWordReportXmlPart[1]/ns0:Header[1]/ns0:Line[1]/ns0:UnitOfMeasure[1]"/>
               </w:sdtPr>
-              <w:sdtEndPr/>
               <w:sdtContent>
                 <w:tc>
                   <w:tcPr>
                     <w:tcW w:w="1782" w:type="dxa"/>
-                    <w:vAlign w:val="center"/>
                   </w:tcPr>
                   <w:p>
                     <w:pPr>
-                      <w:cnfStyle w:val="000000010000" w:firstRow="0" w:lastRow="0" w:firstColumn="0" w:lastColumn="0" w:oddVBand="0" w:evenVBand="0" w:oddHBand="0" w:evenHBand="1" w:firstRowFirstColumn="0" w:firstRowLastColumn="0" w:lastRowFirstColumn="0" w:lastRowLastColumn="0"/>
                       <w:rPr>
-                        <w:rFonts w:asciiTheme="minorHAnsi" w:hAnsiTheme="minorHAnsi"/>
-                        <w:sz w:val="22"/>
-                        <w:szCs w:val="22"/>
+                        <w:sz w:val="18"/>
+                        <w:szCs w:val="18"/>
                       </w:rPr>
                     </w:pPr>
                     <w:proofErr w:type="spellStart"/>
                     <w:r>
                       <w:rPr>
-                        <w:rFonts w:asciiTheme="minorHAnsi" w:hAnsiTheme="minorHAnsi"/>
-                        <w:sz w:val="22"/>
-                        <w:szCs w:val="22"/>
+                        <w:sz w:val="18"/>
+                        <w:szCs w:val="18"/>
                       </w:rPr>
                       <w:t>UnitOfMeasure</w:t>
                     </w:r>
@@ -2375,23 +2155,21 @@
             <w:tc>
               <w:tcPr>
                 <w:tcW w:w="1903" w:type="dxa"/>
-                <w:vAlign w:val="center"/>
               </w:tcPr>
               <w:p>
                 <w:pPr>
-                  <w:cnfStyle w:val="000000010000" w:firstRow="0" w:lastRow="0" w:firstColumn="0" w:lastColumn="0" w:oddVBand="0" w:evenVBand="0" w:oddHBand="0" w:evenHBand="1" w:firstRowFirstColumn="0" w:firstRowLastColumn="0" w:lastRowFirstColumn="0" w:lastRowLastColumn="0"/>
-                  <w:rPr>
-                    <w:rFonts w:cs="Arial" w:asciiTheme="minorHAnsi" w:hAnsiTheme="minorHAnsi"/>
-                    <w:sz w:val="22"/>
-                    <w:szCs w:val="22"/>
+                  <w:rPr>
+                    <w:rFonts w:cs="Arial"/>
+                    <w:sz w:val="18"/>
+                    <w:szCs w:val="18"/>
                     <w:lang w:val="en-US" w:eastAsia="en-US"/>
                   </w:rPr>
                 </w:pPr>
                 <w:sdt>
                   <w:sdtPr>
                     <w:rPr>
-                      <w:sz w:val="22"/>
-                      <w:szCs w:val="22"/>
+                      <w:sz w:val="18"/>
+                      <w:szCs w:val="18"/>
                     </w:rPr>
                     <w:alias w:val="UnitPrice"/>
                     <w:tag w:val="#BC:InsertDataItem,DataItems/Header/Line/UnitPrice"/>
@@ -2399,18 +2177,16 @@
                     <w:placeholder>
                       <w:docPart w:val="34F75785EEB8408FA7DE0C79AF48DE2E"/>
                     </w:placeholder>
-                    <w:dataBinding w:prefixMappings="xmlns:ns0='urn:microsoft-dynamics-nav/reports/Standard_Sales_Credit_Memo/1307/'" w:xpath="/ns0:NavWordReportXmlPart[1]/ns0:Header[1]/ns0:Line[1]/ns0:UnitPrice[1]" w:storeItemID="{00000000-0000-0000-0000-000000000000}"/>
+                    <w:dataBinding w:prefixMappings="xmlns:ns0='urn:microsoft-dynamics-nav/reports/Standard_Sales_Credit_Memo/1307/'" w:xpath="/ns0:NavWordReportXmlPart[1]/ns0:Header[1]/ns0:Line[1]/ns0:UnitPrice[1]" w:storeItemID="{2C0E3694-AC57-46EE-8053-99B806001417}"/>
                     <w15:color w:val="808080"/>
                     <w:text/>
                   </w:sdtPr>
-                  <w:sdtEndPr/>
                   <w:sdtContent>
                     <w:proofErr w:type="spellStart"/>
                     <w:r>
                       <w:rPr>
-                        <w:rFonts w:asciiTheme="minorHAnsi" w:hAnsiTheme="minorHAnsi"/>
-                        <w:sz w:val="22"/>
-                        <w:szCs w:val="22"/>
+                        <w:sz w:val="18"/>
+                        <w:szCs w:val="18"/>
                       </w:rPr>
                       <w:t>UnitPrice</w:t>
                     </w:r>
@@ -2422,8 +2198,8 @@
             <w:sdt>
               <w:sdtPr>
                 <w:rPr>
-                  <w:sz w:val="22"/>
-                  <w:szCs w:val="22"/>
+                  <w:sz w:val="18"/>
+                  <w:szCs w:val="18"/>
                 </w:rPr>
                 <w:alias w:val="LineDiscountPercentText_Line"/>
                 <w:tag w:val="#BC:InsertDataItem,DataItems/Header/Line/LineDiscountPercentText_Line"/>
@@ -2431,32 +2207,27 @@
                 <w:placeholder>
                   <w:docPart w:val="10B4899AE357408E818DCAF2B6DD0BB7"/>
                 </w:placeholder>
+                <w:dataBinding w:prefixMappings="xmlns:ns0='urn:microsoft-dynamics-nav/reports/Standard_Sales_Credit_Memo/1307/'" w:xpath="/ns0:NavWordReportXmlPart[1]/ns0:Header[1]/ns0:Line[1]/ns0:LineDiscountPercentText_Line[1]" w:storeItemID="{2C0E3694-AC57-46EE-8053-99B806001417}"/>
                 <w15:color w:val="808080"/>
                 <w:text/>
-                <w:dataBinding w:prefixMappings="xmlns:ns0='urn:microsoft-dynamics-nav/reports/Standard_Sales_Credit_Memo/1307/'" w:xpath="/ns0:NavWordReportXmlPart[1]/ns0:Header[1]/ns0:Line[1]/ns0:LineDiscountPercentText_Line[1]"/>
               </w:sdtPr>
-              <w:sdtEndPr/>
               <w:sdtContent>
                 <w:tc>
                   <w:tcPr>
                     <w:tcW w:w="1768" w:type="dxa"/>
-                    <w:vAlign w:val="center"/>
                   </w:tcPr>
                   <w:p>
                     <w:pPr>
-                      <w:cnfStyle w:val="000000010000" w:firstRow="0" w:lastRow="0" w:firstColumn="0" w:lastColumn="0" w:oddVBand="0" w:evenVBand="0" w:oddHBand="0" w:evenHBand="1" w:firstRowFirstColumn="0" w:firstRowLastColumn="0" w:lastRowFirstColumn="0" w:lastRowLastColumn="0"/>
                       <w:rPr>
-                        <w:rFonts w:asciiTheme="minorHAnsi" w:hAnsiTheme="minorHAnsi"/>
-                        <w:sz w:val="22"/>
-                        <w:szCs w:val="22"/>
+                        <w:sz w:val="18"/>
+                        <w:szCs w:val="18"/>
                       </w:rPr>
                     </w:pPr>
                     <w:proofErr w:type="spellStart"/>
                     <w:r>
                       <w:rPr>
-                        <w:rFonts w:asciiTheme="minorHAnsi" w:hAnsiTheme="minorHAnsi"/>
-                        <w:sz w:val="22"/>
-                        <w:szCs w:val="22"/>
+                        <w:sz w:val="18"/>
+                        <w:szCs w:val="18"/>
                       </w:rPr>
                       <w:t>LineDiscountPercentText_Line</w:t>
                     </w:r>
@@ -2468,8 +2239,8 @@
             <w:sdt>
               <w:sdtPr>
                 <w:rPr>
-                  <w:sz w:val="22"/>
-                  <w:szCs w:val="22"/>
+                  <w:sz w:val="18"/>
+                  <w:szCs w:val="18"/>
                 </w:rPr>
                 <w:alias w:val="VATPct_Line"/>
                 <w:tag w:val="#BC:InsertDataItem,DataItems/Header/Line/VATPct_Line"/>
@@ -2477,32 +2248,27 @@
                 <w:placeholder>
                   <w:docPart w:val="63A635E5E8D9421ABEDE368ED10ABCF4"/>
                 </w:placeholder>
+                <w:dataBinding w:prefixMappings="xmlns:ns0='urn:microsoft-dynamics-nav/reports/Standard_Sales_Credit_Memo/1307/'" w:xpath="/ns0:NavWordReportXmlPart[1]/ns0:Header[1]/ns0:Line[1]/ns0:VATPct_Line[1]" w:storeItemID="{2C0E3694-AC57-46EE-8053-99B806001417}"/>
                 <w15:color w:val="808080"/>
                 <w:text/>
-                <w:dataBinding w:prefixMappings="xmlns:ns0='urn:microsoft-dynamics-nav/reports/Standard_Sales_Credit_Memo/1307/'" w:xpath="/ns0:NavWordReportXmlPart[1]/ns0:Header[1]/ns0:Line[1]/ns0:VATPct_Line[1]"/>
               </w:sdtPr>
-              <w:sdtEndPr/>
               <w:sdtContent>
                 <w:tc>
                   <w:tcPr>
                     <w:tcW w:w="1155" w:type="dxa"/>
-                    <w:vAlign w:val="center"/>
                   </w:tcPr>
                   <w:p>
                     <w:pPr>
-                      <w:cnfStyle w:val="000000010000" w:firstRow="0" w:lastRow="0" w:firstColumn="0" w:lastColumn="0" w:oddVBand="0" w:evenVBand="0" w:oddHBand="0" w:evenHBand="1" w:firstRowFirstColumn="0" w:firstRowLastColumn="0" w:lastRowFirstColumn="0" w:lastRowLastColumn="0"/>
                       <w:rPr>
-                        <w:rFonts w:asciiTheme="minorHAnsi" w:hAnsiTheme="minorHAnsi"/>
-                        <w:sz w:val="22"/>
-                        <w:szCs w:val="22"/>
+                        <w:sz w:val="18"/>
+                        <w:szCs w:val="18"/>
                       </w:rPr>
                     </w:pPr>
                     <w:proofErr w:type="spellStart"/>
                     <w:r>
                       <w:rPr>
-                        <w:rFonts w:asciiTheme="minorHAnsi" w:hAnsiTheme="minorHAnsi"/>
-                        <w:sz w:val="22"/>
-                        <w:szCs w:val="22"/>
+                        <w:sz w:val="18"/>
+                        <w:szCs w:val="18"/>
                       </w:rPr>
                       <w:t>VATPct_Line</w:t>
                     </w:r>
@@ -2514,24 +2280,22 @@
             <w:tc>
               <w:tcPr>
                 <w:tcW w:w="1867" w:type="dxa"/>
-                <w:vAlign w:val="center"/>
               </w:tcPr>
               <w:p>
                 <w:pPr>
                   <w:jc w:val="right"/>
-                  <w:cnfStyle w:val="000000010000" w:firstRow="0" w:lastRow="0" w:firstColumn="0" w:lastColumn="0" w:oddVBand="0" w:evenVBand="0" w:oddHBand="0" w:evenHBand="1" w:firstRowFirstColumn="0" w:firstRowLastColumn="0" w:lastRowFirstColumn="0" w:lastRowLastColumn="0"/>
-                  <w:rPr>
-                    <w:rFonts w:cs="Arial" w:asciiTheme="minorHAnsi" w:hAnsiTheme="minorHAnsi"/>
-                    <w:sz w:val="22"/>
-                    <w:szCs w:val="22"/>
+                  <w:rPr>
+                    <w:rFonts w:cs="Arial"/>
+                    <w:sz w:val="18"/>
+                    <w:szCs w:val="18"/>
                     <w:lang w:val="en-US" w:eastAsia="en-US"/>
                   </w:rPr>
                 </w:pPr>
                 <w:sdt>
                   <w:sdtPr>
                     <w:rPr>
-                      <w:sz w:val="22"/>
-                      <w:szCs w:val="22"/>
+                      <w:sz w:val="18"/>
+                      <w:szCs w:val="18"/>
                     </w:rPr>
                     <w:alias w:val="LineAmount_Line"/>
                     <w:tag w:val="#BC:InsertDataItem,DataItems/Header/Line/LineAmount_Line"/>
@@ -2539,18 +2303,16 @@
                     <w:placeholder>
                       <w:docPart w:val="1E45BFDFBAE5457D8B0B3BE34A65B46A"/>
                     </w:placeholder>
-                    <w:dataBinding w:prefixMappings="xmlns:ns0='urn:microsoft-dynamics-nav/reports/Standard_Sales_Credit_Memo/1307/'" w:xpath="/ns0:NavWordReportXmlPart[1]/ns0:Header[1]/ns0:Line[1]/ns0:LineAmount_Line[1]" w:storeItemID="{00000000-0000-0000-0000-000000000000}"/>
+                    <w:dataBinding w:prefixMappings="xmlns:ns0='urn:microsoft-dynamics-nav/reports/Standard_Sales_Credit_Memo/1307/'" w:xpath="/ns0:NavWordReportXmlPart[1]/ns0:Header[1]/ns0:Line[1]/ns0:LineAmount_Line[1]" w:storeItemID="{2C0E3694-AC57-46EE-8053-99B806001417}"/>
                     <w15:color w:val="808080"/>
                     <w:text/>
                   </w:sdtPr>
-                  <w:sdtEndPr/>
                   <w:sdtContent>
                     <w:proofErr w:type="spellStart"/>
                     <w:r>
                       <w:rPr>
-                        <w:rFonts w:asciiTheme="minorHAnsi" w:hAnsiTheme="minorHAnsi"/>
-                        <w:sz w:val="22"/>
-                        <w:szCs w:val="22"/>
+                        <w:sz w:val="18"/>
+                        <w:szCs w:val="18"/>
                       </w:rPr>
                       <w:t>LineAmount_Line</w:t>
                     </w:r>
@@ -2559,9 +2321,8 @@
                 </w:sdt>
                 <w:r>
                   <w:rPr>
-                    <w:rFonts w:asciiTheme="minorHAnsi" w:hAnsiTheme="minorHAnsi"/>
-                    <w:sz w:val="22"/>
-                    <w:szCs w:val="22"/>
+                    <w:sz w:val="18"/>
+                    <w:szCs w:val="18"/>
                   </w:rPr>
                   <w:t> </w:t>
                 </w:r>
@@ -2571,20 +2332,27 @@
         </w:sdtContent>
       </w:sdt>
     </w:tbl>
-    <w:p/>
+    <w:p>
+      <w:pPr>
+        <w:rPr>
+          <w:sz w:val="18"/>
+          <w:szCs w:val="18"/>
+        </w:rPr>
+      </w:pPr>
+    </w:p>
     <w:tbl>
       <w:tblPr>
-        <w:tblStyle w:val="CLSequoiatablestyle021"/>
-        <w:tblW w:w="15422" w:type="dxa"/>
+        <w:tblStyle w:val="BCTotalsTable"/>
+        <w:tblW w:w="10498" w:type="dxa"/>
         <w:tblLook w:val="06C0" w:firstRow="0" w:lastRow="1" w:firstColumn="1" w:lastColumn="0" w:noHBand="1" w:noVBand="1"/>
         <w:tblCaption w:val="Regular Totals Block"/>
       </w:tblPr>
       <w:tblGrid>
-        <w:gridCol w:w="7341"/>
-        <w:gridCol w:w="1411"/>
-        <w:gridCol w:w="625"/>
-        <w:gridCol w:w="630"/>
-        <w:gridCol w:w="5415"/>
+        <w:gridCol w:w="4998"/>
+        <w:gridCol w:w="960"/>
+        <w:gridCol w:w="425"/>
+        <w:gridCol w:w="429"/>
+        <w:gridCol w:w="3686"/>
       </w:tblGrid>
       <w:tr>
         <w:trPr>
@@ -2594,8 +2362,8 @@
           <w:sdtPr>
             <w:rPr>
               <w:rFonts w:eastAsia="Times New Roman"/>
-              <w:sz w:val="22"/>
-              <w:szCs w:val="22"/>
+              <w:sz w:val="18"/>
+              <w:szCs w:val="18"/>
             </w:rPr>
             <w:alias w:val="Description_ReportTotalsLine"/>
             <w:tag w:val="#BC:InsertDataItem,DataItems/Header/ReportTotalsLine/Description_ReportTotalsLine"/>
@@ -2603,33 +2371,30 @@
             <w:placeholder>
               <w:docPart w:val="ADA0B6552E0F4EC894C803D1F79B3617"/>
             </w:placeholder>
+            <w:dataBinding w:prefixMappings="xmlns:ns0='urn:microsoft-dynamics-nav/reports/Standard_Sales_Credit_Memo/1307/'" w:xpath="/ns0:NavWordReportXmlPart[1]/ns0:Header[1]/ns0:ReportTotalsLine[1]/ns0:Description_ReportTotalsLine[1]" w:storeItemID="{2C0E3694-AC57-46EE-8053-99B806001417}"/>
             <w15:color w:val="808080"/>
             <w:text/>
-            <w:dataBinding w:prefixMappings="xmlns:ns0='urn:microsoft-dynamics-nav/reports/Standard_Sales_Credit_Memo/1307/'" w:xpath="/ns0:NavWordReportXmlPart[1]/ns0:Header[1]/ns0:ReportTotalsLine[1]/ns0:Description_ReportTotalsLine[1]"/>
           </w:sdtPr>
-          <w:sdtEndPr/>
           <w:sdtContent>
             <w:tc>
               <w:tcPr>
-                <w:cnfStyle w:val="001000000000" w:firstRow="0" w:lastRow="0" w:firstColumn="1" w:lastColumn="0" w:oddVBand="0" w:evenVBand="0" w:oddHBand="0" w:evenHBand="0" w:firstRowFirstColumn="0" w:firstRowLastColumn="0" w:lastRowFirstColumn="0" w:lastRowLastColumn="0"/>
                 <w:tcW w:w="4995" w:type="dxa"/>
-                <w:vAlign w:val="center"/>
               </w:tcPr>
               <w:p>
                 <w:pPr>
                   <w:spacing w:before="120" w:after="120" w:line="240" w:lineRule="exact"/>
                   <w:rPr>
-                    <w:rFonts w:eastAsia="Times New Roman" w:asciiTheme="minorHAnsi" w:hAnsiTheme="minorHAnsi"/>
-                    <w:sz w:val="22"/>
-                    <w:szCs w:val="22"/>
+                    <w:rFonts w:eastAsia="Times New Roman"/>
+                    <w:sz w:val="18"/>
+                    <w:szCs w:val="18"/>
                   </w:rPr>
                 </w:pPr>
                 <w:proofErr w:type="spellStart"/>
                 <w:r>
                   <w:rPr>
-                    <w:rFonts w:eastAsia="Times New Roman" w:asciiTheme="minorHAnsi" w:hAnsiTheme="minorHAnsi"/>
-                    <w:sz w:val="22"/>
-                    <w:szCs w:val="22"/>
+                    <w:rFonts w:eastAsia="Times New Roman"/>
+                    <w:sz w:val="18"/>
+                    <w:szCs w:val="18"/>
                   </w:rPr>
                   <w:t>Description_ReportTotalsLine</w:t>
                 </w:r>
@@ -2641,16 +2406,14 @@
         <w:tc>
           <w:tcPr>
             <w:tcW w:w="960" w:type="dxa"/>
-            <w:vAlign w:val="center"/>
           </w:tcPr>
           <w:p>
             <w:pPr>
               <w:spacing w:before="120" w:after="120" w:line="240" w:lineRule="exact"/>
-              <w:cnfStyle w:val="000000000000" w:firstRow="0" w:lastRow="0" w:firstColumn="0" w:lastColumn="0" w:oddVBand="0" w:evenVBand="0" w:oddHBand="0" w:evenHBand="0" w:firstRowFirstColumn="0" w:firstRowLastColumn="0" w:lastRowFirstColumn="0" w:lastRowLastColumn="0"/>
               <w:rPr>
-                <w:rFonts w:cs="Arial" w:asciiTheme="minorHAnsi" w:hAnsiTheme="minorHAnsi"/>
-                <w:sz w:val="22"/>
-                <w:szCs w:val="22"/>
+                <w:rFonts w:cs="Arial"/>
+                <w:sz w:val="18"/>
+                <w:szCs w:val="18"/>
                 <w:lang w:eastAsia="en-US"/>
               </w:rPr>
             </w:pPr>
@@ -2659,16 +2422,14 @@
         <w:tc>
           <w:tcPr>
             <w:tcW w:w="425" w:type="dxa"/>
-            <w:vAlign w:val="center"/>
           </w:tcPr>
           <w:p>
             <w:pPr>
               <w:spacing w:before="120" w:after="120" w:line="240" w:lineRule="exact"/>
-              <w:cnfStyle w:val="000000000000" w:firstRow="0" w:lastRow="0" w:firstColumn="0" w:lastColumn="0" w:oddVBand="0" w:evenVBand="0" w:oddHBand="0" w:evenHBand="0" w:firstRowFirstColumn="0" w:firstRowLastColumn="0" w:lastRowFirstColumn="0" w:lastRowLastColumn="0"/>
               <w:rPr>
-                <w:rFonts w:cs="Arial" w:asciiTheme="minorHAnsi" w:hAnsiTheme="minorHAnsi"/>
-                <w:sz w:val="22"/>
-                <w:szCs w:val="22"/>
+                <w:rFonts w:cs="Arial"/>
+                <w:sz w:val="18"/>
+                <w:szCs w:val="18"/>
                 <w:lang w:val="en-US" w:eastAsia="en-US"/>
               </w:rPr>
             </w:pPr>
@@ -2677,16 +2438,14 @@
         <w:tc>
           <w:tcPr>
             <w:tcW w:w="429" w:type="dxa"/>
-            <w:vAlign w:val="center"/>
           </w:tcPr>
           <w:p>
             <w:pPr>
               <w:spacing w:before="120" w:after="120" w:line="240" w:lineRule="exact"/>
-              <w:cnfStyle w:val="000000000000" w:firstRow="0" w:lastRow="0" w:firstColumn="0" w:lastColumn="0" w:oddVBand="0" w:evenVBand="0" w:oddHBand="0" w:evenHBand="0" w:firstRowFirstColumn="0" w:firstRowLastColumn="0" w:lastRowFirstColumn="0" w:lastRowLastColumn="0"/>
               <w:rPr>
-                <w:rFonts w:cs="Arial" w:asciiTheme="minorHAnsi" w:hAnsiTheme="minorHAnsi"/>
-                <w:sz w:val="22"/>
-                <w:szCs w:val="22"/>
+                <w:rFonts w:cs="Arial"/>
+                <w:sz w:val="18"/>
+                <w:szCs w:val="18"/>
                 <w:lang w:eastAsia="en-US"/>
               </w:rPr>
             </w:pPr>
@@ -2696,8 +2455,8 @@
           <w:sdtPr>
             <w:rPr>
               <w:rFonts w:cs="Arial"/>
-              <w:sz w:val="22"/>
-              <w:szCs w:val="22"/>
+              <w:sz w:val="18"/>
+              <w:szCs w:val="18"/>
               <w:lang w:eastAsia="en-US"/>
             </w:rPr>
             <w:alias w:val="Amount_ReportTotalsLine"/>
@@ -2706,35 +2465,32 @@
             <w:placeholder>
               <w:docPart w:val="867B8FF74A56475EB44E32D0412F7D1A"/>
             </w:placeholder>
+            <w:dataBinding w:prefixMappings="xmlns:ns0='urn:microsoft-dynamics-nav/reports/Standard_Sales_Credit_Memo/1307/'" w:xpath="/ns0:NavWordReportXmlPart[1]/ns0:Header[1]/ns0:ReportTotalsLine[1]/ns0:Amount_ReportTotalsLine[1]" w:storeItemID="{2C0E3694-AC57-46EE-8053-99B806001417}"/>
             <w15:color w:val="808080"/>
             <w:text/>
-            <w:dataBinding w:prefixMappings="xmlns:ns0='urn:microsoft-dynamics-nav/reports/Standard_Sales_Credit_Memo/1307/'" w:xpath="/ns0:NavWordReportXmlPart[1]/ns0:Header[1]/ns0:ReportTotalsLine[1]/ns0:Amount_ReportTotalsLine[1]"/>
           </w:sdtPr>
-          <w:sdtEndPr/>
           <w:sdtContent>
             <w:tc>
               <w:tcPr>
                 <w:tcW w:w="3685" w:type="dxa"/>
-                <w:vAlign w:val="center"/>
               </w:tcPr>
               <w:p>
                 <w:pPr>
                   <w:spacing w:before="120" w:after="120" w:line="240" w:lineRule="exact"/>
                   <w:jc w:val="right"/>
-                  <w:cnfStyle w:val="000000000000" w:firstRow="0" w:lastRow="0" w:firstColumn="0" w:lastColumn="0" w:oddVBand="0" w:evenVBand="0" w:oddHBand="0" w:evenHBand="0" w:firstRowFirstColumn="0" w:firstRowLastColumn="0" w:lastRowFirstColumn="0" w:lastRowLastColumn="0"/>
-                  <w:rPr>
-                    <w:rFonts w:cs="Arial" w:asciiTheme="minorHAnsi" w:hAnsiTheme="minorHAnsi"/>
-                    <w:sz w:val="22"/>
-                    <w:szCs w:val="22"/>
+                  <w:rPr>
+                    <w:rFonts w:cs="Arial"/>
+                    <w:sz w:val="18"/>
+                    <w:szCs w:val="18"/>
                     <w:lang w:eastAsia="en-US"/>
                   </w:rPr>
                 </w:pPr>
                 <w:proofErr w:type="spellStart"/>
                 <w:r>
                   <w:rPr>
-                    <w:rFonts w:cs="Arial" w:asciiTheme="minorHAnsi" w:hAnsiTheme="minorHAnsi"/>
-                    <w:sz w:val="22"/>
-                    <w:szCs w:val="22"/>
+                    <w:rFonts w:cs="Arial"/>
+                    <w:sz w:val="18"/>
+                    <w:szCs w:val="18"/>
                     <w:lang w:eastAsia="en-US"/>
                   </w:rPr>
                   <w:t>Amount_ReportTotalsLine</w:t>
@@ -2753,9 +2509,9 @@
         <w:sdt>
           <w:sdtPr>
             <w:rPr>
-              <w:rFonts w:ascii="Segoe UI Semibold" w:hAnsi="Segoe UI Semibold" w:eastAsia="Times New Roman" w:cs="Segoe UI Semibold"/>
-              <w:sz w:val="22"/>
-              <w:szCs w:val="22"/>
+              <w:rFonts w:ascii="Segoe UI Semibold" w:eastAsia="Times New Roman" w:hAnsi="Segoe UI Semibold" w:cs="Segoe UI Semibold"/>
+              <w:sz w:val="18"/>
+              <w:szCs w:val="18"/>
             </w:rPr>
             <w:alias w:val="TotalText"/>
             <w:tag w:val="#BC:InsertDataItem,DataItems/Header/Totals/TotalText"/>
@@ -2763,38 +2519,31 @@
             <w:placeholder>
               <w:docPart w:val="5F67B1591FB7456B82FB133B1B959913"/>
             </w:placeholder>
+            <w:dataBinding w:prefixMappings="xmlns:ns0='urn:microsoft-dynamics-nav/reports/Standard_Sales_Credit_Memo/1307/'" w:xpath="/ns0:NavWordReportXmlPart[1]/ns0:Header[1]/ns0:Totals[1]/ns0:TotalText[1]" w:storeItemID="{2C0E3694-AC57-46EE-8053-99B806001417}"/>
             <w15:color w:val="808080"/>
             <w:text/>
-            <w:dataBinding w:prefixMappings="xmlns:ns0='urn:microsoft-dynamics-nav/reports/Standard_Sales_Credit_Memo/1307/'" w:xpath="/ns0:NavWordReportXmlPart[1]/ns0:Header[1]/ns0:Totals[1]/ns0:TotalText[1]"/>
           </w:sdtPr>
-          <w:sdtEndPr/>
           <w:sdtContent>
             <w:tc>
               <w:tcPr>
-                <w:cnfStyle w:val="001000000000" w:firstRow="0" w:lastRow="0" w:firstColumn="1" w:lastColumn="0" w:oddVBand="0" w:evenVBand="0" w:oddHBand="0" w:evenHBand="0" w:firstRowFirstColumn="0" w:firstRowLastColumn="0" w:lastRowFirstColumn="0" w:lastRowLastColumn="0"/>
                 <w:tcW w:w="4995" w:type="dxa"/>
-                <w:tcBorders>
-                  <w:top w:val="single" w:color="000000" w:sz="4" w:space="0"/>
-                  <w:bottom w:val="single" w:color="000000" w:sz="12" w:space="0"/>
-                </w:tcBorders>
-                <w:vAlign w:val="center"/>
               </w:tcPr>
               <w:p>
                 <w:pPr>
                   <w:pStyle w:val="Heading2"/>
                   <w:spacing w:before="120" w:after="120" w:line="240" w:lineRule="exact"/>
                   <w:rPr>
-                    <w:rFonts w:ascii="Segoe UI Semibold" w:hAnsi="Segoe UI Semibold" w:eastAsia="Times New Roman" w:cs="Segoe UI Semibold"/>
-                    <w:sz w:val="22"/>
-                    <w:szCs w:val="22"/>
+                    <w:rFonts w:ascii="Segoe UI Semibold" w:eastAsia="Times New Roman" w:hAnsi="Segoe UI Semibold" w:cs="Segoe UI Semibold"/>
+                    <w:sz w:val="18"/>
+                    <w:szCs w:val="18"/>
                   </w:rPr>
                 </w:pPr>
                 <w:proofErr w:type="spellStart"/>
                 <w:r>
                   <w:rPr>
-                    <w:rFonts w:ascii="Segoe UI Semibold" w:hAnsi="Segoe UI Semibold" w:eastAsia="Times New Roman" w:cs="Segoe UI Semibold"/>
-                    <w:sz w:val="22"/>
-                    <w:szCs w:val="22"/>
+                    <w:rFonts w:ascii="Segoe UI Semibold" w:eastAsia="Times New Roman" w:hAnsi="Segoe UI Semibold" w:cs="Segoe UI Semibold"/>
+                    <w:sz w:val="18"/>
+                    <w:szCs w:val="18"/>
                   </w:rPr>
                   <w:t>TotalText</w:t>
                 </w:r>
@@ -2806,22 +2555,16 @@
         <w:tc>
           <w:tcPr>
             <w:tcW w:w="960" w:type="dxa"/>
-            <w:tcBorders>
-              <w:top w:val="single" w:color="000000" w:sz="4" w:space="0"/>
-              <w:bottom w:val="single" w:color="000000" w:sz="12" w:space="0"/>
-            </w:tcBorders>
-            <w:vAlign w:val="center"/>
           </w:tcPr>
           <w:p>
             <w:pPr>
               <w:pStyle w:val="Heading2"/>
               <w:spacing w:before="120" w:after="120" w:line="240" w:lineRule="exact"/>
-              <w:cnfStyle w:val="010000000000" w:firstRow="0" w:lastRow="1" w:firstColumn="0" w:lastColumn="0" w:oddVBand="0" w:evenVBand="0" w:oddHBand="0" w:evenHBand="0" w:firstRowFirstColumn="0" w:firstRowLastColumn="0" w:lastRowFirstColumn="0" w:lastRowLastColumn="0"/>
               <w:rPr>
                 <w:rFonts w:ascii="Segoe UI Semibold" w:hAnsi="Segoe UI Semibold" w:cs="Segoe UI Semibold"/>
-                <w:b w:val="0"/>
-                <w:sz w:val="22"/>
-                <w:szCs w:val="22"/>
+                <w:b/>
+                <w:sz w:val="18"/>
+                <w:szCs w:val="18"/>
                 <w:lang w:eastAsia="en-US"/>
               </w:rPr>
             </w:pPr>
@@ -2830,22 +2573,16 @@
         <w:tc>
           <w:tcPr>
             <w:tcW w:w="425" w:type="dxa"/>
-            <w:tcBorders>
-              <w:top w:val="single" w:color="000000" w:sz="4" w:space="0"/>
-              <w:bottom w:val="single" w:color="000000" w:sz="12" w:space="0"/>
-            </w:tcBorders>
-            <w:vAlign w:val="center"/>
           </w:tcPr>
           <w:p>
             <w:pPr>
               <w:pStyle w:val="Heading2"/>
               <w:spacing w:before="120" w:after="120" w:line="240" w:lineRule="exact"/>
-              <w:cnfStyle w:val="010000000000" w:firstRow="0" w:lastRow="1" w:firstColumn="0" w:lastColumn="0" w:oddVBand="0" w:evenVBand="0" w:oddHBand="0" w:evenHBand="0" w:firstRowFirstColumn="0" w:firstRowLastColumn="0" w:lastRowFirstColumn="0" w:lastRowLastColumn="0"/>
               <w:rPr>
                 <w:rFonts w:ascii="Segoe UI Semibold" w:hAnsi="Segoe UI Semibold" w:cs="Segoe UI Semibold"/>
-                <w:b w:val="0"/>
-                <w:sz w:val="22"/>
-                <w:szCs w:val="22"/>
+                <w:b/>
+                <w:sz w:val="18"/>
+                <w:szCs w:val="18"/>
                 <w:lang w:eastAsia="en-US"/>
               </w:rPr>
             </w:pPr>
@@ -2854,22 +2591,16 @@
         <w:tc>
           <w:tcPr>
             <w:tcW w:w="429" w:type="dxa"/>
-            <w:tcBorders>
-              <w:top w:val="single" w:color="000000" w:sz="4" w:space="0"/>
-              <w:bottom w:val="single" w:color="000000" w:sz="12" w:space="0"/>
-            </w:tcBorders>
-            <w:vAlign w:val="center"/>
           </w:tcPr>
           <w:p>
             <w:pPr>
               <w:pStyle w:val="Heading2"/>
               <w:spacing w:before="120" w:after="120" w:line="240" w:lineRule="exact"/>
-              <w:cnfStyle w:val="010000000000" w:firstRow="0" w:lastRow="1" w:firstColumn="0" w:lastColumn="0" w:oddVBand="0" w:evenVBand="0" w:oddHBand="0" w:evenHBand="0" w:firstRowFirstColumn="0" w:firstRowLastColumn="0" w:lastRowFirstColumn="0" w:lastRowLastColumn="0"/>
               <w:rPr>
                 <w:rFonts w:ascii="Segoe UI Semibold" w:hAnsi="Segoe UI Semibold" w:cs="Segoe UI Semibold"/>
-                <w:b w:val="0"/>
-                <w:sz w:val="22"/>
-                <w:szCs w:val="22"/>
+                <w:b/>
+                <w:sz w:val="18"/>
+                <w:szCs w:val="18"/>
                 <w:lang w:eastAsia="en-US"/>
               </w:rPr>
             </w:pPr>
@@ -2878,31 +2609,25 @@
         <w:tc>
           <w:tcPr>
             <w:tcW w:w="3685" w:type="dxa"/>
-            <w:tcBorders>
-              <w:top w:val="single" w:color="000000" w:sz="4" w:space="0"/>
-              <w:bottom w:val="single" w:color="000000" w:sz="12" w:space="0"/>
-            </w:tcBorders>
-            <w:vAlign w:val="center"/>
           </w:tcPr>
           <w:p>
             <w:pPr>
               <w:pStyle w:val="Heading2"/>
               <w:spacing w:before="120" w:after="120" w:line="240" w:lineRule="exact"/>
               <w:jc w:val="right"/>
-              <w:cnfStyle w:val="010000000000" w:firstRow="0" w:lastRow="1" w:firstColumn="0" w:lastColumn="0" w:oddVBand="0" w:evenVBand="0" w:oddHBand="0" w:evenHBand="0" w:firstRowFirstColumn="0" w:firstRowLastColumn="0" w:lastRowFirstColumn="0" w:lastRowLastColumn="0"/>
               <w:rPr>
                 <w:rFonts w:ascii="Segoe UI Semibold" w:hAnsi="Segoe UI Semibold" w:cs="Segoe UI Semibold"/>
-                <w:b w:val="0"/>
-                <w:sz w:val="22"/>
-                <w:szCs w:val="22"/>
+                <w:b/>
+                <w:sz w:val="18"/>
+                <w:szCs w:val="18"/>
                 <w:lang w:eastAsia="en-US"/>
               </w:rPr>
             </w:pPr>
             <w:r>
               <w:rPr>
-                <w:rFonts w:ascii="Segoe UI Semibold" w:hAnsi="Segoe UI Semibold" w:eastAsia="Times New Roman" w:cs="Segoe UI Semibold"/>
-                <w:sz w:val="22"/>
-                <w:szCs w:val="22"/>
+                <w:rFonts w:ascii="Segoe UI Semibold" w:eastAsia="Times New Roman" w:hAnsi="Segoe UI Semibold" w:cs="Segoe UI Semibold"/>
+                <w:sz w:val="18"/>
+                <w:szCs w:val="18"/>
               </w:rPr>
               <w:t> </w:t>
             </w:r>
@@ -2910,9 +2635,9 @@
             <w:sdt>
               <w:sdtPr>
                 <w:rPr>
-                  <w:rFonts w:ascii="Segoe UI Semibold" w:hAnsi="Segoe UI Semibold" w:eastAsia="Times New Roman" w:cs="Segoe UI Semibold"/>
-                  <w:sz w:val="22"/>
-                  <w:szCs w:val="22"/>
+                  <w:rFonts w:ascii="Segoe UI Semibold" w:eastAsia="Times New Roman" w:hAnsi="Segoe UI Semibold" w:cs="Segoe UI Semibold"/>
+                  <w:sz w:val="18"/>
+                  <w:szCs w:val="18"/>
                 </w:rPr>
                 <w:alias w:val="TotalAmountIncludingVAT"/>
                 <w:tag w:val="#BC:InsertDataItem,DataItems/Header/Totals/TotalAmountIncludingVAT"/>
@@ -2920,17 +2645,16 @@
                 <w:placeholder>
                   <w:docPart w:val="76483E6C26294881AD51242C0A3AC39C"/>
                 </w:placeholder>
+                <w:dataBinding w:prefixMappings="xmlns:ns0='urn:microsoft-dynamics-nav/reports/Standard_Sales_Credit_Memo/1307/'" w:xpath="/ns0:NavWordReportXmlPart[1]/ns0:Header[1]/ns0:Totals[1]/ns0:TotalAmountIncludingVAT[1]" w:storeItemID="{2C0E3694-AC57-46EE-8053-99B806001417}"/>
                 <w15:color w:val="808080"/>
                 <w:text/>
-                <w:dataBinding w:prefixMappings="xmlns:ns0='urn:microsoft-dynamics-nav/reports/Standard_Sales_Credit_Memo/1307/'" w:xpath="/ns0:NavWordReportXmlPart[1]/ns0:Header[1]/ns0:Totals[1]/ns0:TotalAmountIncludingVAT[1]"/>
               </w:sdtPr>
-              <w:sdtEndPr/>
               <w:sdtContent>
                 <w:r>
                   <w:rPr>
-                    <w:rFonts w:ascii="Segoe UI Semibold" w:hAnsi="Segoe UI Semibold" w:eastAsia="Times New Roman" w:cs="Segoe UI Semibold"/>
-                    <w:sz w:val="22"/>
-                    <w:szCs w:val="22"/>
+                    <w:rFonts w:ascii="Segoe UI Semibold" w:eastAsia="Times New Roman" w:hAnsi="Segoe UI Semibold" w:cs="Segoe UI Semibold"/>
+                    <w:sz w:val="18"/>
+                    <w:szCs w:val="18"/>
                   </w:rPr>
                   <w:t>TotalAmountIncludingVAT</w:t>
                 </w:r>
@@ -2941,27 +2665,31 @@
         </w:tc>
       </w:tr>
     </w:tbl>
-    <w:p/>
+    <w:p>
+      <w:pPr>
+        <w:rPr>
+          <w:sz w:val="18"/>
+          <w:szCs w:val="18"/>
+        </w:rPr>
+      </w:pPr>
+    </w:p>
     <w:tbl>
       <w:tblPr>
+        <w:tblStyle w:val="BCBlockTable"/>
         <w:tblW w:w="0" w:type="auto"/>
-        <w:tblCellMar>
-          <w:left w:w="0" w:type="dxa"/>
-          <w:right w:w="0" w:type="dxa"/>
-        </w:tblCellMar>
         <w:tblLook w:val="0000" w:firstRow="0" w:lastRow="0" w:firstColumn="0" w:lastColumn="0" w:noHBand="0" w:noVBand="0"/>
         <w:tblCaption w:val="Note Block"/>
       </w:tblPr>
       <w:tblGrid>
-        <w:gridCol w:w="10610"/>
+        <w:gridCol w:w="10494"/>
       </w:tblGrid>
       <w:tr>
         <w:sdt>
           <w:sdtPr>
             <w:rPr>
               <w:iCs/>
-              <w:sz w:val="22"/>
-              <w:szCs w:val="22"/>
+              <w:sz w:val="18"/>
+              <w:szCs w:val="18"/>
             </w:rPr>
             <w:alias w:val="WorkDescriptionLine"/>
             <w:tag w:val="#BC:InsertDataItem,DataItems/Header/WorkDescriptionLines/WorkDescriptionLine"/>
@@ -2969,11 +2697,10 @@
             <w:placeholder>
               <w:docPart w:val="7118BD3021BA420DAB1CD05C39F00837"/>
             </w:placeholder>
+            <w:dataBinding w:prefixMappings="xmlns:ns0='urn:microsoft-dynamics-nav/reports/Standard_Sales_Credit_Memo/1307/'" w:xpath="/ns0:NavWordReportXmlPart[1]/ns0:Header[1]/ns0:WorkDescriptionLines[1]/ns0:WorkDescriptionLine[1]" w:storeItemID="{2C0E3694-AC57-46EE-8053-99B806001417}"/>
             <w15:color w:val="808080"/>
             <w:text/>
-            <w:dataBinding w:prefixMappings="xmlns:ns0='urn:microsoft-dynamics-nav/reports/Standard_Sales_Credit_Memo/1307/'" w:xpath="/ns0:NavWordReportXmlPart[1]/ns0:Header[1]/ns0:WorkDescriptionLines[1]/ns0:WorkDescriptionLine[1]"/>
           </w:sdtPr>
-          <w:sdtEndPr/>
           <w:sdtContent>
             <w:tc>
               <w:tcPr>
@@ -2984,14 +2711,16 @@
                   <w:ind w:right="26"/>
                   <w:rPr>
                     <w:i/>
+                    <w:sz w:val="18"/>
+                    <w:szCs w:val="18"/>
                   </w:rPr>
                 </w:pPr>
                 <w:proofErr w:type="spellStart"/>
                 <w:r>
                   <w:rPr>
                     <w:iCs/>
-                    <w:sz w:val="22"/>
-                    <w:szCs w:val="22"/>
+                    <w:sz w:val="18"/>
+                    <w:szCs w:val="18"/>
                   </w:rPr>
                   <w:t>WorkDescriptionLine</w:t>
                 </w:r>
@@ -3006,8 +2735,8 @@
       <w:pPr>
         <w:spacing w:after="0" w:line="240" w:lineRule="auto"/>
         <w:rPr>
-          <w:sz w:val="22"/>
-          <w:szCs w:val="22"/>
+          <w:sz w:val="18"/>
+          <w:szCs w:val="18"/>
         </w:rPr>
       </w:pPr>
     </w:p>
@@ -3015,8 +2744,8 @@
       <w:sdtPr>
         <w:rPr>
           <w:iCs/>
-          <w:sz w:val="22"/>
-          <w:szCs w:val="22"/>
+          <w:sz w:val="18"/>
+          <w:szCs w:val="18"/>
         </w:rPr>
         <w:alias w:val="QR_Code_Image_Lbl"/>
         <w:tag w:val="#BC:InsertDataItem,DataItems/Header/QR_Code_Image_Lbl"/>
@@ -3024,9 +2753,9 @@
         <w:placeholder>
           <w:docPart w:val="DefaultPlaceholder_-1854013440"/>
         </w:placeholder>
+        <w:dataBinding w:prefixMappings="xmlns:ns0='urn:microsoft-dynamics-nav/reports/Standard_Sales_Credit_Memo/1307/'" w:xpath="/ns0:NavWordReportXmlPart[1]/ns0:Header[1]/ns0:QR_Code_Image_Lbl[1]" w:storeItemID="{2C0E3694-AC57-46EE-8053-99B806001417}"/>
         <w15:color w:val="808080"/>
         <w:text/>
-        <w:dataBinding w:prefixMappings="xmlns:ns0='urn:microsoft-dynamics-nav/reports/Standard_Sales_Credit_Memo/1307/'" w:xpath="/ns0:NavWordReportXmlPart[1]/ns0:Header[1]/ns0:QR_Code_Image_Lbl[1]"/>
       </w:sdtPr>
       <w:sdtContent>
         <w:p>
@@ -3034,16 +2763,16 @@
             <w:ind w:right="26"/>
             <w:rPr>
               <w:iCs/>
-              <w:sz w:val="22"/>
-              <w:szCs w:val="22"/>
+              <w:sz w:val="18"/>
+              <w:szCs w:val="18"/>
             </w:rPr>
           </w:pPr>
           <w:proofErr w:type="spellStart"/>
           <w:r>
             <w:rPr>
               <w:iCs/>
-              <w:sz w:val="22"/>
-              <w:szCs w:val="22"/>
+              <w:sz w:val="18"/>
+              <w:szCs w:val="18"/>
             </w:rPr>
             <w:t>QR_Code_Image_Lbl</w:t>
           </w:r>
@@ -3052,9 +2781,17 @@
       </w:sdtContent>
     </w:sdt>
     <w:p>
+      <w:pPr>
+        <w:rPr>
+          <w:sz w:val="18"/>
+          <w:szCs w:val="18"/>
+        </w:rPr>
+      </w:pPr>
       <w:r>
         <w:rPr>
           <w:noProof/>
+          <w:sz w:val="18"/>
+          <w:szCs w:val="18"/>
         </w:rPr>
         <w:drawing>
           <wp:inline distT="0" distB="0" distL="0" distR="0" wp14:anchorId="6C579F1A" wp14:editId="7AB97A8A">
@@ -3074,7 +2811,7 @@
                     </pic:cNvPicPr>
                   </pic:nvPicPr>
                   <pic:blipFill>
-                    <a:blip r:embed="rId6" cstate="print">
+                    <a:blip r:embed="rId7" cstate="print">
                       <a:extLst>
                         <a:ext uri="{28A0092B-C50C-407E-A947-70E740481C1C}">
                           <a14:useLocalDpi xmlns:a14="http://schemas.microsoft.com/office/drawing/2010/main" val="0"/>
@@ -3106,9 +2843,25 @@
         </w:drawing>
       </w:r>
     </w:p>
+    <w:p>
+      <w:pPr>
+        <w:rPr>
+          <w:sz w:val="18"/>
+          <w:szCs w:val="18"/>
+        </w:rPr>
+      </w:pPr>
+    </w:p>
+    <w:p>
+      <w:pPr>
+        <w:rPr>
+          <w:sz w:val="18"/>
+          <w:szCs w:val="18"/>
+        </w:rPr>
+      </w:pPr>
+    </w:p>
     <w:sectPr>
-      <w:pgSz w:w="16838" w:h="11906" w:orient="landscape"/>
-      <w:pgMar w:top="706" w:right="576" w:bottom="706" w:left="576" w:header="708" w:footer="708" w:gutter="0"/>
+      <w:pgSz w:w="11906" w:h="16838"/>
+      <w:pgMar w:top="576" w:right="706" w:bottom="576" w:left="706" w:header="708" w:footer="708" w:gutter="0"/>
       <w:cols w:space="708"/>
       <w:docGrid w:linePitch="360"/>
     </w:sectPr>
@@ -3631,6 +3384,7 @@
       <w:kern w:val="0"/>
       <w:sz w:val="20"/>
       <w:szCs w:val="20"/>
+      <w:lang w:val="da-DK" w:eastAsia="da-DK"/>
       <w14:ligatures w14:val="none"/>
     </w:rPr>
     <w:tblPr/>
@@ -3823,11 +3577,186 @@
       <w:color w:val="666666"/>
     </w:rPr>
   </w:style>
+  <w:style w:type="paragraph" w:styleId="NoSpacing">
+    <w:name w:val="No Spacing"/>
+    <w:uiPriority w:val="1"/>
+    <w:qFormat/>
+    <w:rsid w:val="0056112E"/>
+    <w:pPr>
+      <w:spacing w:after="0" w:line="240" w:lineRule="auto"/>
+    </w:pPr>
+    <w:rPr>
+      <w:rFonts w:eastAsiaTheme="minorHAnsi"/>
+      <w:color w:val="000000" w:themeColor="text1"/>
+      <w:lang w:val="da-DK" w:eastAsia="da-DK"/>
+    </w:rPr>
+  </w:style>
+  <w:style w:type="paragraph" w:customStyle="1" w:styleId="BCNumber">
+    <w:name w:val="BC Number"/>
+    <w:basedOn w:val="NoSpacing"/>
+    <w:next w:val="Normal"/>
+    <w:uiPriority w:val="2"/>
+    <w:qFormat/>
+    <w:rsid w:val="0056112E"/>
+    <w:rPr>
+      <w14:numSpacing w14:val="tabular"/>
+    </w:rPr>
+  </w:style>
+  <w:style w:type="paragraph" w:customStyle="1" w:styleId="BCLabel">
+    <w:name w:val="BC Label"/>
+    <w:basedOn w:val="NoSpacing"/>
+    <w:next w:val="Normal"/>
+    <w:uiPriority w:val="2"/>
+    <w:qFormat/>
+    <w:rsid w:val="0056112E"/>
+    <w:pPr>
+      <w:keepNext/>
+    </w:pPr>
+    <w:rPr>
+      <w:rFonts w:asciiTheme="majorHAnsi" w:eastAsiaTheme="majorEastAsia" w:hAnsiTheme="majorHAnsi" w:cstheme="majorBidi"/>
+    </w:rPr>
+  </w:style>
+  <w:style w:type="paragraph" w:customStyle="1" w:styleId="BCLabelNumber">
+    <w:name w:val="BC Label Number"/>
+    <w:basedOn w:val="BCLabel"/>
+    <w:next w:val="Normal"/>
+    <w:uiPriority w:val="2"/>
+    <w:qFormat/>
+    <w:rsid w:val="0056112E"/>
+    <w:rPr>
+      <w14:numSpacing w14:val="tabular"/>
+    </w:rPr>
+  </w:style>
+  <w:style w:type="table" w:customStyle="1" w:styleId="BCDataTable">
+    <w:name w:val="BC Data Table"/>
+    <w:basedOn w:val="TableNormal"/>
+    <w:uiPriority w:val="99"/>
+    <w:qFormat/>
+    <w:rsid w:val="0056112E"/>
+    <w:pPr>
+      <w:spacing w:after="0" w:line="240" w:lineRule="auto"/>
+    </w:pPr>
+    <w:rPr>
+      <w:lang w:val="da-DK" w:eastAsia="da-DK"/>
+    </w:rPr>
+    <w:tblPr>
+      <w:tblStyleRowBandSize w:val="1"/>
+      <w:tblStyleColBandSize w:val="1"/>
+      <w:tblCellMar>
+        <w:left w:w="115" w:type="dxa"/>
+        <w:right w:w="115" w:type="dxa"/>
+      </w:tblCellMar>
+    </w:tblPr>
+    <w:tcPr>
+      <w:vAlign w:val="center"/>
+    </w:tcPr>
+    <w:tblStylePr w:type="firstRow">
+      <w:pPr>
+        <w:spacing w:before="160" w:after="80"/>
+      </w:pPr>
+      <w:rPr>
+        <w:rFonts w:asciiTheme="majorHAnsi" w:hAnsiTheme="majorHAnsi" w:cstheme="majorBidi"/>
+      </w:rPr>
+      <w:tblPr/>
+      <w:tcPr>
+        <w:tcBorders>
+          <w:bottom w:val="single" w:sz="4" w:space="0" w:color="000000" w:themeColor="text1"/>
+        </w:tcBorders>
+        <w:vAlign w:val="top"/>
+      </w:tcPr>
+    </w:tblStylePr>
+    <w:tblStylePr w:type="lastRow">
+      <w:tblPr/>
+      <w:tcPr>
+        <w:tcBorders>
+          <w:bottom w:val="single" w:sz="4" w:space="0" w:color="E8E8E8" w:themeColor="background2"/>
+        </w:tcBorders>
+      </w:tcPr>
+    </w:tblStylePr>
+    <w:tblStylePr w:type="band1Horz">
+      <w:tblPr/>
+      <w:tcPr>
+        <w:shd w:val="clear" w:color="auto" w:fill="auto"/>
+      </w:tcPr>
+    </w:tblStylePr>
+    <w:tblStylePr w:type="band2Horz">
+      <w:tblPr/>
+      <w:tcPr>
+        <w:shd w:val="clear" w:color="auto" w:fill="FAE2D5" w:themeFill="accent2" w:themeFillTint="33"/>
+      </w:tcPr>
+    </w:tblStylePr>
+  </w:style>
+  <w:style w:type="table" w:customStyle="1" w:styleId="BCTotalsTable">
+    <w:name w:val="BC Totals Table"/>
+    <w:basedOn w:val="TableNormal"/>
+    <w:uiPriority w:val="99"/>
+    <w:qFormat/>
+    <w:rsid w:val="0056112E"/>
+    <w:pPr>
+      <w:spacing w:after="0" w:line="240" w:lineRule="auto"/>
+    </w:pPr>
+    <w:rPr>
+      <w:lang w:val="da-DK" w:eastAsia="da-DK"/>
+    </w:rPr>
+    <w:tblPr>
+      <w:tblStyleRowBandSize w:val="1"/>
+      <w:tblStyleColBandSize w:val="1"/>
+      <w:tblCellMar>
+        <w:left w:w="115" w:type="dxa"/>
+        <w:right w:w="115" w:type="dxa"/>
+      </w:tblCellMar>
+    </w:tblPr>
+    <w:tcPr>
+      <w:vAlign w:val="center"/>
+    </w:tcPr>
+    <w:tblStylePr w:type="lastRow">
+      <w:rPr>
+        <w:rFonts w:asciiTheme="majorHAnsi" w:hAnsiTheme="majorHAnsi" w:cstheme="majorBidi"/>
+      </w:rPr>
+      <w:tblPr/>
+      <w:tcPr>
+        <w:tcBorders>
+          <w:top w:val="single" w:sz="4" w:space="0" w:color="000000" w:themeColor="text1"/>
+          <w:bottom w:val="single" w:sz="8" w:space="0" w:color="000000" w:themeColor="text1"/>
+        </w:tcBorders>
+      </w:tcPr>
+    </w:tblStylePr>
+  </w:style>
+  <w:style w:type="table" w:customStyle="1" w:styleId="BCBlockTable">
+    <w:name w:val="BC Block Table"/>
+    <w:basedOn w:val="TableNormal"/>
+    <w:uiPriority w:val="99"/>
+    <w:qFormat/>
+    <w:rsid w:val="0056112E"/>
+    <w:pPr>
+      <w:spacing w:after="0" w:line="240" w:lineRule="auto"/>
+    </w:pPr>
+    <w:rPr>
+      <w:lang w:val="da-DK" w:eastAsia="da-DK"/>
+    </w:rPr>
+    <w:tblPr>
+      <w:tblStyleRowBandSize w:val="1"/>
+      <w:tblStyleColBandSize w:val="1"/>
+      <w:tblCellMar>
+        <w:left w:w="0" w:type="dxa"/>
+        <w:right w:w="0" w:type="dxa"/>
+      </w:tblCellMar>
+    </w:tblPr>
+    <w:tblStylePr w:type="firstRow">
+      <w:rPr>
+        <w:rFonts w:asciiTheme="majorHAnsi" w:hAnsiTheme="majorHAnsi" w:cstheme="majorBidi"/>
+      </w:rPr>
+      <w:tblPr/>
+      <w:tcPr>
+        <w:vAlign w:val="top"/>
+      </w:tcPr>
+    </w:tblStylePr>
+  </w:style>
 </w:styles>
 </file>
 
 <file path=word/glossary/document.xml><?xml version="1.0" encoding="utf-8"?>
-<w:glossaryDocument xmlns:wpc="http://schemas.microsoft.com/office/word/2010/wordprocessingCanvas" xmlns:cx="http://schemas.microsoft.com/office/drawing/2014/chartex" xmlns:cx1="http://schemas.microsoft.com/office/drawing/2015/9/8/chartex" xmlns:cx2="http://schemas.microsoft.com/office/drawing/2015/10/21/chartex" xmlns:cx3="http://schemas.microsoft.com/office/drawing/2016/5/9/chartex" xmlns:cx4="http://schemas.microsoft.com/office/drawing/2016/5/10/chartex" xmlns:cx5="http://schemas.microsoft.com/office/drawing/2016/5/11/chartex" xmlns:cx6="http://schemas.microsoft.com/office/drawing/2016/5/12/chartex" xmlns:cx7="http://schemas.microsoft.com/office/drawing/2016/5/13/chartex" xmlns:cx8="http://schemas.microsoft.com/office/drawing/2016/5/14/chartex" xmlns:mc="http://schemas.openxmlformats.org/markup-compatibility/2006" xmlns:aink="http://schemas.microsoft.com/office/drawing/2016/ink" xmlns:am3d="http://schemas.microsoft.com/office/drawing/2017/model3d" xmlns:o="urn:schemas-microsoft-com:office:office" xmlns:oel="http://schemas.microsoft.com/office/2019/extlst" xmlns:r="http://schemas.openxmlformats.org/officeDocument/2006/relationships" xmlns:m="http://schemas.openxmlformats.org/officeDocument/2006/math" xmlns:v="urn:schemas-microsoft-com:vml" xmlns:wp14="http://schemas.microsoft.com/office/word/2010/wordprocessingDrawing" xmlns:wp="http://schemas.openxmlformats.org/drawingml/2006/wordprocessingDrawing" xmlns:w10="urn:schemas-microsoft-com:office:word" xmlns:w="http://schemas.openxmlformats.org/wordprocessingml/2006/main" xmlns:w14="http://schemas.microsoft.com/office/word/2010/wordml" xmlns:w15="http://schemas.microsoft.com/office/word/2012/wordml" xmlns:w16cex="http://schemas.microsoft.com/office/word/2018/wordml/cex" xmlns:w16cid="http://schemas.microsoft.com/office/word/2016/wordml/cid" xmlns:w16="http://schemas.microsoft.com/office/word/2018/wordml" xmlns:w16du="http://schemas.microsoft.com/office/word/2023/wordml/word16du" xmlns:w16sdtdh="http://schemas.microsoft.com/office/word/2020/wordml/sdtdatahash" xmlns:w16sdtfl="http://schemas.microsoft.com/office/word/2024/wordml/sdtformatlock" xmlns:w16se="http://schemas.microsoft.com/office/word/2015/wordml/symex" xmlns:wpg="http://schemas.microsoft.com/office/word/2010/wordprocessingGroup" xmlns:wpi="http://schemas.microsoft.com/office/word/2010/wordprocessingInk" xmlns:wne="http://schemas.microsoft.com/office/word/2006/wordml" xmlns:wps="http://schemas.microsoft.com/office/word/2010/wordprocessingShape" mc:Ignorable="w14 w15 w16se w16cid w16 w16cex w16sdtdh w16sdtfl w16du wp14">
+<w:glossaryDocument xmlns:wpc="http://schemas.microsoft.com/office/word/2010/wordprocessingCanvas" xmlns:cx="http://schemas.microsoft.com/office/drawing/2014/chartex" xmlns:cx1="http://schemas.microsoft.com/office/drawing/2015/9/8/chartex" xmlns:cx2="http://schemas.microsoft.com/office/drawing/2015/10/21/chartex" xmlns:cx3="http://schemas.microsoft.com/office/drawing/2016/5/9/chartex" xmlns:cx4="http://schemas.microsoft.com/office/drawing/2016/5/10/chartex" xmlns:cx5="http://schemas.microsoft.com/office/drawing/2016/5/11/chartex" xmlns:cx6="http://schemas.microsoft.com/office/drawing/2016/5/12/chartex" xmlns:cx7="http://schemas.microsoft.com/office/drawing/2016/5/13/chartex" xmlns:cx8="http://schemas.microsoft.com/office/drawing/2016/5/14/chartex" xmlns:mc="http://schemas.openxmlformats.org/markup-compatibility/2006" xmlns:aink="http://schemas.microsoft.com/office/drawing/2016/ink" xmlns:am3d="http://schemas.microsoft.com/office/drawing/2017/model3d" xmlns:o="urn:schemas-microsoft-com:office:office" xmlns:oel="http://schemas.microsoft.com/office/2019/extlst" xmlns:r="http://schemas.openxmlformats.org/officeDocument/2006/relationships" xmlns:m="http://schemas.openxmlformats.org/officeDocument/2006/math" xmlns:v="urn:schemas-microsoft-com:vml" xmlns:wp14="http://schemas.microsoft.com/office/word/2010/wordprocessingDrawing" xmlns:wp="http://schemas.openxmlformats.org/drawingml/2006/wordprocessingDrawing" xmlns:w10="urn:schemas-microsoft-com:office:word" xmlns:w="http://schemas.openxmlformats.org/wordprocessingml/2006/main" xmlns:w14="http://schemas.microsoft.com/office/word/2010/wordml" xmlns:w15="http://schemas.microsoft.com/office/word/2012/wordml" xmlns:w16cei="http://schemas.microsoft.com/office/word/2026/wordml/cei" xmlns:w16cex="http://schemas.microsoft.com/office/word/2018/wordml/cex" xmlns:w16cid="http://schemas.microsoft.com/office/word/2016/wordml/cid" xmlns:w16="http://schemas.microsoft.com/office/word/2018/wordml" xmlns:w16du="http://schemas.microsoft.com/office/word/2023/wordml/word16du" xmlns:w16sdtdh="http://schemas.microsoft.com/office/word/2020/wordml/sdtdatahash" xmlns:w16sdtfl="http://schemas.microsoft.com/office/word/2024/wordml/sdtformatlock" xmlns:w16se="http://schemas.microsoft.com/office/word/2015/wordml/symex" xmlns:wpg="http://schemas.microsoft.com/office/word/2010/wordprocessingGroup" xmlns:wpi="http://schemas.microsoft.com/office/word/2010/wordprocessingInk" xmlns:wne="http://schemas.microsoft.com/office/word/2006/wordml" xmlns:wps="http://schemas.microsoft.com/office/word/2010/wordprocessingShape" mc:Ignorable="w14 w15 w16se w16cid w16 w16cex w16sdtdh w16sdtfl w16du wp14">
   <w:docParts>
     <w:docPart>
       <w:docPartPr>
@@ -4727,7 +4656,7 @@
     </w:docPart>
     <w:docPart>
       <w:docPartPr>
-        <w:name w:val="7DE8AF6673594E96A32576622076C01B"/>
+        <w:name w:val="67EE593905584E38A88F0701E11A2324"/>
         <w:category>
           <w:name w:val="General"/>
           <w:gallery w:val="placeholder"/>
@@ -4738,12 +4667,12 @@
         <w:behaviors>
           <w:behavior w:val="content"/>
         </w:behaviors>
-        <w:guid w:val="{EFF684E8-B318-4893-A428-3E7BF063D359}"/>
+        <w:guid w:val="{8F5BF755-A4A8-42D4-A793-CD8A6114DD41}"/>
       </w:docPartPr>
       <w:docPartBody>
         <w:p>
           <w:pPr>
-            <w:pStyle w:val="7DE8AF6673594E96A32576622076C01B"/>
+            <w:pStyle w:val="67EE593905584E38A88F0701E11A2324"/>
           </w:pPr>
           <w:r>
             <w:rPr>
@@ -4756,7 +4685,7 @@
     </w:docPart>
     <w:docPart>
       <w:docPartPr>
-        <w:name w:val="694FE79F6BF445F1A7D1E44F89A49422"/>
+        <w:name w:val="1FDB2023363642548C38AD348CBB7D3D"/>
         <w:category>
           <w:name w:val="General"/>
           <w:gallery w:val="placeholder"/>
@@ -4767,12 +4696,186 @@
         <w:behaviors>
           <w:behavior w:val="content"/>
         </w:behaviors>
-        <w:guid w:val="{4050E156-FC41-470C-BCC7-6C6A880E3977}"/>
+        <w:guid w:val="{F519CCF9-E17B-4B95-AEE5-96BEA43995E3}"/>
       </w:docPartPr>
       <w:docPartBody>
         <w:p>
           <w:pPr>
-            <w:pStyle w:val="694FE79F6BF445F1A7D1E44F89A49422"/>
+            <w:pStyle w:val="1FDB2023363642548C38AD348CBB7D3D"/>
+          </w:pPr>
+          <w:r>
+            <w:rPr>
+              <w:rStyle w:val="PlaceholderText"/>
+            </w:rPr>
+            <w:t>Click or tap here to enter text.</w:t>
+          </w:r>
+        </w:p>
+      </w:docPartBody>
+    </w:docPart>
+    <w:docPart>
+      <w:docPartPr>
+        <w:name w:val="DB331ED79B5B4319899A61465048ABC8"/>
+        <w:category>
+          <w:name w:val="General"/>
+          <w:gallery w:val="placeholder"/>
+        </w:category>
+        <w:types>
+          <w:type w:val="bbPlcHdr"/>
+        </w:types>
+        <w:behaviors>
+          <w:behavior w:val="content"/>
+        </w:behaviors>
+        <w:guid w:val="{2982A852-CD2C-469D-AECD-8FA5FA004344}"/>
+      </w:docPartPr>
+      <w:docPartBody>
+        <w:p>
+          <w:pPr>
+            <w:pStyle w:val="DB331ED79B5B4319899A61465048ABC8"/>
+          </w:pPr>
+          <w:r>
+            <w:rPr>
+              <w:rStyle w:val="PlaceholderText"/>
+            </w:rPr>
+            <w:t>Click or tap here to enter text.</w:t>
+          </w:r>
+        </w:p>
+      </w:docPartBody>
+    </w:docPart>
+    <w:docPart>
+      <w:docPartPr>
+        <w:name w:val="5F0EF72654094BF8A3E1E2EE65CAB393"/>
+        <w:category>
+          <w:name w:val="General"/>
+          <w:gallery w:val="placeholder"/>
+        </w:category>
+        <w:types>
+          <w:type w:val="bbPlcHdr"/>
+        </w:types>
+        <w:behaviors>
+          <w:behavior w:val="content"/>
+        </w:behaviors>
+        <w:guid w:val="{EE9400AB-5EF9-454B-8388-F50F36C8048A}"/>
+      </w:docPartPr>
+      <w:docPartBody>
+        <w:p>
+          <w:pPr>
+            <w:pStyle w:val="5F0EF72654094BF8A3E1E2EE65CAB393"/>
+          </w:pPr>
+          <w:r>
+            <w:rPr>
+              <w:rStyle w:val="PlaceholderText"/>
+            </w:rPr>
+            <w:t>Click or tap here to enter text.</w:t>
+          </w:r>
+        </w:p>
+      </w:docPartBody>
+    </w:docPart>
+    <w:docPart>
+      <w:docPartPr>
+        <w:name w:val="53EB7E5142514976A56C07BBB690AFA8"/>
+        <w:category>
+          <w:name w:val="General"/>
+          <w:gallery w:val="placeholder"/>
+        </w:category>
+        <w:types>
+          <w:type w:val="bbPlcHdr"/>
+        </w:types>
+        <w:behaviors>
+          <w:behavior w:val="content"/>
+        </w:behaviors>
+        <w:guid w:val="{AE094147-8E09-4F11-AABD-90DC47C3A182}"/>
+      </w:docPartPr>
+      <w:docPartBody>
+        <w:p>
+          <w:pPr>
+            <w:pStyle w:val="53EB7E5142514976A56C07BBB690AFA8"/>
+          </w:pPr>
+          <w:r>
+            <w:rPr>
+              <w:rStyle w:val="PlaceholderText"/>
+            </w:rPr>
+            <w:t>Click or tap here to enter text.</w:t>
+          </w:r>
+        </w:p>
+      </w:docPartBody>
+    </w:docPart>
+    <w:docPart>
+      <w:docPartPr>
+        <w:name w:val="4CFDDC5025184F1190A336A748FCA821"/>
+        <w:category>
+          <w:name w:val="General"/>
+          <w:gallery w:val="placeholder"/>
+        </w:category>
+        <w:types>
+          <w:type w:val="bbPlcHdr"/>
+        </w:types>
+        <w:behaviors>
+          <w:behavior w:val="content"/>
+        </w:behaviors>
+        <w:guid w:val="{2EACBC6D-A8A6-46AC-BB72-D1C09E511E82}"/>
+      </w:docPartPr>
+      <w:docPartBody>
+        <w:p>
+          <w:pPr>
+            <w:pStyle w:val="4CFDDC5025184F1190A336A748FCA821"/>
+          </w:pPr>
+          <w:r>
+            <w:rPr>
+              <w:rStyle w:val="PlaceholderText"/>
+            </w:rPr>
+            <w:t>Click or tap here to enter text.</w:t>
+          </w:r>
+        </w:p>
+      </w:docPartBody>
+    </w:docPart>
+    <w:docPart>
+      <w:docPartPr>
+        <w:name w:val="CFB2A04FDD2241F09D9DE97DC68EAE19"/>
+        <w:category>
+          <w:name w:val="General"/>
+          <w:gallery w:val="placeholder"/>
+        </w:category>
+        <w:types>
+          <w:type w:val="bbPlcHdr"/>
+        </w:types>
+        <w:behaviors>
+          <w:behavior w:val="content"/>
+        </w:behaviors>
+        <w:guid w:val="{39B1064C-7E8C-4062-B70C-7034C66CD438}"/>
+      </w:docPartPr>
+      <w:docPartBody>
+        <w:p>
+          <w:pPr>
+            <w:pStyle w:val="CFB2A04FDD2241F09D9DE97DC68EAE19"/>
+          </w:pPr>
+          <w:r>
+            <w:rPr>
+              <w:rStyle w:val="PlaceholderText"/>
+            </w:rPr>
+            <w:t>Click or tap here to enter text.</w:t>
+          </w:r>
+        </w:p>
+      </w:docPartBody>
+    </w:docPart>
+    <w:docPart>
+      <w:docPartPr>
+        <w:name w:val="D24D9F3836514D7A8C6D2BC80C9C3119"/>
+        <w:category>
+          <w:name w:val="General"/>
+          <w:gallery w:val="placeholder"/>
+        </w:category>
+        <w:types>
+          <w:type w:val="bbPlcHdr"/>
+        </w:types>
+        <w:behaviors>
+          <w:behavior w:val="content"/>
+        </w:behaviors>
+        <w:guid w:val="{AA323ED5-5256-453D-8B29-3EBF1FD055CB}"/>
+      </w:docPartPr>
+      <w:docPartBody>
+        <w:p>
+          <w:pPr>
+            <w:pStyle w:val="D24D9F3836514D7A8C6D2BC80C9C3119"/>
           </w:pPr>
           <w:r>
             <w:rPr>
@@ -4843,6 +4946,7 @@
 <w:settings xmlns:mc="http://schemas.openxmlformats.org/markup-compatibility/2006" xmlns:o="urn:schemas-microsoft-com:office:office" xmlns:r="http://schemas.openxmlformats.org/officeDocument/2006/relationships" xmlns:m="http://schemas.openxmlformats.org/officeDocument/2006/math" xmlns:v="urn:schemas-microsoft-com:vml" xmlns:w10="urn:schemas-microsoft-com:office:word" xmlns:w="http://schemas.openxmlformats.org/wordprocessingml/2006/main" xmlns:w14="http://schemas.microsoft.com/office/word/2010/wordml" xmlns:w15="http://schemas.microsoft.com/office/word/2012/wordml" xmlns:w16cex="http://schemas.microsoft.com/office/word/2018/wordml/cex" xmlns:w16cid="http://schemas.microsoft.com/office/word/2016/wordml/cid" xmlns:w16="http://schemas.microsoft.com/office/word/2018/wordml" xmlns:w16du="http://schemas.microsoft.com/office/word/2023/wordml/word16du" xmlns:w16sdtdh="http://schemas.microsoft.com/office/word/2020/wordml/sdtdatahash" xmlns:w16sdtfl="http://schemas.microsoft.com/office/word/2024/wordml/sdtformatlock" xmlns:w16se="http://schemas.microsoft.com/office/word/2015/wordml/symex" xmlns:sl="http://schemas.openxmlformats.org/schemaLibrary/2006/main" mc:Ignorable="w14 w15 w16se w16cid w16 w16cex w16sdtdh w16sdtfl w16du">
   <w:view w:val="normal"/>
   <w:defaultTabStop w:val="720"/>
+  <w:hyphenationZone w:val="425"/>
   <w:characterSpacingControl w:val="doNotCompress"/>
   <w:compat>
     <w:useFELayout/>
@@ -4860,11 +4964,16 @@
     <w:rsid w:val="001C3543"/>
     <w:rsid w:val="00380644"/>
     <w:rsid w:val="004D3004"/>
+    <w:rsid w:val="0054653A"/>
     <w:rsid w:val="005D5506"/>
+    <w:rsid w:val="00610B92"/>
     <w:rsid w:val="006B1F0E"/>
+    <w:rsid w:val="00717ABA"/>
     <w:rsid w:val="00802AAB"/>
     <w:rsid w:val="008F75F7"/>
     <w:rsid w:val="009C0972"/>
+    <w:rsid w:val="00AB65AB"/>
+    <w:rsid w:val="00D938E1"/>
   </w:rsids>
   <m:mathPr>
     <m:mathFont m:val="Cambria Math"/>
@@ -5320,10 +5429,7 @@
     <w:basedOn w:val="DefaultParagraphFont"/>
     <w:uiPriority w:val="99"/>
     <w:semiHidden/>
-    <w:rsid w:val="005D5506"/>
-    <w:rPr>
-      <w:color w:val="666666"/>
-    </w:rPr>
+    <w:rsid w:val="00AB65AB"/>
   </w:style>
   <w:style w:type="paragraph" w:customStyle="1" w:styleId="27C6F6FBC51444E48F63C5E57109998C">
     <w:name w:val="27C6F6FBC51444E48F63C5E57109998C"/>
@@ -5576,22 +5682,195 @@
   <w:style w:type="paragraph" w:customStyle="1" w:styleId="B31D1E453E404591AF0DC8A2479B76C6">
     <w:name w:val="B31D1E453E404591AF0DC8A2479B76C6"/>
     <w:rsid w:val="005D5506"/>
-    <w:rPr>
-      <w:lang w:val="en-DK" w:eastAsia="en-DK"/>
-    </w:rPr>
   </w:style>
   <w:style w:type="paragraph" w:customStyle="1" w:styleId="E34CD3DB45384F9C902FA8374808F98E">
     <w:name w:val="E34CD3DB45384F9C902FA8374808F98E"/>
     <w:rsid w:val="005D5506"/>
-    <w:rPr>
-      <w:lang w:val="en-DK" w:eastAsia="en-DK"/>
-    </w:rPr>
   </w:style>
   <w:style w:type="paragraph" w:customStyle="1" w:styleId="8609C23D73F549C9A96209C53EA7A358">
     <w:name w:val="8609C23D73F549C9A96209C53EA7A358"/>
     <w:rsid w:val="005D5506"/>
+  </w:style>
+  <w:style w:type="paragraph" w:customStyle="1" w:styleId="AC09004C7F8B4FF896B72AD2C2F26AAE">
+    <w:name w:val="AC09004C7F8B4FF896B72AD2C2F26AAE"/>
+    <w:rsid w:val="00610B92"/>
     <w:rPr>
-      <w:lang w:val="en-DK" w:eastAsia="en-DK"/>
+      <w:lang w:val="da-DK" w:eastAsia="da-DK"/>
+    </w:rPr>
+  </w:style>
+  <w:style w:type="paragraph" w:customStyle="1" w:styleId="84FF848E16264A33AA5E153962869B17">
+    <w:name w:val="84FF848E16264A33AA5E153962869B17"/>
+    <w:rsid w:val="00610B92"/>
+    <w:rPr>
+      <w:lang w:val="da-DK" w:eastAsia="da-DK"/>
+    </w:rPr>
+  </w:style>
+  <w:style w:type="paragraph" w:customStyle="1" w:styleId="A12A9934A79A403EBB100580F66E6B57">
+    <w:name w:val="A12A9934A79A403EBB100580F66E6B57"/>
+    <w:rsid w:val="00610B92"/>
+    <w:rPr>
+      <w:lang w:val="da-DK" w:eastAsia="da-DK"/>
+    </w:rPr>
+  </w:style>
+  <w:style w:type="paragraph" w:customStyle="1" w:styleId="4CED21064DCA4D2EBD6407CB0166F869">
+    <w:name w:val="4CED21064DCA4D2EBD6407CB0166F869"/>
+    <w:rsid w:val="00610B92"/>
+    <w:rPr>
+      <w:lang w:val="da-DK" w:eastAsia="da-DK"/>
+    </w:rPr>
+  </w:style>
+  <w:style w:type="paragraph" w:customStyle="1" w:styleId="27162B87DADA422D9F60C2E391991161">
+    <w:name w:val="27162B87DADA422D9F60C2E391991161"/>
+    <w:rsid w:val="00610B92"/>
+    <w:rPr>
+      <w:lang w:val="da-DK" w:eastAsia="da-DK"/>
+    </w:rPr>
+  </w:style>
+  <w:style w:type="paragraph" w:customStyle="1" w:styleId="6540B96B6F594E17915AE170D10F6477">
+    <w:name w:val="6540B96B6F594E17915AE170D10F6477"/>
+    <w:rsid w:val="00610B92"/>
+    <w:rPr>
+      <w:lang w:val="da-DK" w:eastAsia="da-DK"/>
+    </w:rPr>
+  </w:style>
+  <w:style w:type="paragraph" w:customStyle="1" w:styleId="67EE593905584E38A88F0701E11A2324">
+    <w:name w:val="67EE593905584E38A88F0701E11A2324"/>
+    <w:rsid w:val="00610B92"/>
+    <w:rPr>
+      <w:lang w:val="da-DK" w:eastAsia="da-DK"/>
+    </w:rPr>
+  </w:style>
+  <w:style w:type="paragraph" w:customStyle="1" w:styleId="1FDB2023363642548C38AD348CBB7D3D">
+    <w:name w:val="1FDB2023363642548C38AD348CBB7D3D"/>
+    <w:rsid w:val="00610B92"/>
+    <w:rPr>
+      <w:lang w:val="da-DK" w:eastAsia="da-DK"/>
+    </w:rPr>
+  </w:style>
+  <w:style w:type="paragraph" w:customStyle="1" w:styleId="DB331ED79B5B4319899A61465048ABC8">
+    <w:name w:val="DB331ED79B5B4319899A61465048ABC8"/>
+    <w:rsid w:val="00610B92"/>
+    <w:rPr>
+      <w:lang w:val="da-DK" w:eastAsia="da-DK"/>
+    </w:rPr>
+  </w:style>
+  <w:style w:type="paragraph" w:customStyle="1" w:styleId="5F0EF72654094BF8A3E1E2EE65CAB393">
+    <w:name w:val="5F0EF72654094BF8A3E1E2EE65CAB393"/>
+    <w:rsid w:val="00610B92"/>
+    <w:rPr>
+      <w:lang w:val="da-DK" w:eastAsia="da-DK"/>
+    </w:rPr>
+  </w:style>
+  <w:style w:type="paragraph" w:customStyle="1" w:styleId="3747B9D22C594004A9F63976FC23CCE1">
+    <w:name w:val="3747B9D22C594004A9F63976FC23CCE1"/>
+    <w:rsid w:val="00610B92"/>
+    <w:rPr>
+      <w:lang w:val="da-DK" w:eastAsia="da-DK"/>
+    </w:rPr>
+  </w:style>
+  <w:style w:type="paragraph" w:customStyle="1" w:styleId="FBDCCD13CC2B4674B5B57BBD0A07FDE3">
+    <w:name w:val="FBDCCD13CC2B4674B5B57BBD0A07FDE3"/>
+    <w:rsid w:val="00610B92"/>
+    <w:rPr>
+      <w:lang w:val="da-DK" w:eastAsia="da-DK"/>
+    </w:rPr>
+  </w:style>
+  <w:style w:type="paragraph" w:customStyle="1" w:styleId="B529FE891A1A43E897547DE472E0180B">
+    <w:name w:val="B529FE891A1A43E897547DE472E0180B"/>
+    <w:rsid w:val="00610B92"/>
+    <w:rPr>
+      <w:lang w:val="da-DK" w:eastAsia="da-DK"/>
+    </w:rPr>
+  </w:style>
+  <w:style w:type="paragraph" w:customStyle="1" w:styleId="CF55F0BD2F154B41B941D64C467FF437">
+    <w:name w:val="CF55F0BD2F154B41B941D64C467FF437"/>
+    <w:rsid w:val="00610B92"/>
+    <w:rPr>
+      <w:lang w:val="da-DK" w:eastAsia="da-DK"/>
+    </w:rPr>
+  </w:style>
+  <w:style w:type="paragraph" w:customStyle="1" w:styleId="85783D004FD5426094E49952D41875C9">
+    <w:name w:val="85783D004FD5426094E49952D41875C9"/>
+    <w:rsid w:val="00610B92"/>
+    <w:rPr>
+      <w:lang w:val="da-DK" w:eastAsia="da-DK"/>
+    </w:rPr>
+  </w:style>
+  <w:style w:type="paragraph" w:customStyle="1" w:styleId="24F7B1F911AA48CB81E2BBF143C1CF43">
+    <w:name w:val="24F7B1F911AA48CB81E2BBF143C1CF43"/>
+    <w:rsid w:val="00610B92"/>
+    <w:rPr>
+      <w:lang w:val="da-DK" w:eastAsia="da-DK"/>
+    </w:rPr>
+  </w:style>
+  <w:style w:type="paragraph" w:customStyle="1" w:styleId="53EB7E5142514976A56C07BBB690AFA8">
+    <w:name w:val="53EB7E5142514976A56C07BBB690AFA8"/>
+    <w:rsid w:val="00610B92"/>
+    <w:rPr>
+      <w:lang w:val="da-DK" w:eastAsia="da-DK"/>
+    </w:rPr>
+  </w:style>
+  <w:style w:type="paragraph" w:customStyle="1" w:styleId="4CFDDC5025184F1190A336A748FCA821">
+    <w:name w:val="4CFDDC5025184F1190A336A748FCA821"/>
+    <w:rsid w:val="00610B92"/>
+    <w:rPr>
+      <w:lang w:val="da-DK" w:eastAsia="da-DK"/>
+    </w:rPr>
+  </w:style>
+  <w:style w:type="paragraph" w:customStyle="1" w:styleId="CFB2A04FDD2241F09D9DE97DC68EAE19">
+    <w:name w:val="CFB2A04FDD2241F09D9DE97DC68EAE19"/>
+    <w:rsid w:val="00610B92"/>
+    <w:rPr>
+      <w:lang w:val="da-DK" w:eastAsia="da-DK"/>
+    </w:rPr>
+  </w:style>
+  <w:style w:type="paragraph" w:customStyle="1" w:styleId="D24D9F3836514D7A8C6D2BC80C9C3119">
+    <w:name w:val="D24D9F3836514D7A8C6D2BC80C9C3119"/>
+    <w:rsid w:val="00610B92"/>
+    <w:rPr>
+      <w:lang w:val="da-DK" w:eastAsia="da-DK"/>
+    </w:rPr>
+  </w:style>
+  <w:style w:type="paragraph" w:customStyle="1" w:styleId="D006DC47F2FB4EB88C6A0C78775C8417">
+    <w:name w:val="D006DC47F2FB4EB88C6A0C78775C8417"/>
+    <w:rsid w:val="00AB65AB"/>
+    <w:rPr>
+      <w:lang w:val="da-DK" w:eastAsia="da-DK"/>
+    </w:rPr>
+  </w:style>
+  <w:style w:type="paragraph" w:customStyle="1" w:styleId="0E83C74572FF4743AA366F0D95C8A665">
+    <w:name w:val="0E83C74572FF4743AA366F0D95C8A665"/>
+    <w:rsid w:val="00AB65AB"/>
+    <w:rPr>
+      <w:lang w:val="da-DK" w:eastAsia="da-DK"/>
+    </w:rPr>
+  </w:style>
+  <w:style w:type="paragraph" w:customStyle="1" w:styleId="B58CFF658C1849EC8B5E5069846D480C">
+    <w:name w:val="B58CFF658C1849EC8B5E5069846D480C"/>
+    <w:rsid w:val="00AB65AB"/>
+    <w:rPr>
+      <w:lang w:val="da-DK" w:eastAsia="da-DK"/>
+    </w:rPr>
+  </w:style>
+  <w:style w:type="paragraph" w:customStyle="1" w:styleId="154D7D6228A6411789C75525A4DDC862">
+    <w:name w:val="154D7D6228A6411789C75525A4DDC862"/>
+    <w:rsid w:val="00AB65AB"/>
+    <w:rPr>
+      <w:lang w:val="da-DK" w:eastAsia="da-DK"/>
+    </w:rPr>
+  </w:style>
+  <w:style w:type="paragraph" w:customStyle="1" w:styleId="8BD49F0ECCAC40888CEFF660663CFB57">
+    <w:name w:val="8BD49F0ECCAC40888CEFF660663CFB57"/>
+    <w:rsid w:val="00AB65AB"/>
+    <w:rPr>
+      <w:lang w:val="da-DK" w:eastAsia="da-DK"/>
+    </w:rPr>
+  </w:style>
+  <w:style w:type="paragraph" w:customStyle="1" w:styleId="695C8343113A4F85A216814160C8EA61">
+    <w:name w:val="695C8343113A4F85A216814160C8EA61"/>
+    <w:rsid w:val="00AB65AB"/>
+    <w:rPr>
+      <w:lang w:val="da-DK" w:eastAsia="da-DK"/>
     </w:rPr>
   </w:style>
 </w:styles>
@@ -5939,9 +6218,7 @@
 </we:webextension>
 </file>
 
-<file path=customXml/item1.xml>��< ? x m l   v e r s i o n = " 1 . 0 "   e n c o d i n g = " u t f - 1 6 " ? > - 
- < N a v W o r d R e p o r t X m l P a r t   x m l n s = " u r n : m i c r o s o f t - d y n a m i c s - n a v / r e p o r t s / S t a n d a r d _ S a l e s _ C r e d i t _ M e m o / 1 3 0 7 / " > +<file path=customXml/item1.xml>��< ? x m l   v e r s i o n = " 1 . 0 "   e n c o d i n g = " u t f - 1 6 " ? > < N a v W o r d R e p o r t X m l P a r t   x m l n s = " u r n : m i c r o s o f t - d y n a m i c s - n a v / r e p o r t s / S t a n d a r d _ S a l e s _ C r e d i t _ M e m o / 1 3 0 7 / " >   
      < B C R e p o r t I n f o r m a t i o n >   
@@ -6163,7 +6440,7 @@
  
          < C o m p a n y P h o n e N o _ L b l > C o m p a n y P h o n e N o _ L b l < / C o m p a n y P h o n e N o _ L b l >   
-         < C o m p a n y P i c t u r e   / > +         < C o m p a n y P i c t u r e / >   
          < C o m p a n y R e g i s t r a t i o n N u m b e r > C o m p a n y R e g i s t r a t i o n N u m b e r < / C o m p a n y R e g i s t r a t i o n N u m b e r >   
@@ -6564,9 +6841,7 @@
  < / N a v W o r d R e p o r t X m l P a r t > 
 </file>
 
-<file path=customXml/item2.xml>��< ? x m l   v e r s i o n = " 1 . 0 "   e n c o d i n g = " u t f - 1 6 " ? > - 
- < N a v W o r d R e p o r t X m l P a r t   x m l n s = " u r n : m i c r o s o f t - d y n a m i c s - b u s i n e s s c e n t r a l / i n t e r n a l / e x t e n d e d / r e p o r t s / S t a n d a r d _ S a l e s _ C r e d i t _ M e m o / 1 3 0 7 / " > +<file path=customXml/item2.xml>��< ? x m l   v e r s i o n = " 1 . 0 "   e n c o d i n g = " u t f - 1 6 " ? > < N a v W o r d R e p o r t X m l P a r t   x m l n s = " u r n : m i c r o s o f t - d y n a m i c s - b u s i n e s s c e n t r a l / i n t e r n a l / e x t e n d e d / r e p o r t s / S t a n d a r d _ S a l e s _ C r e d i t _ M e m o / 1 3 0 7 / " >   
      < B C R e p o r t I n f o r m a t i o n >   
@@ -6710,7 +6985,7 @@
  
      < / B C R e p o r t I n f o r m a t i o n >   
-     < T o o l t i p s   / > +     < T o o l t i p s / >   
      < H e a d e r   E l e m e n t T y p e = " D a t a I t e m "   E l e m e n t I d = " 1 2 4 0 3 7 3 8 8 6 " >   
@@ -6790,7 +7065,7 @@
  
          < C o m p a n y P h o n e N o _ L b l   E l e m e n t T y p e = " C o l u m n "   E l e m e n t I d = " 5 5 8 5 9 3 5 8 6 "   D a t a T y p e = " L a b e l " > C o m p a n y P h o n e N o _ L b l < / C o m p a n y P h o n e N o _ L b l >   
-         < C o m p a n y P i c t u r e   E l e m e n t T y p e = " C o l u m n "   E l e m e n t I d = " 1 3 9 7 4 1 1 0 7 4 "   D a t a T y p e = " B l o b "   / > +         < C o m p a n y P i c t u r e   E l e m e n t T y p e = " C o l u m n "   E l e m e n t I d = " 1 3 9 7 4 1 1 0 7 4 "   D a t a T y p e = " B l o b " / >   
          < C o m p a n y R e g i s t r a t i o n N u m b e r   E l e m e n t T y p e = " C o l u m n "   E l e m e n t I d = " 2 0 2 3 6 3 9 4 2 4 "   D a t a T y p e = " T e x t " > C o m p a n y R e g i s t r a t i o n N u m b e r < / C o m p a n y R e g i s t r a t i o n N u m b e r >   
@@ -7189,6 +7464,10 @@
      < / H e a d e r >   
  < / N a v W o r d R e p o r t X m l P a r t > 
+</file>
+
+<file path=customXml/item3.xml><?xml version="1.0" encoding="utf-8"?>
+<b:Sources xmlns:b="http://schemas.openxmlformats.org/officeDocument/2006/bibliography" xmlns="http://schemas.openxmlformats.org/officeDocument/2006/bibliography" SelectedStyle="\APASixthEditionOfficeOnline.xsl" StyleName="APA" Version="6"/>
 </file>
 
 <file path=customXml/itemProps1.xml><?xml version="1.0" encoding="utf-8"?>
@@ -7205,4 +7484,12 @@
     <ds:schemaRef ds:uri="urn:microsoft-dynamics-businesscentral/internal/extended/reports/Standard_Sales_Credit_Memo/1307/"/>
   </ds:schemaRefs>
 </ds:datastoreItem>
+</file>
+
+<file path=customXml/itemProps3.xml><?xml version="1.0" encoding="utf-8"?>
+<ds:datastoreItem xmlns:ds="http://schemas.openxmlformats.org/officeDocument/2006/customXml" ds:itemID="{E2C9C682-C48C-4A45-B13C-4362E9245B0A}">
+  <ds:schemaRefs>
+    <ds:schemaRef ds:uri="http://schemas.openxmlformats.org/officeDocument/2006/bibliography"/>
+  </ds:schemaRefs>
+</ds:datastoreItem>
 </file>
</xml_diff>